<commit_message>
modified:   harassment/paper/Manuscript_all.docx 	modified:   harassment/paper/Manuscript_only.docx
</commit_message>
<xml_diff>
--- a/harassment/paper/Manuscript_only.docx
+++ b/harassment/paper/Manuscript_only.docx
@@ -180,21 +180,7 @@
         <w:rPr>
           <w:rFonts w:asciiTheme="majorBidi" w:eastAsiaTheme="minorEastAsia" w:hAnsiTheme="majorBidi" w:cstheme="majorBidi"/>
         </w:rPr>
-        <w:t xml:space="preserve">Narcissism, Machiavellianism, and Psychopathy, which constitute the Dark Triad, all share selfishness and a lack of empathy, yet they are distinguished by different psychological characteristics and behavioral tendencies (Paulhus &amp; Williams, 2002). Narcissism is characterized by exaggerated self-love and a heightened sense of self-importance, along with a strong need for approval (Morf &amp; </w:t>
-      </w:r>
-      <w:proofErr w:type="spellStart"/>
-      <w:r>
-        <w:rPr>
-          <w:rFonts w:asciiTheme="majorBidi" w:eastAsiaTheme="minorEastAsia" w:hAnsiTheme="majorBidi" w:cstheme="majorBidi"/>
-        </w:rPr>
-        <w:t>Rhodewalt</w:t>
-      </w:r>
-      <w:proofErr w:type="spellEnd"/>
-      <w:r>
-        <w:rPr>
-          <w:rFonts w:asciiTheme="majorBidi" w:eastAsiaTheme="minorEastAsia" w:hAnsiTheme="majorBidi" w:cstheme="majorBidi"/>
-        </w:rPr>
-        <w:t>, 2001</w:t>
+        <w:t>Narcissism, Machiavellianism, and Psychopathy, which constitute the Dark Triad, all share selfishness and a lack of empathy, yet they are distinguished by different psychological characteristics and behavioral tendencies (Paulhus &amp; Williams, 2002). Narcissism is characterized by exaggerated self-love and a heightened sense of self-importance, along with a strong need for approval (Morf &amp; Rhodewalt, 2001</w:t>
       </w:r>
       <w:r>
         <w:rPr>
@@ -236,21 +222,7 @@
         <w:rPr>
           <w:rFonts w:asciiTheme="majorBidi" w:eastAsiaTheme="minorEastAsia" w:hAnsiTheme="majorBidi" w:cstheme="majorBidi"/>
         </w:rPr>
-        <w:t xml:space="preserve">), it is also linked to hypersensitivity to criticism and aggressive reactions (Bushman &amp; Baumeister, 1998; </w:t>
-      </w:r>
-      <w:proofErr w:type="spellStart"/>
-      <w:r>
-        <w:rPr>
-          <w:rFonts w:asciiTheme="majorBidi" w:eastAsiaTheme="minorEastAsia" w:hAnsiTheme="majorBidi" w:cstheme="majorBidi"/>
-        </w:rPr>
-        <w:t>Thomaes</w:t>
-      </w:r>
-      <w:proofErr w:type="spellEnd"/>
-      <w:r>
-        <w:rPr>
-          <w:rFonts w:asciiTheme="majorBidi" w:eastAsiaTheme="minorEastAsia" w:hAnsiTheme="majorBidi" w:cstheme="majorBidi"/>
-        </w:rPr>
-        <w:t xml:space="preserve"> et al., 2009). Machiavellianism is characterized by cold-bloodedness in manipulating others, long-term strategic thinking, and self-serving behaviors accompanied by moral flexibility (Christie &amp; Geis, 1970; Wilson et al., 1996). This trait is tied to a desire for social dominance and pursuit of power (Fehr et al., 1992</w:t>
+        <w:t>), it is also linked to hypersensitivity to criticism and aggressive reactions (Bushman &amp; Baumeister, 1998; Thomaes et al., 2009). Machiavellianism is characterized by cold-bloodedness in manipulating others, long-term strategic thinking, and self-serving behaviors accompanied by moral flexibility (Christie &amp; Geis, 1970; Wilson et al., 1996). This trait is tied to a desire for social dominance and pursuit of power (Fehr et al., 1992</w:t>
       </w:r>
       <w:r>
         <w:rPr>
@@ -262,21 +234,7 @@
         <w:rPr>
           <w:rFonts w:asciiTheme="majorBidi" w:eastAsiaTheme="minorEastAsia" w:hAnsiTheme="majorBidi" w:cstheme="majorBidi"/>
         </w:rPr>
-        <w:t xml:space="preserve">Jonason &amp; Webster, 2010), and is associated with a lack of empathy toward others and low moral concern (Jones &amp; Paulhus, 2009; </w:t>
-      </w:r>
-      <w:proofErr w:type="spellStart"/>
-      <w:r>
-        <w:rPr>
-          <w:rFonts w:asciiTheme="majorBidi" w:eastAsiaTheme="minorEastAsia" w:hAnsiTheme="majorBidi" w:cstheme="majorBidi"/>
-        </w:rPr>
-        <w:t>McHoskey</w:t>
-      </w:r>
-      <w:proofErr w:type="spellEnd"/>
-      <w:r>
-        <w:rPr>
-          <w:rFonts w:asciiTheme="majorBidi" w:eastAsiaTheme="minorEastAsia" w:hAnsiTheme="majorBidi" w:cstheme="majorBidi"/>
-        </w:rPr>
-        <w:t xml:space="preserve">, 1995). </w:t>
+        <w:t xml:space="preserve">Jonason &amp; Webster, 2010), and is associated with a lack of empathy toward others and low moral concern (Jones &amp; Paulhus, 2009; McHoskey, 1995). </w:t>
       </w:r>
       <w:r>
         <w:rPr>
@@ -288,35 +246,7 @@
         <w:rPr>
           <w:rFonts w:asciiTheme="majorBidi" w:eastAsiaTheme="minorEastAsia" w:hAnsiTheme="majorBidi" w:cstheme="majorBidi"/>
         </w:rPr>
-        <w:t xml:space="preserve"> Psychopathy is characterized by a lack of empathy and guilt, strong impulsivity, and a callous interpersonal attitude (Cleckley, 1941; Hare, 2003). This trait is deeply related to antisocial behaviors and norm violations (Hare, 1982; Lynam &amp; </w:t>
-      </w:r>
-      <w:proofErr w:type="spellStart"/>
-      <w:r>
-        <w:rPr>
-          <w:rFonts w:asciiTheme="majorBidi" w:eastAsiaTheme="minorEastAsia" w:hAnsiTheme="majorBidi" w:cstheme="majorBidi"/>
-        </w:rPr>
-        <w:t>Derefinko</w:t>
-      </w:r>
-      <w:proofErr w:type="spellEnd"/>
-      <w:r>
-        <w:rPr>
-          <w:rFonts w:asciiTheme="majorBidi" w:eastAsiaTheme="minorEastAsia" w:hAnsiTheme="majorBidi" w:cstheme="majorBidi"/>
-        </w:rPr>
-        <w:t>, 2006), and is known to be associated with high sensation-seeking and risk-taking behaviors (</w:t>
-      </w:r>
-      <w:proofErr w:type="spellStart"/>
-      <w:r>
-        <w:rPr>
-          <w:rFonts w:asciiTheme="majorBidi" w:eastAsiaTheme="minorEastAsia" w:hAnsiTheme="majorBidi" w:cstheme="majorBidi"/>
-        </w:rPr>
-        <w:t>Sellbom</w:t>
-      </w:r>
-      <w:proofErr w:type="spellEnd"/>
-      <w:r>
-        <w:rPr>
-          <w:rFonts w:asciiTheme="majorBidi" w:eastAsiaTheme="minorEastAsia" w:hAnsiTheme="majorBidi" w:cstheme="majorBidi"/>
-        </w:rPr>
-        <w:t xml:space="preserve"> &amp; Verona, 2007</w:t>
+        <w:t xml:space="preserve"> Psychopathy is characterized by a lack of empathy and guilt, strong impulsivity, and a callous interpersonal attitude (Cleckley, 1941; Hare, 2003). This trait is deeply related to antisocial behaviors and norm violations (Hare, 1982; Lynam &amp; Derefinko, 2006), and is known to be associated with high sensation-seeking and risk-taking behaviors (Sellbom &amp; Verona, 2007</w:t>
       </w:r>
       <w:r>
         <w:rPr>
@@ -519,19 +449,11 @@
         </w:rPr>
         <w:t xml:space="preserve">; </w:t>
       </w:r>
-      <w:proofErr w:type="spellStart"/>
-      <w:r>
-        <w:rPr>
-          <w:rFonts w:asciiTheme="majorBidi" w:eastAsiaTheme="minorEastAsia" w:hAnsiTheme="majorBidi" w:cstheme="majorBidi"/>
-        </w:rPr>
-        <w:t>Tsuno</w:t>
-      </w:r>
-      <w:proofErr w:type="spellEnd"/>
-      <w:r>
-        <w:rPr>
-          <w:rFonts w:asciiTheme="majorBidi" w:eastAsiaTheme="minorEastAsia" w:hAnsiTheme="majorBidi" w:cstheme="majorBidi"/>
-        </w:rPr>
-        <w:t xml:space="preserve"> &amp; Kawakami, 2015). Machiavellianism, characterized by cold manipulation of others, strategic thinking, and instrumental interpersonal orientation accompanied by moral flexibility, is associated with reduced organizational citizenship behaviors (OCB) and bullying perpetration through interpersonal exploitation and self-serving decision-making (Baughman et al., 2012</w:t>
+      <w:r>
+        <w:rPr>
+          <w:rFonts w:asciiTheme="majorBidi" w:eastAsiaTheme="minorEastAsia" w:hAnsiTheme="majorBidi" w:cstheme="majorBidi"/>
+        </w:rPr>
+        <w:t>Tsuno &amp; Kawakami, 2015). Machiavellianism, characterized by cold manipulation of others, strategic thinking, and instrumental interpersonal orientation accompanied by moral flexibility, is associated with reduced organizational citizenship behaviors (OCB) and bullying perpetration through interpersonal exploitation and self-serving decision-making (Baughman et al., 2012</w:t>
       </w:r>
       <w:r>
         <w:rPr>
@@ -543,35 +465,7 @@
         <w:rPr>
           <w:rFonts w:asciiTheme="majorBidi" w:eastAsiaTheme="minorEastAsia" w:hAnsiTheme="majorBidi" w:cstheme="majorBidi"/>
         </w:rPr>
-        <w:t xml:space="preserve">Christie &amp; Geis, 1970; </w:t>
-      </w:r>
-      <w:proofErr w:type="spellStart"/>
-      <w:r>
-        <w:rPr>
-          <w:rFonts w:asciiTheme="majorBidi" w:eastAsiaTheme="minorEastAsia" w:hAnsiTheme="majorBidi" w:cstheme="majorBidi"/>
-        </w:rPr>
-        <w:t>Dåderman</w:t>
-      </w:r>
-      <w:proofErr w:type="spellEnd"/>
-      <w:r>
-        <w:rPr>
-          <w:rFonts w:asciiTheme="majorBidi" w:eastAsiaTheme="minorEastAsia" w:hAnsiTheme="majorBidi" w:cstheme="majorBidi"/>
-        </w:rPr>
-        <w:t xml:space="preserve"> &amp; </w:t>
-      </w:r>
-      <w:proofErr w:type="spellStart"/>
-      <w:r>
-        <w:rPr>
-          <w:rFonts w:asciiTheme="majorBidi" w:eastAsiaTheme="minorEastAsia" w:hAnsiTheme="majorBidi" w:cstheme="majorBidi"/>
-        </w:rPr>
-        <w:t>Ragnestål</w:t>
-      </w:r>
-      <w:proofErr w:type="spellEnd"/>
-      <w:r>
-        <w:rPr>
-          <w:rFonts w:asciiTheme="majorBidi" w:eastAsiaTheme="minorEastAsia" w:hAnsiTheme="majorBidi" w:cstheme="majorBidi"/>
-        </w:rPr>
-        <w:t>-Impola, 2019; Zettler &amp; Solga, 2013). Together with distortions of cognition related to gender roles, it has also been linked to heightened tendencies toward sexual harassment (Jonason et al., 2012; Jones &amp; Paulhus, 2010</w:t>
+        <w:t>Christie &amp; Geis, 1970; Dåderman &amp; Ragnestål-Impola, 2019; Zettler &amp; Solga, 2013). Together with distortions of cognition related to gender roles, it has also been linked to heightened tendencies toward sexual harassment (Jonason et al., 2012; Jones &amp; Paulhus, 2010</w:t>
       </w:r>
       <w:r>
         <w:rPr>
@@ -708,21 +602,7 @@
         <w:rPr>
           <w:rFonts w:asciiTheme="majorBidi" w:eastAsiaTheme="minorEastAsia" w:hAnsiTheme="majorBidi" w:cstheme="majorBidi"/>
         </w:rPr>
-        <w:t xml:space="preserve">Thielmann et al., 2021). Moreover, strong negative associations with the “dark” traits that counteract self-enhancement and the pursuit of resources and advantage have been consistently reported, suggesting the distinctiveness of the HEXACO moral dimension (Lee et al., 2013; </w:t>
-      </w:r>
-      <w:proofErr w:type="spellStart"/>
-      <w:r>
-        <w:rPr>
-          <w:rFonts w:asciiTheme="majorBidi" w:eastAsiaTheme="minorEastAsia" w:hAnsiTheme="majorBidi" w:cstheme="majorBidi"/>
-        </w:rPr>
-        <w:t>Moshagen</w:t>
-      </w:r>
-      <w:proofErr w:type="spellEnd"/>
-      <w:r>
-        <w:rPr>
-          <w:rFonts w:asciiTheme="majorBidi" w:eastAsiaTheme="minorEastAsia" w:hAnsiTheme="majorBidi" w:cstheme="majorBidi"/>
-        </w:rPr>
-        <w:t xml:space="preserve"> </w:t>
+        <w:t xml:space="preserve">Thielmann et al., 2021). Moreover, strong negative associations with the “dark” traits that counteract self-enhancement and the pursuit of resources and advantage have been consistently reported, suggesting the distinctiveness of the HEXACO moral dimension (Lee et al., 2013; Moshagen </w:t>
       </w:r>
       <w:r>
         <w:rPr>
@@ -737,40 +617,18 @@
         </w:rPr>
         <w:t xml:space="preserve">; </w:t>
       </w:r>
-      <w:proofErr w:type="spellStart"/>
-      <w:r>
-        <w:rPr>
-          <w:rFonts w:asciiTheme="majorBidi" w:eastAsiaTheme="minorEastAsia" w:hAnsiTheme="majorBidi" w:cstheme="majorBidi"/>
-        </w:rPr>
-        <w:t>Moshagen</w:t>
-      </w:r>
-      <w:proofErr w:type="spellEnd"/>
-      <w:r>
-        <w:rPr>
-          <w:rFonts w:asciiTheme="majorBidi" w:eastAsiaTheme="minorEastAsia" w:hAnsiTheme="majorBidi" w:cstheme="majorBidi"/>
-        </w:rPr>
-        <w:t xml:space="preserve"> et al., 2019). Extraversion is characterized by social self-esteem, boldness, sociability, and liveliness (Ashton &amp; Lee, 2007; Ashton &amp; Lee, 2009). While it corresponds strongly to extraversion in the FFM, within the highly orthogonal structure of HEXACO it is repositioned as a core component involving interpersonal energy and reward sensitivity (Thielmann et al., 2021). Differentiation from subordinate features such as intellectual engagement and dominance has been shown to increase the granularity of behavioral prediction (Anglim et al., 2022; Zettler et al., 2020). Agreeableness, centered on tolerance, gentleness, patience, and forgiveness, is redefined by incorporating anger-related tendencies that were included on the side of Neuroticism in the FFM (Ashton &amp; Lee, 2007; Thielmann et al., 2021). By emphasizing interpersonal regulatory functions such as low aggressiveness and low propensity for revenge, it captures more precisely the individual differences in behavioral restraint and tolerance in conflict situations (Ashton et al., 2014; Zettler et al., 2020). Conscientiousness forms the core of self-regulation, encompassing orderliness, diligence, perfectionism, and prudence (Ashton &amp; Lee, 2007; Ashton &amp; Lee, 2009). Reflecting long-term goal orientation and the discipline of error avoidance, it has been shown in reviews and meta-analyses to contribute reliably to the prediction of a wide range of important outcomes (Ozer &amp; Benet-Martínez, 2006; Zettler et al., 2020). Comparative studies across models have also confirmed an extremely strong correspondence with Conscientiousness in the FFM (Thielmann et al., 2021). Openness to Experience, based on aesthetic sensitivity, inquisitiveness, creativity, and unconventionality, </w:t>
+      <w:r>
+        <w:rPr>
+          <w:rFonts w:asciiTheme="majorBidi" w:eastAsiaTheme="minorEastAsia" w:hAnsiTheme="majorBidi" w:cstheme="majorBidi"/>
+        </w:rPr>
+        <w:t xml:space="preserve">Moshagen et al., 2019). Extraversion is characterized by social self-esteem, boldness, sociability, and liveliness (Ashton &amp; Lee, 2007; Ashton &amp; Lee, 2009). While it corresponds strongly to extraversion in the FFM, within the highly orthogonal structure of HEXACO it is repositioned as a core component involving interpersonal energy and reward sensitivity (Thielmann et al., 2021). Differentiation from subordinate features such as intellectual engagement and dominance has been shown to increase the granularity of behavioral prediction (Anglim et al., 2022; Zettler et al., 2020). Agreeableness, centered on tolerance, gentleness, patience, and forgiveness, is redefined by incorporating anger-related tendencies that were included on the side of Neuroticism in the FFM (Ashton &amp; Lee, 2007; Thielmann et al., 2021). By emphasizing interpersonal regulatory functions such as low aggressiveness and low propensity for revenge, it captures more precisely the individual differences in behavioral restraint and tolerance in conflict situations (Ashton et al., 2014; Zettler et al., 2020). Conscientiousness forms the core of self-regulation, encompassing orderliness, diligence, perfectionism, and prudence (Ashton &amp; Lee, 2007; Ashton &amp; Lee, 2009). Reflecting long-term goal orientation and the discipline of error avoidance, it has been shown in reviews and meta-analyses to contribute reliably to the prediction of a wide range of important outcomes (Ozer &amp; Benet-Martínez, 2006; Zettler et al., 2020). Comparative studies across models have also confirmed an extremely strong correspondence with Conscientiousness in the FFM (Thielmann et al., 2021). Openness to Experience, based on aesthetic sensitivity, inquisitiveness, creativity, and unconventionality, </w:t>
       </w:r>
       <w:r>
         <w:rPr>
           <w:rFonts w:asciiTheme="majorBidi" w:eastAsiaTheme="minorEastAsia" w:hAnsiTheme="majorBidi" w:cstheme="majorBidi"/>
         </w:rPr>
         <w:lastRenderedPageBreak/>
-        <w:t xml:space="preserve">reflects intellectual curiosity and the breadth of value orientation (Ashton &amp; Lee, 2007; Ashton &amp; Lee, 2009). Associations have been confirmed with crystallized intelligence, worldviews, and attitudes (Anglim et al., 2022; Lee, Ashton, </w:t>
-      </w:r>
-      <w:proofErr w:type="spellStart"/>
-      <w:r>
-        <w:rPr>
-          <w:rFonts w:asciiTheme="majorBidi" w:eastAsiaTheme="minorEastAsia" w:hAnsiTheme="majorBidi" w:cstheme="majorBidi"/>
-        </w:rPr>
-        <w:t>Ogunfowora</w:t>
-      </w:r>
-      <w:proofErr w:type="spellEnd"/>
-      <w:r>
-        <w:rPr>
-          <w:rFonts w:asciiTheme="majorBidi" w:eastAsiaTheme="minorEastAsia" w:hAnsiTheme="majorBidi" w:cstheme="majorBidi"/>
-        </w:rPr>
-        <w:t>, Bourdage, &amp; Shin, 2010). While maintaining high correspondence with Openness in the FFM, it clarifies individual differences in cognitive flexibility and value orientation within the independent structure of HEXACO as a whole (Lee, Ashton, Griep, &amp; Edmonds, 2018</w:t>
+        <w:t>reflects intellectual curiosity and the breadth of value orientation (Ashton &amp; Lee, 2007; Ashton &amp; Lee, 2009). Associations have been confirmed with crystallized intelligence, worldviews, and attitudes (Anglim et al., 2022; Lee, Ashton, Ogunfowora, Bourdage, &amp; Shin, 2010). While maintaining high correspondence with Openness in the FFM, it clarifies individual differences in cognitive flexibility and value orientation within the independent structure of HEXACO as a whole (Lee, Ashton, Griep, &amp; Edmonds, 2018</w:t>
       </w:r>
       <w:r>
         <w:rPr>
@@ -852,42 +710,14 @@
         <w:rPr>
           <w:rFonts w:asciiTheme="majorBidi" w:eastAsiaTheme="minorEastAsia" w:hAnsiTheme="majorBidi" w:cstheme="majorBidi"/>
         </w:rPr>
-        <w:t xml:space="preserve">The HEXACO model has accumulated evidence as a powerful framework for explaining a wide range of workplace behaviors—such as the preference for and enactment of leadership, organizational citizenship behavior (OCB) and counterproductive work behavior (CWB), work engagement and burnout, job satisfaction, performance, turnover intentions, attitudes toward diversity, and even measurement approaches in personnel selection. Studies have demonstrated that not only domain-level but also facet-level examinations can enhance predictive validity, that facets such as fairness and diligence are particularly important, and that person–leader fit as well as contextualized assessments (e.g., situational judgment tests, SJTs) have proven useful (Ashton &amp; Lee, 2007; </w:t>
-      </w:r>
-      <w:proofErr w:type="spellStart"/>
-      <w:r>
-        <w:rPr>
-          <w:rFonts w:asciiTheme="majorBidi" w:eastAsiaTheme="minorEastAsia" w:hAnsiTheme="majorBidi" w:cstheme="majorBidi"/>
-        </w:rPr>
-        <w:t>Breevaart</w:t>
-      </w:r>
-      <w:proofErr w:type="spellEnd"/>
-      <w:r>
-        <w:rPr>
-          <w:rFonts w:asciiTheme="majorBidi" w:eastAsiaTheme="minorEastAsia" w:hAnsiTheme="majorBidi" w:cstheme="majorBidi"/>
-        </w:rPr>
-        <w:t xml:space="preserve"> &amp; de Vries, 2017; Pletzer et al., 2021). Honesty–Humility, reflecting characteristics such as </w:t>
+        <w:t xml:space="preserve">The HEXACO model has accumulated evidence as a powerful framework for explaining a wide range of workplace behaviors—such as the preference for and enactment of leadership, organizational citizenship behavior (OCB) and counterproductive work behavior (CWB), work engagement and burnout, job satisfaction, performance, turnover intentions, attitudes toward diversity, and even measurement approaches in personnel selection. Studies have demonstrated that not only domain-level but also facet-level examinations can enhance predictive validity, that facets such as fairness and diligence are particularly important, and that person–leader fit as well as contextualized assessments (e.g., situational judgment tests, SJTs) have proven useful (Ashton &amp; Lee, 2007; Breevaart &amp; de Vries, 2017; Pletzer et al., 2021). Honesty–Humility, reflecting characteristics such as </w:t>
       </w:r>
       <w:r>
         <w:rPr>
           <w:rFonts w:asciiTheme="majorBidi" w:eastAsiaTheme="minorEastAsia" w:hAnsiTheme="majorBidi" w:cstheme="majorBidi"/>
         </w:rPr>
         <w:lastRenderedPageBreak/>
-        <w:t>sincerity, fairness, low greed, and restrained status-seeking, has consistently been shown to strongly suppress workplace deviance, misconduct, and abuse, and to be associated with ethical, servant, and democratic leadership (Ashton &amp; Lee, 2007; Pletzer et al., 2019b; Pletzer et al., 2021). Measurement of HEXACO through SJTs has revealed associations between Honesty–Humility and supervisor-rated OCB, suggesting its potential as an indicator of selection validity (</w:t>
-      </w:r>
-      <w:proofErr w:type="spellStart"/>
-      <w:r>
-        <w:rPr>
-          <w:rFonts w:asciiTheme="majorBidi" w:eastAsiaTheme="minorEastAsia" w:hAnsiTheme="majorBidi" w:cstheme="majorBidi"/>
-        </w:rPr>
-        <w:t>Breevaart</w:t>
-      </w:r>
-      <w:proofErr w:type="spellEnd"/>
-      <w:r>
-        <w:rPr>
-          <w:rFonts w:asciiTheme="majorBidi" w:eastAsiaTheme="minorEastAsia" w:hAnsiTheme="majorBidi" w:cstheme="majorBidi"/>
-        </w:rPr>
-        <w:t xml:space="preserve"> &amp; de Vries, 2017; Lee et al., 2005</w:t>
+        <w:t>sincerity, fairness, low greed, and restrained status-seeking, has consistently been shown to strongly suppress workplace deviance, misconduct, and abuse, and to be associated with ethical, servant, and democratic leadership (Ashton &amp; Lee, 2007; Pletzer et al., 2019b; Pletzer et al., 2021). Measurement of HEXACO through SJTs has revealed associations between Honesty–Humility and supervisor-rated OCB, suggesting its potential as an indicator of selection validity (Breevaart &amp; de Vries, 2017; Lee et al., 2005</w:t>
       </w:r>
       <w:r>
         <w:rPr>
@@ -895,47 +725,11 @@
         </w:rPr>
         <w:t xml:space="preserve">; </w:t>
       </w:r>
-      <w:proofErr w:type="spellStart"/>
-      <w:r>
-        <w:rPr>
-          <w:rFonts w:asciiTheme="majorBidi" w:eastAsiaTheme="minorEastAsia" w:hAnsiTheme="majorBidi" w:cstheme="majorBidi"/>
-        </w:rPr>
-        <w:t>Oostrom</w:t>
-      </w:r>
-      <w:proofErr w:type="spellEnd"/>
-      <w:r>
-        <w:rPr>
-          <w:rFonts w:asciiTheme="majorBidi" w:eastAsiaTheme="minorEastAsia" w:hAnsiTheme="majorBidi" w:cstheme="majorBidi"/>
-        </w:rPr>
-        <w:t xml:space="preserve"> et al., 2019). Emotionality, which includes tendencies toward anxiety, dependence, and sentimentality, is related to the risk of burnout and vulnerability to stressors (Bianchi, 2018; Maslach &amp; Leiter, 2016; Răducu &amp; </w:t>
-      </w:r>
-      <w:proofErr w:type="spellStart"/>
-      <w:r>
-        <w:rPr>
-          <w:rFonts w:asciiTheme="majorBidi" w:eastAsiaTheme="minorEastAsia" w:hAnsiTheme="majorBidi" w:cstheme="majorBidi"/>
-        </w:rPr>
-        <w:t>Stănculescu</w:t>
-      </w:r>
-      <w:proofErr w:type="spellEnd"/>
-      <w:r>
-        <w:rPr>
-          <w:rFonts w:asciiTheme="majorBidi" w:eastAsiaTheme="minorEastAsia" w:hAnsiTheme="majorBidi" w:cstheme="majorBidi"/>
-        </w:rPr>
-        <w:t>, 2022). This finding is consistent with evidence that followers sensitive to interpersonal safety and care orientation prefer relationship-oriented or task-oriented leaders (</w:t>
-      </w:r>
-      <w:proofErr w:type="spellStart"/>
-      <w:r>
-        <w:rPr>
-          <w:rFonts w:asciiTheme="majorBidi" w:eastAsiaTheme="minorEastAsia" w:hAnsiTheme="majorBidi" w:cstheme="majorBidi"/>
-        </w:rPr>
-        <w:t>Breevaart</w:t>
-      </w:r>
-      <w:proofErr w:type="spellEnd"/>
-      <w:r>
-        <w:rPr>
-          <w:rFonts w:asciiTheme="majorBidi" w:eastAsiaTheme="minorEastAsia" w:hAnsiTheme="majorBidi" w:cstheme="majorBidi"/>
-        </w:rPr>
-        <w:t xml:space="preserve"> &amp; de Vries, 2021; Hoch et al., 2018</w:t>
+      <w:r>
+        <w:rPr>
+          <w:rFonts w:asciiTheme="majorBidi" w:eastAsiaTheme="minorEastAsia" w:hAnsiTheme="majorBidi" w:cstheme="majorBidi"/>
+        </w:rPr>
+        <w:t>Oostrom et al., 2019). Emotionality, which includes tendencies toward anxiety, dependence, and sentimentality, is related to the risk of burnout and vulnerability to stressors (Bianchi, 2018; Maslach &amp; Leiter, 2016; Răducu &amp; Stănculescu, 2022). This finding is consistent with evidence that followers sensitive to interpersonal safety and care orientation prefer relationship-oriented or task-oriented leaders (Breevaart &amp; de Vries, 2021; Hoch et al., 2018</w:t>
       </w:r>
       <w:r>
         <w:rPr>
@@ -959,21 +753,7 @@
         <w:rPr>
           <w:rFonts w:asciiTheme="majorBidi" w:eastAsiaTheme="minorEastAsia" w:hAnsiTheme="majorBidi" w:cstheme="majorBidi"/>
         </w:rPr>
-        <w:t>Pletzer et al., 2021), underpins vigor, dedication, and absorption as the core of work engagement (</w:t>
-      </w:r>
-      <w:proofErr w:type="spellStart"/>
-      <w:r>
-        <w:rPr>
-          <w:rFonts w:asciiTheme="majorBidi" w:eastAsiaTheme="minorEastAsia" w:hAnsiTheme="majorBidi" w:cstheme="majorBidi"/>
-        </w:rPr>
-        <w:t>Inceoglu</w:t>
-      </w:r>
-      <w:proofErr w:type="spellEnd"/>
-      <w:r>
-        <w:rPr>
-          <w:rFonts w:asciiTheme="majorBidi" w:eastAsiaTheme="minorEastAsia" w:hAnsiTheme="majorBidi" w:cstheme="majorBidi"/>
-        </w:rPr>
-        <w:t xml:space="preserve"> &amp; Warr, 2011</w:t>
+        <w:t>Pletzer et al., 2021), underpins vigor, dedication, and absorption as the core of work engagement (Inceoglu &amp; Warr, 2011</w:t>
       </w:r>
       <w:r>
         <w:rPr>
@@ -985,35 +765,7 @@
         <w:rPr>
           <w:rFonts w:asciiTheme="majorBidi" w:eastAsiaTheme="minorEastAsia" w:hAnsiTheme="majorBidi" w:cstheme="majorBidi"/>
         </w:rPr>
-        <w:t xml:space="preserve">Schaufeli et al., 2002), and is associated with preferences for charismatic leadership (Bass, 1990; </w:t>
-      </w:r>
-      <w:proofErr w:type="spellStart"/>
-      <w:r>
-        <w:rPr>
-          <w:rFonts w:asciiTheme="majorBidi" w:eastAsiaTheme="minorEastAsia" w:hAnsiTheme="majorBidi" w:cstheme="majorBidi"/>
-        </w:rPr>
-        <w:t>Breevaart</w:t>
-      </w:r>
-      <w:proofErr w:type="spellEnd"/>
-      <w:r>
-        <w:rPr>
-          <w:rFonts w:asciiTheme="majorBidi" w:eastAsiaTheme="minorEastAsia" w:hAnsiTheme="majorBidi" w:cstheme="majorBidi"/>
-        </w:rPr>
-        <w:t xml:space="preserve"> &amp; de Vries, 2021; Conger, 1999). Agreeableness, reflecting interpersonal adaptability such as tolerance, gentleness, and avoidance of revenge, has consistently been shown to suppress CWB and enhance OCB, to be inversely related to deteriorating abusive and authoritarian relationships, and to be positively associated with democratic, servant, and authentic leadership behaviors (</w:t>
-      </w:r>
-      <w:proofErr w:type="spellStart"/>
-      <w:r>
-        <w:rPr>
-          <w:rFonts w:asciiTheme="majorBidi" w:eastAsiaTheme="minorEastAsia" w:hAnsiTheme="majorBidi" w:cstheme="majorBidi"/>
-        </w:rPr>
-        <w:t>Breevaart</w:t>
-      </w:r>
-      <w:proofErr w:type="spellEnd"/>
-      <w:r>
-        <w:rPr>
-          <w:rFonts w:asciiTheme="majorBidi" w:eastAsiaTheme="minorEastAsia" w:hAnsiTheme="majorBidi" w:cstheme="majorBidi"/>
-        </w:rPr>
-        <w:t xml:space="preserve"> &amp; de Vries, 2017; Gandolfi et al., 2017</w:t>
+        <w:t>Schaufeli et al., 2002), and is associated with preferences for charismatic leadership (Bass, 1990; Breevaart &amp; de Vries, 2021; Conger, 1999). Agreeableness, reflecting interpersonal adaptability such as tolerance, gentleness, and avoidance of revenge, has consistently been shown to suppress CWB and enhance OCB, to be inversely related to deteriorating abusive and authoritarian relationships, and to be positively associated with democratic, servant, and authentic leadership behaviors (Breevaart &amp; de Vries, 2017; Gandolfi et al., 2017</w:t>
       </w:r>
       <w:r>
         <w:rPr>
@@ -1025,21 +777,7 @@
         <w:rPr>
           <w:rFonts w:asciiTheme="majorBidi" w:eastAsiaTheme="minorEastAsia" w:hAnsiTheme="majorBidi" w:cstheme="majorBidi"/>
         </w:rPr>
-        <w:t xml:space="preserve">Pletzer et al., 2019b; Pletzer et al., 2021; Zettler et al., 2020). Furthermore, evidence indicates that tendencies toward workplace harassment perpetration are linked to low agreeableness (De </w:t>
-      </w:r>
-      <w:proofErr w:type="spellStart"/>
-      <w:r>
-        <w:rPr>
-          <w:rFonts w:asciiTheme="majorBidi" w:eastAsiaTheme="minorEastAsia" w:hAnsiTheme="majorBidi" w:cstheme="majorBidi"/>
-        </w:rPr>
-        <w:t>Hoogh</w:t>
-      </w:r>
-      <w:proofErr w:type="spellEnd"/>
-      <w:r>
-        <w:rPr>
-          <w:rFonts w:asciiTheme="majorBidi" w:eastAsiaTheme="minorEastAsia" w:hAnsiTheme="majorBidi" w:cstheme="majorBidi"/>
-        </w:rPr>
-        <w:t xml:space="preserve"> &amp; Den Hartog, 2008</w:t>
+        <w:t>Pletzer et al., 2019b; Pletzer et al., 2021; Zettler et al., 2020). Furthermore, evidence indicates that tendencies toward workplace harassment perpetration are linked to low agreeableness (De Hoogh &amp; Den Hartog, 2008</w:t>
       </w:r>
       <w:r>
         <w:rPr>
@@ -1082,35 +820,7 @@
         <w:rPr>
           <w:rFonts w:asciiTheme="majorBidi" w:eastAsiaTheme="minorEastAsia" w:hAnsiTheme="majorBidi" w:cstheme="majorBidi"/>
         </w:rPr>
-        <w:t xml:space="preserve">Wright &amp; </w:t>
-      </w:r>
-      <w:proofErr w:type="spellStart"/>
-      <w:r>
-        <w:rPr>
-          <w:rFonts w:asciiTheme="majorBidi" w:eastAsiaTheme="minorEastAsia" w:hAnsiTheme="majorBidi" w:cstheme="majorBidi"/>
-        </w:rPr>
-        <w:t>Cropanzano</w:t>
-      </w:r>
-      <w:proofErr w:type="spellEnd"/>
-      <w:r>
-        <w:rPr>
-          <w:rFonts w:asciiTheme="majorBidi" w:eastAsiaTheme="minorEastAsia" w:hAnsiTheme="majorBidi" w:cstheme="majorBidi"/>
-        </w:rPr>
-        <w:t>, 2000). Openness to Experience, as a resource of intellectual curiosity, creativity, and novelty seeking, is positively associated with OCB (Pletzer et al., 2021; Thielmann et al., 2020), relates to preferences for and acceptance of transformational and charismatic leadership (</w:t>
-      </w:r>
-      <w:proofErr w:type="spellStart"/>
-      <w:r>
-        <w:rPr>
-          <w:rFonts w:asciiTheme="majorBidi" w:eastAsiaTheme="minorEastAsia" w:hAnsiTheme="majorBidi" w:cstheme="majorBidi"/>
-        </w:rPr>
-        <w:t>Breevaart</w:t>
-      </w:r>
-      <w:proofErr w:type="spellEnd"/>
-      <w:r>
-        <w:rPr>
-          <w:rFonts w:asciiTheme="majorBidi" w:eastAsiaTheme="minorEastAsia" w:hAnsiTheme="majorBidi" w:cstheme="majorBidi"/>
-        </w:rPr>
-        <w:t xml:space="preserve"> &amp; de Vries, 2021</w:t>
+        <w:t>Wright &amp; Cropanzano, 2000). Openness to Experience, as a resource of intellectual curiosity, creativity, and novelty seeking, is positively associated with OCB (Pletzer et al., 2021; Thielmann et al., 2020), relates to preferences for and acceptance of transformational and charismatic leadership (Breevaart &amp; de Vries, 2021</w:t>
       </w:r>
       <w:r>
         <w:rPr>
@@ -1130,33 +840,11 @@
         </w:rPr>
         <w:t xml:space="preserve">; </w:t>
       </w:r>
-      <w:proofErr w:type="spellStart"/>
-      <w:r>
-        <w:rPr>
-          <w:rFonts w:asciiTheme="majorBidi" w:eastAsiaTheme="minorEastAsia" w:hAnsiTheme="majorBidi" w:cstheme="majorBidi"/>
-        </w:rPr>
-        <w:t>Saltukoğlu</w:t>
-      </w:r>
-      <w:proofErr w:type="spellEnd"/>
-      <w:r>
-        <w:rPr>
-          <w:rFonts w:asciiTheme="majorBidi" w:eastAsiaTheme="minorEastAsia" w:hAnsiTheme="majorBidi" w:cstheme="majorBidi"/>
-        </w:rPr>
-        <w:t xml:space="preserve"> et al., 2019). In particular, democratic leadership corresponds with Honesty–Humility and Conscientiousness, supportive relationships correspond with Agreeableness, and charismatic influence corresponds with Extraversion and Openness—a pattern of “contextualized personality–leadership behavior correspondence” that has been demonstrated both theoretically and empirically (</w:t>
-      </w:r>
-      <w:proofErr w:type="spellStart"/>
-      <w:r>
-        <w:rPr>
-          <w:rFonts w:asciiTheme="majorBidi" w:eastAsiaTheme="minorEastAsia" w:hAnsiTheme="majorBidi" w:cstheme="majorBidi"/>
-        </w:rPr>
-        <w:t>Breevaart</w:t>
-      </w:r>
-      <w:proofErr w:type="spellEnd"/>
-      <w:r>
-        <w:rPr>
-          <w:rFonts w:asciiTheme="majorBidi" w:eastAsiaTheme="minorEastAsia" w:hAnsiTheme="majorBidi" w:cstheme="majorBidi"/>
-        </w:rPr>
-        <w:t xml:space="preserve"> &amp; de Vries, 2017</w:t>
+      <w:r>
+        <w:rPr>
+          <w:rFonts w:asciiTheme="majorBidi" w:eastAsiaTheme="minorEastAsia" w:hAnsiTheme="majorBidi" w:cstheme="majorBidi"/>
+        </w:rPr>
+        <w:t>Saltukoğlu et al., 2019). In particular, democratic leadership corresponds with Honesty–Humility and Conscientiousness, supportive relationships correspond with Agreeableness, and charismatic influence corresponds with Extraversion and Openness—a pattern of “contextualized personality–leadership behavior correspondence” that has been demonstrated both theoretically and empirically (Breevaart &amp; de Vries, 2017</w:t>
       </w:r>
       <w:r>
         <w:rPr>
@@ -1168,42 +856,14 @@
         <w:rPr>
           <w:rFonts w:asciiTheme="majorBidi" w:eastAsiaTheme="minorEastAsia" w:hAnsiTheme="majorBidi" w:cstheme="majorBidi"/>
         </w:rPr>
-        <w:t xml:space="preserve">de Vries, 2012; Judge &amp; Bono, 2000). From a human resource practice perspective, the development and validation of SJTs based on HEXACO have demonstrated that personality traits, including Conscientiousness and Honesty–Humility, relate to OCB and selection outcomes while compensating for the limitations of self-report measures (e.g., social desirability, faking). When combined with facet-level evaluations, they allow for more precise predictions of deviance suppression and promotion of citizenship behaviors (Christian et al., 2010; McDaniel et al., 2007; </w:t>
-      </w:r>
-      <w:proofErr w:type="spellStart"/>
-      <w:r>
-        <w:rPr>
-          <w:rFonts w:asciiTheme="majorBidi" w:eastAsiaTheme="minorEastAsia" w:hAnsiTheme="majorBidi" w:cstheme="majorBidi"/>
-        </w:rPr>
-        <w:t>Oostrom</w:t>
-      </w:r>
-      <w:proofErr w:type="spellEnd"/>
-      <w:r>
-        <w:rPr>
-          <w:rFonts w:asciiTheme="majorBidi" w:eastAsiaTheme="minorEastAsia" w:hAnsiTheme="majorBidi" w:cstheme="majorBidi"/>
-        </w:rPr>
-        <w:t xml:space="preserve"> et al., 2019; Pletzer et al., 2021). Furthermore, HEXACO traits are also implicated in career turnover intentions and actual turnover: Extraversion and </w:t>
+        <w:t xml:space="preserve">de Vries, 2012; Judge &amp; Bono, 2000). From a human resource practice perspective, the development and validation of SJTs based on HEXACO have demonstrated that personality traits, including Conscientiousness and Honesty–Humility, relate to OCB and selection outcomes while compensating for the limitations of self-report measures (e.g., social desirability, faking). When combined with facet-level evaluations, they allow for more precise predictions of deviance suppression and promotion of citizenship behaviors (Christian et al., 2010; McDaniel et al., 2007; Oostrom et al., 2019; Pletzer et al., 2021). Furthermore, HEXACO traits are also implicated in career turnover intentions and actual turnover: Extraversion and </w:t>
       </w:r>
       <w:r>
         <w:rPr>
           <w:rFonts w:asciiTheme="majorBidi" w:eastAsiaTheme="minorEastAsia" w:hAnsiTheme="majorBidi" w:cstheme="majorBidi"/>
         </w:rPr>
         <w:lastRenderedPageBreak/>
-        <w:t>Openness are linked to change orientation, Conscientiousness and Agreeableness promote retention, and individuals high in Dark Triad traits are more likely to exhibit turnover intentions. Perceived organizational support (POS) particularly enhances engagement when coupled with Extraversion and Conscientiousness (</w:t>
-      </w:r>
-      <w:proofErr w:type="spellStart"/>
-      <w:r>
-        <w:rPr>
-          <w:rFonts w:asciiTheme="majorBidi" w:eastAsiaTheme="minorEastAsia" w:hAnsiTheme="majorBidi" w:cstheme="majorBidi"/>
-        </w:rPr>
-        <w:t>Machiha</w:t>
-      </w:r>
-      <w:proofErr w:type="spellEnd"/>
-      <w:r>
-        <w:rPr>
-          <w:rFonts w:asciiTheme="majorBidi" w:eastAsiaTheme="minorEastAsia" w:hAnsiTheme="majorBidi" w:cstheme="majorBidi"/>
-        </w:rPr>
-        <w:t xml:space="preserve"> &amp; Brew, 2019</w:t>
+        <w:t>Openness are linked to change orientation, Conscientiousness and Agreeableness promote retention, and individuals high in Dark Triad traits are more likely to exhibit turnover intentions. Perceived organizational support (POS) particularly enhances engagement when coupled with Extraversion and Conscientiousness (Machiha &amp; Brew, 2019</w:t>
       </w:r>
       <w:r>
         <w:rPr>
@@ -1221,21 +881,7 @@
         <w:rPr>
           <w:rFonts w:asciiTheme="majorBidi" w:eastAsiaTheme="minorEastAsia" w:hAnsiTheme="majorBidi" w:cstheme="majorBidi"/>
         </w:rPr>
-        <w:t xml:space="preserve">Rhoades &amp; Eisenberger, 2002; Woo, 2011; Zimmerman, 2008). Taken together, HEXACO is a model that transcends leadership (preference/enactment), OCB, CWB, job satisfaction, job performance, turnover intentions, diversity attitudes, health-related indicators (burnout), and measurement/selection as essential aspects of the workplace. In particular, Honesty–Humility, Conscientiousness, Agreeableness, and Extraversion support desirable behaviors through the four functional axes of “ethics/norm compliance—productivity—relationships—vitality.” Emotionality contributes to the management of stress vulnerability, and Openness facilitates learning, innovation, and diversity acceptance, thereby forming a coherent picture supported consistently across theory and practice (Anglim et al., 2019; Ashton &amp; Lee, 2007; Pletzer et al., 2021; Răducu &amp; </w:t>
-      </w:r>
-      <w:proofErr w:type="spellStart"/>
-      <w:r>
-        <w:rPr>
-          <w:rFonts w:asciiTheme="majorBidi" w:eastAsiaTheme="minorEastAsia" w:hAnsiTheme="majorBidi" w:cstheme="majorBidi"/>
-        </w:rPr>
-        <w:t>Stănculescu</w:t>
-      </w:r>
-      <w:proofErr w:type="spellEnd"/>
-      <w:r>
-        <w:rPr>
-          <w:rFonts w:asciiTheme="majorBidi" w:eastAsiaTheme="minorEastAsia" w:hAnsiTheme="majorBidi" w:cstheme="majorBidi"/>
-        </w:rPr>
-        <w:t>, 2022).</w:t>
+        <w:t>Rhoades &amp; Eisenberger, 2002; Woo, 2011; Zimmerman, 2008). Taken together, HEXACO is a model that transcends leadership (preference/enactment), OCB, CWB, job satisfaction, job performance, turnover intentions, diversity attitudes, health-related indicators (burnout), and measurement/selection as essential aspects of the workplace. In particular, Honesty–Humility, Conscientiousness, Agreeableness, and Extraversion support desirable behaviors through the four functional axes of “ethics/norm compliance—productivity—relationships—vitality.” Emotionality contributes to the management of stress vulnerability, and Openness facilitates learning, innovation, and diversity acceptance, thereby forming a coherent picture supported consistently across theory and practice (Anglim et al., 2019; Ashton &amp; Lee, 2007; Pletzer et al., 2021; Răducu &amp; Stănculescu, 2022).</w:t>
       </w:r>
     </w:p>
     <w:p>
@@ -1281,24 +927,18 @@
         <w:rPr>
           <w:rFonts w:asciiTheme="majorBidi" w:eastAsiaTheme="minorEastAsia" w:hAnsiTheme="majorBidi" w:cstheme="majorBidi" w:hint="eastAsia"/>
         </w:rPr>
-        <w:t xml:space="preserve"> </w:t>
+        <w:t xml:space="preserve"> (</w:t>
+      </w:r>
+      <w:r>
+        <w:rPr>
+          <w:rFonts w:asciiTheme="majorBidi" w:eastAsiaTheme="minorEastAsia" w:hAnsiTheme="majorBidi" w:cstheme="majorBidi"/>
+        </w:rPr>
+        <w:t>Henrich et al., 2010</w:t>
       </w:r>
       <w:r>
         <w:rPr>
           <w:rFonts w:asciiTheme="majorBidi" w:eastAsiaTheme="minorEastAsia" w:hAnsiTheme="majorBidi" w:cstheme="majorBidi" w:hint="eastAsia"/>
         </w:rPr>
-        <w:t>(</w:t>
-      </w:r>
-      <w:r>
-        <w:rPr>
-          <w:rFonts w:asciiTheme="majorBidi" w:eastAsiaTheme="minorEastAsia" w:hAnsiTheme="majorBidi" w:cstheme="majorBidi"/>
-        </w:rPr>
-        <w:t>Henrich et al., 2010</w:t>
-      </w:r>
-      <w:r>
-        <w:rPr>
-          <w:rFonts w:asciiTheme="majorBidi" w:eastAsiaTheme="minorEastAsia" w:hAnsiTheme="majorBidi" w:cstheme="majorBidi" w:hint="eastAsia"/>
-        </w:rPr>
         <w:t>)</w:t>
       </w:r>
       <w:r>
@@ -1312,21 +952,7 @@
           <w:rFonts w:asciiTheme="majorBidi" w:eastAsiaTheme="minorEastAsia" w:hAnsiTheme="majorBidi" w:cstheme="majorBidi"/>
         </w:rPr>
         <w:lastRenderedPageBreak/>
-        <w:t>Dark Triad research has advanced through the development and adaptation of measurement instruments and through empirical investigations that explicitly consider cultural validity. Following Japanese adaptations of short-form measures (</w:t>
-      </w:r>
-      <w:proofErr w:type="spellStart"/>
-      <w:r>
-        <w:rPr>
-          <w:rFonts w:asciiTheme="majorBidi" w:eastAsiaTheme="minorEastAsia" w:hAnsiTheme="majorBidi" w:cstheme="majorBidi"/>
-        </w:rPr>
-        <w:t>Shimotsukasa</w:t>
-      </w:r>
-      <w:proofErr w:type="spellEnd"/>
-      <w:r>
-        <w:rPr>
-          <w:rFonts w:asciiTheme="majorBidi" w:eastAsiaTheme="minorEastAsia" w:hAnsiTheme="majorBidi" w:cstheme="majorBidi"/>
-        </w:rPr>
-        <w:t xml:space="preserve"> &amp; Oshio, 2017; Tamura et al., 2015), methodological discussions attentive to measurement equivalence and cross-cultural comparability have accompanied these developments (Byrne &amp; Campbell, 1999; Schmitt et al., 2007; van de Vijver &amp; Leung, 2000). Such work is crucial because cross-cultural differences in response styles, social desirability, and normative constraints can </w:t>
+        <w:t xml:space="preserve">Dark Triad research has advanced through the development and adaptation of measurement instruments and through empirical investigations that explicitly consider cultural validity. Following Japanese adaptations of short-form measures (Shimotsukasa &amp; Oshio, 2017; Tamura et al., 2015), methodological discussions attentive to measurement equivalence and cross-cultural comparability have accompanied these developments (Byrne &amp; Campbell, 1999; Schmitt et al., 2007; van de Vijver &amp; Leung, 2000). Such work is crucial because cross-cultural differences in response styles, social desirability, and normative constraints can </w:t>
       </w:r>
       <w:r>
         <w:rPr>
@@ -1338,140 +964,14 @@
         <w:rPr>
           <w:rFonts w:asciiTheme="majorBidi" w:eastAsiaTheme="minorEastAsia" w:hAnsiTheme="majorBidi" w:cstheme="majorBidi"/>
         </w:rPr>
-        <w:t xml:space="preserve"> observed associations and may lead to apparent differences in trait–outcome links even when constructs are conceptually similar. Regarding Machiavellianism, repeated findings have documented its connections with manipulative strategies such as “persuasion, ingratiation, and self-disclosure” (</w:t>
-      </w:r>
-      <w:proofErr w:type="spellStart"/>
-      <w:r>
-        <w:rPr>
-          <w:rFonts w:asciiTheme="majorBidi" w:eastAsiaTheme="minorEastAsia" w:hAnsiTheme="majorBidi" w:cstheme="majorBidi"/>
-        </w:rPr>
-        <w:t>Shimotsukasa</w:t>
-      </w:r>
-      <w:proofErr w:type="spellEnd"/>
-      <w:r>
-        <w:rPr>
-          <w:rFonts w:asciiTheme="majorBidi" w:eastAsiaTheme="minorEastAsia" w:hAnsiTheme="majorBidi" w:cstheme="majorBidi"/>
-        </w:rPr>
-        <w:t xml:space="preserve"> &amp; Oshio, 2019; Tada &amp; Oshio, 2018). Machiavellianism has also been widely reported to relate to interpersonal aversion and avoidance of being disliked (</w:t>
-      </w:r>
-      <w:proofErr w:type="spellStart"/>
-      <w:r>
-        <w:rPr>
-          <w:rFonts w:asciiTheme="majorBidi" w:eastAsiaTheme="minorEastAsia" w:hAnsiTheme="majorBidi" w:cstheme="majorBidi"/>
-        </w:rPr>
-        <w:t>Koshinaka</w:t>
-      </w:r>
-      <w:proofErr w:type="spellEnd"/>
-      <w:r>
-        <w:rPr>
-          <w:rFonts w:asciiTheme="majorBidi" w:eastAsiaTheme="minorEastAsia" w:hAnsiTheme="majorBidi" w:cstheme="majorBidi"/>
-        </w:rPr>
-        <w:t>, 2020), has been linked to tendencies toward gambling disorder (Takada, 2023), and has been shown to align with low Agreeableness and low Honesty–Humility within the frameworks of the FFM and HEXACO (</w:t>
-      </w:r>
-      <w:proofErr w:type="spellStart"/>
-      <w:r>
-        <w:rPr>
-          <w:rFonts w:asciiTheme="majorBidi" w:eastAsiaTheme="minorEastAsia" w:hAnsiTheme="majorBidi" w:cstheme="majorBidi"/>
-        </w:rPr>
-        <w:t>Kiire</w:t>
-      </w:r>
-      <w:proofErr w:type="spellEnd"/>
-      <w:r>
-        <w:rPr>
-          <w:rFonts w:asciiTheme="majorBidi" w:eastAsiaTheme="minorEastAsia" w:hAnsiTheme="majorBidi" w:cstheme="majorBidi"/>
-        </w:rPr>
-        <w:t>, 2016). Regarding psychopathy, domestic reviews have summarized classical characteristics such as lack of empathy and dominant, aggressive manipulation (Masui &amp; Ura, 2018). Empirical studies have reported associations with interpersonal aversion, avoidance of being disliked, and gender differences (</w:t>
-      </w:r>
-      <w:proofErr w:type="spellStart"/>
-      <w:r>
-        <w:rPr>
-          <w:rFonts w:asciiTheme="majorBidi" w:eastAsiaTheme="minorEastAsia" w:hAnsiTheme="majorBidi" w:cstheme="majorBidi"/>
-        </w:rPr>
-        <w:t>Koshinaka</w:t>
-      </w:r>
-      <w:proofErr w:type="spellEnd"/>
-      <w:r>
-        <w:rPr>
-          <w:rFonts w:asciiTheme="majorBidi" w:eastAsiaTheme="minorEastAsia" w:hAnsiTheme="majorBidi" w:cstheme="majorBidi"/>
-        </w:rPr>
-        <w:t>, 2020). A proposed model indicates that psychopathy directly increases loneliness while also exerting effects indirectly via experiences of social exclusion (Tomii &amp; Oshio, 2024). Research using empathy tasks with photographs of expressed emotions further suggests that the magnitude or pattern of these associations may fluctuate by gender (Fukui et al., 2017, 2018), and psychopathy has also been shown to relate to both self-enhancing and self-deprecating manipulative strategies (</w:t>
-      </w:r>
-      <w:proofErr w:type="spellStart"/>
-      <w:r>
-        <w:rPr>
-          <w:rFonts w:asciiTheme="majorBidi" w:eastAsiaTheme="minorEastAsia" w:hAnsiTheme="majorBidi" w:cstheme="majorBidi"/>
-        </w:rPr>
-        <w:t>Shimotsukasa</w:t>
-      </w:r>
-      <w:proofErr w:type="spellEnd"/>
-      <w:r>
-        <w:rPr>
-          <w:rFonts w:asciiTheme="majorBidi" w:eastAsiaTheme="minorEastAsia" w:hAnsiTheme="majorBidi" w:cstheme="majorBidi"/>
-        </w:rPr>
-        <w:t xml:space="preserve"> &amp; Oshio, 2019). Regarding narcissism, domestic reviews have emphasized its duality—rooted in </w:t>
+        <w:t xml:space="preserve"> observed associations and may lead to apparent differences in trait–outcome links even when constructs are conceptually similar. Regarding Machiavellianism, repeated findings have documented its connections with manipulative strategies such as “persuasion, ingratiation, and self-disclosure” (Shimotsukasa &amp; Oshio, 2019; Tada &amp; Oshio, 2018). Machiavellianism has also been widely reported to relate to interpersonal aversion and avoidance of being disliked (Koshinaka, 2020), has been linked to tendencies toward gambling disorder (Takada, 2023), and has been shown to align with low Agreeableness and low Honesty–Humility within the frameworks of the FFM and HEXACO (Kiire, 2016). Regarding psychopathy, domestic reviews have summarized classical characteristics such as lack of empathy and dominant, aggressive manipulation (Masui &amp; Ura, 2018). Empirical studies have reported associations with interpersonal aversion, avoidance of being disliked, and gender differences (Koshinaka, 2020). A proposed model indicates that psychopathy directly increases loneliness while also exerting effects indirectly via experiences of social exclusion (Tomii &amp; Oshio, 2024). Research using empathy tasks with photographs of expressed emotions further suggests that the magnitude or pattern of these associations may fluctuate by gender (Fukui et al., 2017, 2018), and psychopathy has also been shown to relate to both self-enhancing and self-deprecating manipulative strategies (Shimotsukasa &amp; Oshio, 2019). Regarding narcissism, domestic reviews have emphasized its duality—rooted in </w:t>
       </w:r>
       <w:r>
         <w:rPr>
           <w:rFonts w:asciiTheme="majorBidi" w:eastAsiaTheme="minorEastAsia" w:hAnsiTheme="majorBidi" w:cstheme="majorBidi"/>
         </w:rPr>
         <w:lastRenderedPageBreak/>
-        <w:t>superiority maintenance and the need for admiration—while also noting potentially adaptive aspects depending on situational demands (Masui &amp; Ura, 2018). Empirical findings suggest that narcissism weakens interpersonal aversion and is positively associated with respect and affection (</w:t>
-      </w:r>
-      <w:proofErr w:type="spellStart"/>
-      <w:r>
-        <w:rPr>
-          <w:rFonts w:asciiTheme="majorBidi" w:eastAsiaTheme="minorEastAsia" w:hAnsiTheme="majorBidi" w:cstheme="majorBidi"/>
-        </w:rPr>
-        <w:t>Koshinaka</w:t>
-      </w:r>
-      <w:proofErr w:type="spellEnd"/>
-      <w:r>
-        <w:rPr>
-          <w:rFonts w:asciiTheme="majorBidi" w:eastAsiaTheme="minorEastAsia" w:hAnsiTheme="majorBidi" w:cstheme="majorBidi"/>
-        </w:rPr>
-        <w:t>, 2020), that it exerts a negative direct effect on loneliness and also suppresses the impact of exclusion experiences (Tomii &amp; Oshio, 2024), and that in strategic interpersonal contexts it may connect with short-term mating strategies through mate retention behaviors (</w:t>
-      </w:r>
-      <w:proofErr w:type="spellStart"/>
-      <w:r>
-        <w:rPr>
-          <w:rFonts w:asciiTheme="majorBidi" w:eastAsiaTheme="minorEastAsia" w:hAnsiTheme="majorBidi" w:cstheme="majorBidi"/>
-        </w:rPr>
-        <w:t>Kiire</w:t>
-      </w:r>
-      <w:proofErr w:type="spellEnd"/>
-      <w:r>
-        <w:rPr>
-          <w:rFonts w:asciiTheme="majorBidi" w:eastAsiaTheme="minorEastAsia" w:hAnsiTheme="majorBidi" w:cstheme="majorBidi"/>
-        </w:rPr>
-        <w:t xml:space="preserve"> &amp; Ochi, 2017). In the domain of everyday </w:t>
-      </w:r>
-      <w:proofErr w:type="spellStart"/>
-      <w:r>
-        <w:rPr>
-          <w:rFonts w:asciiTheme="majorBidi" w:eastAsiaTheme="minorEastAsia" w:hAnsiTheme="majorBidi" w:cstheme="majorBidi"/>
-        </w:rPr>
-        <w:t>prosociality</w:t>
-      </w:r>
-      <w:proofErr w:type="spellEnd"/>
-      <w:r>
-        <w:rPr>
-          <w:rFonts w:asciiTheme="majorBidi" w:eastAsiaTheme="minorEastAsia" w:hAnsiTheme="majorBidi" w:cstheme="majorBidi"/>
-        </w:rPr>
-        <w:t xml:space="preserve">, it has also been reported that the contributions of the Dark Triad as a whole are limited in Japanese samples (Oda &amp; Matsumoto-Oda, 2022). Taken together, Japanese research on the Dark Triad has expanded into multiple domains—manipulative strategies, interpersonal emotions, loneliness and exclusion processes, gambling-related tendencies, mating strategies, and </w:t>
-      </w:r>
-      <w:proofErr w:type="spellStart"/>
-      <w:r>
-        <w:rPr>
-          <w:rFonts w:asciiTheme="majorBidi" w:eastAsiaTheme="minorEastAsia" w:hAnsiTheme="majorBidi" w:cstheme="majorBidi"/>
-        </w:rPr>
-        <w:t>prosociality</w:t>
-      </w:r>
-      <w:proofErr w:type="spellEnd"/>
-      <w:r>
-        <w:rPr>
-          <w:rFonts w:asciiTheme="majorBidi" w:eastAsiaTheme="minorEastAsia" w:hAnsiTheme="majorBidi" w:cstheme="majorBidi"/>
-        </w:rPr>
-        <w:t xml:space="preserve">—providing a rich foundation for examining how dark traits manifest within a non-WEIRD cultural setting. However, despite the implications of overseas meta-analyses linking dark traits to workplace deviance (O’Boyle et al., 2012), systematic examinations of direct associations with workplace harassment in Japan remain limited. This gap is consequential not only for applied prevention efforts but also for cross-cultural theory-building: </w:t>
+        <w:t xml:space="preserve">superiority maintenance and the need for admiration—while also noting potentially adaptive aspects depending on situational demands (Masui &amp; Ura, 2018). Empirical findings suggest that narcissism weakens interpersonal aversion and is positively associated with respect and affection (Koshinaka, 2020), that it exerts a negative direct effect on loneliness and also suppresses the impact of exclusion experiences (Tomii &amp; Oshio, 2024), and that in strategic interpersonal contexts it may connect with short-term mating strategies through mate retention behaviors (Kiire &amp; Ochi, 2017). In the domain of everyday prosociality, it has also been reported that the contributions of the Dark Triad as a whole are limited in Japanese samples (Oda &amp; Matsumoto-Oda, 2022). Taken together, Japanese research on the Dark Triad has expanded into multiple domains—manipulative strategies, interpersonal emotions, loneliness and exclusion processes, gambling-related tendencies, mating strategies, and prosociality—providing a rich foundation for examining how dark traits manifest within a non-WEIRD cultural setting. However, despite the implications of overseas meta-analyses linking dark traits to workplace deviance (O’Boyle et al., 2012), systematic examinations of direct associations with workplace harassment in Japan remain limited. This gap is consequential not only for applied prevention efforts but also for cross-cultural theory-building: </w:t>
       </w:r>
       <w:r>
         <w:rPr>
@@ -1764,21 +1264,7 @@
         <w:rPr>
           <w:rFonts w:asciiTheme="majorBidi" w:hAnsiTheme="majorBidi" w:cstheme="majorBidi"/>
         </w:rPr>
-        <w:t xml:space="preserve">The Dark Triad traits were assessed using the Japanese version of the Short Dark Triad (SD3-J; </w:t>
-      </w:r>
-      <w:proofErr w:type="spellStart"/>
-      <w:r>
-        <w:rPr>
-          <w:rFonts w:asciiTheme="majorBidi" w:hAnsiTheme="majorBidi" w:cstheme="majorBidi"/>
-        </w:rPr>
-        <w:t>Shimotsukasa</w:t>
-      </w:r>
-      <w:proofErr w:type="spellEnd"/>
-      <w:r>
-        <w:rPr>
-          <w:rFonts w:asciiTheme="majorBidi" w:hAnsiTheme="majorBidi" w:cstheme="majorBidi"/>
-        </w:rPr>
-        <w:t xml:space="preserve"> &amp; Oshio, 2017), consisting of 27 items (9 items each for Machiavellianism, Narcissism, and Psychopathy), rated on a 5-point Likert scale. In the present sample, internal consistency coefficients were α = .767 for Machiavellianism, α = .778 for Narcissism, and α = .708 for Psychopathy, with α = .842 for the SD3-J total score.</w:t>
+        <w:t>The Dark Triad traits were assessed using the Japanese version of the Short Dark Triad (SD3-J; Shimotsukasa &amp; Oshio, 2017), consisting of 27 items (9 items each for Machiavellianism, Narcissism, and Psychopathy), rated on a 5-point Likert scale. In the present sample, internal consistency coefficients were α = .767 for Machiavellianism, α = .778 for Narcissism, and α = .708 for Psychopathy, with α = .842 for the SD3-J total score.</w:t>
       </w:r>
     </w:p>
     <w:p>
@@ -1979,21 +1465,7 @@
         <w:rPr>
           <w:rFonts w:asciiTheme="majorBidi" w:hAnsiTheme="majorBidi" w:cstheme="majorBidi"/>
         </w:rPr>
-        <w:t xml:space="preserve">All analyses were conducted in Python (pandas, </w:t>
-      </w:r>
-      <w:proofErr w:type="spellStart"/>
-      <w:r>
-        <w:rPr>
-          <w:rFonts w:asciiTheme="majorBidi" w:hAnsiTheme="majorBidi" w:cstheme="majorBidi"/>
-        </w:rPr>
-        <w:t>statsmodels</w:t>
-      </w:r>
-      <w:proofErr w:type="spellEnd"/>
-      <w:r>
-        <w:rPr>
-          <w:rFonts w:asciiTheme="majorBidi" w:hAnsiTheme="majorBidi" w:cstheme="majorBidi"/>
-        </w:rPr>
-        <w:t xml:space="preserve">, SciPy). We first computed Spearman rank correlations among all focal variables to accommodate skewed distributions and potential outliers. For prediction, we estimated a series of multiple regression models with HC3 robust standard errors. Effect sizes were reported as standardized coefficients (β), and statistical significance was evaluated using two-tailed tests </w:t>
+        <w:t xml:space="preserve">All analyses were conducted in Python (pandas, statsmodels, SciPy). We first computed Spearman rank correlations among all focal variables to accommodate skewed distributions and potential outliers. For prediction, we estimated a series of multiple regression models with HC3 robust standard errors. Effect sizes were reported as standardized coefficients (β), and statistical significance was evaluated using two-tailed tests </w:t>
       </w:r>
       <w:r>
         <w:rPr>
@@ -2305,21 +1777,7 @@
           <w:rFonts w:asciiTheme="majorBidi" w:hAnsiTheme="majorBidi" w:cstheme="majorBidi"/>
         </w:rPr>
         <w:lastRenderedPageBreak/>
-        <w:t xml:space="preserve">Table 3: </w:t>
-      </w:r>
-      <w:proofErr w:type="spellStart"/>
-      <w:r>
-        <w:rPr>
-          <w:rFonts w:asciiTheme="majorBidi" w:hAnsiTheme="majorBidi" w:cstheme="majorBidi"/>
-        </w:rPr>
-        <w:t>B_controls+DT+HEXACO</w:t>
-      </w:r>
-      <w:proofErr w:type="spellEnd"/>
-      <w:r>
-        <w:rPr>
-          <w:rFonts w:asciiTheme="majorBidi" w:hAnsiTheme="majorBidi" w:cstheme="majorBidi"/>
-        </w:rPr>
-        <w:t>), and we evaluate the added value of HEXACO via Δ</w:t>
+        <w:t>Table 3: B_controls+DT+HEXACO), and we evaluate the added value of HEXACO via Δ</w:t>
       </w:r>
       <w:r>
         <w:rPr>
@@ -2416,21 +1874,7 @@
         <w:rPr>
           <w:rFonts w:asciiTheme="majorBidi" w:hAnsiTheme="majorBidi" w:cstheme="majorBidi"/>
         </w:rPr>
-        <w:t xml:space="preserve">. For gender-stratified evidence, we fit Model B separately for men and women and compare explained variance and key coefficients (see Table 5; coefficients also summarized in Table 3: </w:t>
-      </w:r>
-      <w:proofErr w:type="spellStart"/>
-      <w:r>
-        <w:rPr>
-          <w:rFonts w:asciiTheme="majorBidi" w:hAnsiTheme="majorBidi" w:cstheme="majorBidi"/>
-        </w:rPr>
-        <w:t>B_by_gender</w:t>
-      </w:r>
-      <w:proofErr w:type="spellEnd"/>
-      <w:r>
-        <w:rPr>
-          <w:rFonts w:asciiTheme="majorBidi" w:hAnsiTheme="majorBidi" w:cstheme="majorBidi"/>
-        </w:rPr>
-        <w:t>).</w:t>
+        <w:t>. For gender-stratified evidence, we fit Model B separately for men and women and compare explained variance and key coefficients (see Table 5; coefficients also summarized in Table 3: B_by_gender).</w:t>
       </w:r>
       <w:r>
         <w:rPr>
@@ -4553,15 +3997,7 @@
         <w:ind w:left="720" w:hanging="720"/>
       </w:pPr>
       <w:r>
-        <w:t xml:space="preserve">Ashton, M. C., Lee, K., Perugini, M., Szarota, P., de Vries, R. E., Di Blas, L., Boies, K., &amp; De Raad, B. (2004). A Six-Factor Structure of Personality-Descriptive Adjectives: Solutions From </w:t>
-      </w:r>
-      <w:proofErr w:type="spellStart"/>
-      <w:r>
-        <w:t>Psycholexical</w:t>
-      </w:r>
-      <w:proofErr w:type="spellEnd"/>
-      <w:r>
-        <w:t xml:space="preserve"> Studies in Seven Languages. </w:t>
+        <w:t xml:space="preserve">Ashton, M. C., Lee, K., Perugini, M., Szarota, P., de Vries, R. E., Di Blas, L., Boies, K., &amp; De Raad, B. (2004). A Six-Factor Structure of Personality-Descriptive Adjectives: Solutions From Psycholexical Studies in Seven Languages. </w:t>
       </w:r>
       <w:r>
         <w:rPr>
@@ -4691,7 +4127,7 @@
         <w:ind w:left="720" w:hanging="720"/>
       </w:pPr>
       <w:r>
-        <w:t xml:space="preserve">Babiak, P., &amp; Hare, R. D. (2006). Snakes in suits: When psychopaths go to work. Regan Books / HarperCollins.</w:t>
+        <w:t>Babiak, P., &amp; Hare, R. D. (2006). Snakes in suits: When psychopaths go to work. Regan Books / HarperCollins.</w:t>
       </w:r>
     </w:p>
     <w:p>
@@ -4741,23 +4177,15 @@
         <w:ind w:left="720" w:hanging="720"/>
       </w:pPr>
       <w:r>
-        <w:t xml:space="preserve">Bass, B. M. (1990). From transactional to transformational leadership: Learning to share the vision. Organizational Dynamics, 18(3), 19–31. https://doi.org/10.1016/0090-2616(90)90061-S</w:t>
-      </w:r>
-    </w:p>
-    <w:p>
-      <w:pPr>
-        <w:ind w:left="720" w:hanging="720"/>
-      </w:pPr>
-      <w:r>
-        <w:t xml:space="preserve">Baughman, H. M., Dearing, S., Giammarco, E., &amp; Vernon, P. A. (2012). Relationships between bullying </w:t>
-      </w:r>
-      <w:proofErr w:type="spellStart"/>
-      <w:r>
-        <w:t>behaviours</w:t>
-      </w:r>
-      <w:proofErr w:type="spellEnd"/>
-      <w:r>
-        <w:t xml:space="preserve"> and the Dark Triad: A study with adults. </w:t>
+        <w:t>Bass, B. M. (1990). From transactional to transformational leadership: Learning to share the vision. Organizational Dynamics, 18(3), 19–31. https://doi.org/10.1016/0090-2616(90)90061-S</w:t>
+      </w:r>
+    </w:p>
+    <w:p>
+      <w:pPr>
+        <w:ind w:left="720" w:hanging="720"/>
+      </w:pPr>
+      <w:r>
+        <w:t xml:space="preserve">Baughman, H. M., Dearing, S., Giammarco, E., &amp; Vernon, P. A. (2012). Relationships between bullying behaviours and the Dark Triad: A study with adults. </w:t>
       </w:r>
       <w:r>
         <w:rPr>
@@ -4784,6 +4212,7 @@
         <w:ind w:left="720" w:hanging="720"/>
       </w:pPr>
       <w:r>
+        <w:lastRenderedPageBreak/>
         <w:t xml:space="preserve">Bianchi R. (2018). Burnout is more strongly linked to neuroticism than to work-contextualized factors. </w:t>
       </w:r>
       <w:r>
@@ -4815,1865 +4244,1640 @@
         <w:t>(3)</w:t>
       </w:r>
       <w:r>
-        <w:t xml:space="preserve">, 865-891. </w:t>
+        <w:t>, 865-891. https://doi.org/10.1017/S0954579405050418</w:t>
+      </w:r>
+    </w:p>
+    <w:p>
+      <w:pPr>
+        <w:ind w:left="720" w:hanging="720"/>
+      </w:pPr>
+      <w:r>
+        <w:t xml:space="preserve">Boddy, C. R. (2011). Corporate psychopaths, bullying and unfair supervision in the workplace. </w:t>
+      </w:r>
+      <w:r>
+        <w:rPr>
+          <w:i/>
+          <w:iCs/>
+        </w:rPr>
+        <w:t>Journal of Business Ethics, 100</w:t>
+      </w:r>
+      <w:r>
+        <w:t>(3)</w:t>
+      </w:r>
+      <w:r>
+        <w:t>, 367-379. https://doi.org/10.1007/s10551-010-0689-5</w:t>
+      </w:r>
+    </w:p>
+    <w:p>
+      <w:pPr>
+        <w:ind w:left="720" w:hanging="720"/>
+      </w:pPr>
+      <w:r>
+        <w:t xml:space="preserve">Breevaart, K., &amp; de Vries, R. E. (2017). Supervisor's HEXACO personality traits and subordinate perceptions of abusive supervision. </w:t>
+      </w:r>
+      <w:r>
+        <w:rPr>
+          <w:i/>
+          <w:iCs/>
+        </w:rPr>
+        <w:t>The Leadership Quarterly, 28</w:t>
+      </w:r>
+      <w:r>
+        <w:t>(5)</w:t>
+      </w:r>
+      <w:r>
+        <w:t>, 691–700. https://doi.org/10.1016/j.leaqua.2017.02.001</w:t>
+      </w:r>
+    </w:p>
+    <w:p>
+      <w:pPr>
+        <w:ind w:left="720" w:hanging="720"/>
+      </w:pPr>
+      <w:r>
+        <w:t xml:space="preserve">Breevaart, K., &amp; de Vries, R. E. (2021). Followers’ HEXACO personality traits and preference for charismatic, relationship-oriented, and task-oriented leadership. </w:t>
+      </w:r>
+      <w:r>
+        <w:rPr>
+          <w:i/>
+          <w:iCs/>
+        </w:rPr>
+        <w:t>Journal of Business and Psychology, 36</w:t>
+      </w:r>
+      <w:r>
+        <w:t>(2)</w:t>
+      </w:r>
+      <w:r>
+        <w:t>, 253–265. https://doi.org/10.1007/s10869-019-09671-6</w:t>
+      </w:r>
+    </w:p>
+    <w:p>
+      <w:pPr>
+        <w:ind w:left="720" w:hanging="720"/>
+      </w:pPr>
+      <w:r>
+        <w:t xml:space="preserve">Brunell, A. B., Gentry, W. A., Campbell, W. K., Hoffman, B. J., Kuhnert, K. W., &amp; DeMarree, K. G. (2008). Leader emergence: The case of the narcissistic leader. </w:t>
+      </w:r>
+      <w:r>
+        <w:rPr>
+          <w:i/>
+          <w:iCs/>
+        </w:rPr>
+        <w:t>Personality and Social Psychology Bulletin, 34</w:t>
+      </w:r>
+      <w:r>
+        <w:t>(12)</w:t>
+      </w:r>
+      <w:r>
+        <w:t>, 1663–1676. https://doi.org/10.1177/0146167208324101</w:t>
+      </w:r>
+    </w:p>
+    <w:p>
+      <w:pPr>
+        <w:ind w:left="720" w:hanging="720"/>
+      </w:pPr>
+      <w:r>
+        <w:t xml:space="preserve">Bushman, B. J., &amp; Baumeister, R. F. (1998). Threatened egotism, narcissism, self-esteem, and direct and displaced aggression: Does self-love or self-hate lead to violence? </w:t>
+      </w:r>
+      <w:r>
+        <w:rPr>
+          <w:i/>
+          <w:iCs/>
+        </w:rPr>
+        <w:t>Journal of Personality and Social Psychology, 75</w:t>
+      </w:r>
+      <w:r>
+        <w:t>(1)</w:t>
+      </w:r>
+      <w:r>
+        <w:t>, 219–229. https://doi.org/10.1037/0022-3514.75.1.219</w:t>
+      </w:r>
+    </w:p>
+    <w:p>
+      <w:pPr>
+        <w:ind w:left="720" w:hanging="720"/>
+      </w:pPr>
+      <w:r>
+        <w:t xml:space="preserve">Bushman, B. J., Bonacci, A. M., van Dijk, M., &amp; Baumeister, R. F. (2003). Narcissism, </w:t>
       </w:r>
       <w:r>
         <w:lastRenderedPageBreak/>
-        <w:t>https://doi.org/10.1017/S0954579405050418</w:t>
-      </w:r>
-    </w:p>
-    <w:p>
-      <w:pPr>
-        <w:ind w:left="720" w:hanging="720"/>
-      </w:pPr>
-      <w:r>
-        <w:t xml:space="preserve">Boddy, C. R. (2011). Corporate psychopaths, bullying and unfair supervision in the workplace. </w:t>
-      </w:r>
-      <w:r>
-        <w:rPr>
-          <w:i/>
-          <w:iCs/>
-        </w:rPr>
-        <w:t>Journal of Business Ethics, 100</w:t>
+        <w:t xml:space="preserve">sexual refusal, and aggression: Testing a narcissistic reactance model of sexual coercion. </w:t>
+      </w:r>
+      <w:r>
+        <w:rPr>
+          <w:i/>
+          <w:iCs/>
+        </w:rPr>
+        <w:t>Journal of Personality and Social Psychology, 84</w:t>
+      </w:r>
+      <w:r>
+        <w:t>(5)</w:t>
+      </w:r>
+      <w:r>
+        <w:t>, 1027–1040. https://doi.org/10.1037/0022-3514.84.5.1027</w:t>
+      </w:r>
+    </w:p>
+    <w:p>
+      <w:pPr>
+        <w:ind w:left="720" w:hanging="720"/>
+      </w:pPr>
+      <w:r>
+        <w:t xml:space="preserve">Byrne, B. M., &amp; Campbell, T. L. (1999). Cross-cultural comparisons and the presumption of equivalent measurement and theoretical structure: A look beneath the surface. </w:t>
+      </w:r>
+      <w:r>
+        <w:rPr>
+          <w:i/>
+          <w:iCs/>
+        </w:rPr>
+        <w:t>Journal of Cross-Cultural Psychology, 30</w:t>
+      </w:r>
+      <w:r>
+        <w:t>(5)</w:t>
+      </w:r>
+      <w:r>
+        <w:t>, 555–574. https://doi.org/10.1177/0022022199030005001</w:t>
+      </w:r>
+    </w:p>
+    <w:p>
+      <w:pPr>
+        <w:ind w:left="720" w:hanging="720"/>
+      </w:pPr>
+      <w:r>
+        <w:t xml:space="preserve">Campbell, W. K., Rudich, E. A., &amp; Sedikides, C. (2002). Narcissism, self-esteem, and the positivity of self-views: Two portraits of self-love. </w:t>
+      </w:r>
+      <w:r>
+        <w:rPr>
+          <w:i/>
+          <w:iCs/>
+        </w:rPr>
+        <w:t>Personality and Social Psychology Bulletin, 28</w:t>
       </w:r>
       <w:r>
         <w:t>(3)</w:t>
       </w:r>
       <w:r>
-        <w:t>, 367-379. https://doi.org/10.1007/s10551-010-0689-5</w:t>
-      </w:r>
-    </w:p>
-    <w:p>
-      <w:pPr>
-        <w:ind w:left="720" w:hanging="720"/>
-      </w:pPr>
-      <w:proofErr w:type="spellStart"/>
-      <w:r>
-        <w:t>Breevaart</w:t>
-      </w:r>
-      <w:proofErr w:type="spellEnd"/>
-      <w:r>
-        <w:t xml:space="preserve">, K., &amp; de Vries, R. E. (2017). Supervisor's HEXACO personality traits and subordinate perceptions of abusive supervision. </w:t>
-      </w:r>
-      <w:r>
-        <w:rPr>
-          <w:i/>
-          <w:iCs/>
-        </w:rPr>
-        <w:t>The Leadership Quarterly, 28</w:t>
+        <w:t>, 358–368. https://doi.org/10.1177/0146167202286007</w:t>
+      </w:r>
+    </w:p>
+    <w:p>
+      <w:pPr>
+        <w:ind w:left="720" w:hanging="720"/>
+      </w:pPr>
+      <w:r>
+        <w:t xml:space="preserve">Chatterjee, A., &amp; Hambrick, D. C. (2007). It’s all about me: Narcissistic chief executive officers and their effects on company strategy and performance. </w:t>
+      </w:r>
+      <w:r>
+        <w:rPr>
+          <w:i/>
+          <w:iCs/>
+        </w:rPr>
+        <w:t>Administrative Science Quarterly, 52</w:t>
+      </w:r>
+      <w:r>
+        <w:t>(3)</w:t>
+      </w:r>
+      <w:r>
+        <w:t>, 351-386. https://doi.org/10.2189/asqu.52.3.351</w:t>
+      </w:r>
+    </w:p>
+    <w:p>
+      <w:pPr>
+        <w:ind w:left="720" w:hanging="720"/>
+      </w:pPr>
+      <w:r>
+        <w:t>Cherniss, C., &amp; Goleman, D. (Eds.). (2001). The emotionally intelligent workplace: How to select for, measure, and improve emotional intelligence in individuals, groups, and organizations. Jossey-Bass.</w:t>
+      </w:r>
+    </w:p>
+    <w:p>
+      <w:pPr>
+        <w:ind w:left="720" w:hanging="720"/>
+      </w:pPr>
+      <w:r>
+        <w:rPr>
+          <w:rFonts w:hint="eastAsia"/>
+        </w:rPr>
+        <w:t>Christian, M. S., Edwards, B. D., &amp; Bradley, J. C. (2010). Situational judgment tests: Constructs assessed and a meta</w:t>
+      </w:r>
+      <w:r>
+        <w:rPr>
+          <w:rFonts w:hint="eastAsia"/>
+        </w:rPr>
+        <w:t>‐</w:t>
+      </w:r>
+      <w:r>
+        <w:rPr>
+          <w:rFonts w:hint="eastAsia"/>
+        </w:rPr>
+        <w:t>analysis of their criterion</w:t>
+      </w:r>
+      <w:r>
+        <w:rPr>
+          <w:rFonts w:hint="eastAsia"/>
+        </w:rPr>
+        <w:t>‐</w:t>
+      </w:r>
+      <w:r>
+        <w:rPr>
+          <w:rFonts w:hint="eastAsia"/>
+        </w:rPr>
+        <w:t xml:space="preserve">related validities. </w:t>
+      </w:r>
+      <w:r>
+        <w:rPr>
+          <w:rFonts w:hint="eastAsia"/>
+          <w:i/>
+          <w:iCs/>
+        </w:rPr>
+        <w:t>Personnel Psychology, 63</w:t>
+      </w:r>
+      <w:r>
+        <w:rPr>
+          <w:rFonts w:hint="eastAsia"/>
+        </w:rPr>
+        <w:t>(1)</w:t>
+      </w:r>
+      <w:r>
+        <w:rPr>
+          <w:rFonts w:hint="eastAsia"/>
+        </w:rPr>
+        <w:t>, 83-117. https://doi.org/10.1111/j.1744-6570.2009.01163.x</w:t>
+      </w:r>
+    </w:p>
+    <w:p>
+      <w:pPr>
+        <w:ind w:left="720" w:hanging="720"/>
+      </w:pPr>
+      <w:r>
+        <w:t>Christie, R., &amp; Geis, F. L. (1970). Studies in Machiavellianism. Academic Press.</w:t>
+      </w:r>
+    </w:p>
+    <w:p>
+      <w:pPr>
+        <w:ind w:left="720" w:hanging="720"/>
+      </w:pPr>
+      <w:r>
+        <w:t>Cleckley, H. (1941). The mask of sanity: An attempt to clarify some issues about the so-called psychopathic personality. C. V. Mosby.</w:t>
+      </w:r>
+    </w:p>
+    <w:p>
+      <w:pPr>
+        <w:ind w:left="720" w:hanging="720"/>
+      </w:pPr>
+      <w:r>
+        <w:t xml:space="preserve">Cohen, J. (1988). </w:t>
+      </w:r>
+      <w:r>
+        <w:rPr>
+          <w:i/>
+          <w:iCs/>
+        </w:rPr>
+        <w:t>Statistical Power Analysis for the Behavioral Sciences</w:t>
+      </w:r>
+      <w:r>
+        <w:t xml:space="preserve"> (2nd ed.). Routledge. https://doi.org/10.4324/9780203771587</w:t>
+      </w:r>
+    </w:p>
+    <w:p>
+      <w:pPr>
+        <w:ind w:left="720" w:hanging="720"/>
+      </w:pPr>
+      <w:r>
+        <w:lastRenderedPageBreak/>
+        <w:t xml:space="preserve">Conger, J. A. (1999). Charismatic and transformational leadership in organizations: An insider's perspective on these developing streams of research. </w:t>
+      </w:r>
+      <w:r>
+        <w:rPr>
+          <w:i/>
+          <w:iCs/>
+        </w:rPr>
+        <w:t>Leadership Quarterly, 10</w:t>
+      </w:r>
+      <w:r>
+        <w:t>(2)</w:t>
+      </w:r>
+      <w:r>
+        <w:t>, 145–179. https://doi.org/10.1016/S1048-9843(99)00012-0</w:t>
+      </w:r>
+    </w:p>
+    <w:p>
+      <w:pPr>
+        <w:ind w:left="720" w:hanging="720"/>
+      </w:pPr>
+      <w:r>
+        <w:t xml:space="preserve">Costa, P. T., Jr., Terracciano, A., &amp; McCrae, R. R. (2001). Gender differences in personality traits across cultures: Robust and surprising findings. </w:t>
+      </w:r>
+      <w:r>
+        <w:rPr>
+          <w:i/>
+          <w:iCs/>
+        </w:rPr>
+        <w:t>Journal of Personality and Social Psychology, 81</w:t>
+      </w:r>
+      <w:r>
+        <w:t>(2)</w:t>
+      </w:r>
+      <w:r>
+        <w:t>, 322–331. https://doi.org/10.1037/0022-3514.81.2.322</w:t>
+      </w:r>
+    </w:p>
+    <w:p>
+      <w:pPr>
+        <w:ind w:left="720" w:hanging="720"/>
+      </w:pPr>
+      <w:r>
+        <w:t xml:space="preserve">Dåderman, A. M., &amp; Ragnestål-Impola, C. (2019). Workplace bullies, not their victims, score high on the Dark Triad and Extraversion, and low on Agreeableness and Honesty-Humility. </w:t>
+      </w:r>
+      <w:r>
+        <w:rPr>
+          <w:i/>
+          <w:iCs/>
+        </w:rPr>
+        <w:t>Heliyon, 5</w:t>
+      </w:r>
+      <w:r>
+        <w:t>(10)</w:t>
+      </w:r>
+      <w:r>
+        <w:t>, e02609. https://doi.org/10.1016/j.heliyon.2019.e02609</w:t>
+      </w:r>
+    </w:p>
+    <w:p>
+      <w:pPr>
+        <w:ind w:left="720" w:hanging="720"/>
+      </w:pPr>
+      <w:r>
+        <w:t xml:space="preserve">De Hoogh, A. H. B., &amp; Den Hartog, D. N. (2008). Ethical and despotic leadership, relationships with leader's social responsibility, top management team effectiveness and subordinates' optimism: A multi-method study. </w:t>
+      </w:r>
+      <w:r>
+        <w:rPr>
+          <w:i/>
+          <w:iCs/>
+        </w:rPr>
+        <w:t>Leadership Quarterly, 19</w:t>
+      </w:r>
+      <w:r>
+        <w:t>(3)</w:t>
+      </w:r>
+      <w:r>
+        <w:t>, 297–311. https://doi.org/10.1016/j.leaqua.2008.03.002</w:t>
+      </w:r>
+    </w:p>
+    <w:p>
+      <w:pPr>
+        <w:ind w:left="720" w:hanging="720"/>
+      </w:pPr>
+      <w:r>
+        <w:t xml:space="preserve">de Vries, R. E. (2012). Personality predictors of leadership styles and the self–other agreement problem. </w:t>
+      </w:r>
+      <w:r>
+        <w:rPr>
+          <w:i/>
+          <w:iCs/>
+        </w:rPr>
+        <w:t>Leadership Quarterly, 23</w:t>
       </w:r>
       <w:r>
         <w:t>(5)</w:t>
       </w:r>
       <w:r>
-        <w:t>, 691–700. https://doi.org/10.1016/j.leaqua.2017.02.001</w:t>
-      </w:r>
-    </w:p>
-    <w:p>
-      <w:pPr>
-        <w:ind w:left="720" w:hanging="720"/>
-      </w:pPr>
-      <w:proofErr w:type="spellStart"/>
-      <w:r>
-        <w:t>Breevaart</w:t>
-      </w:r>
-      <w:proofErr w:type="spellEnd"/>
-      <w:r>
-        <w:t xml:space="preserve">, K., &amp; de Vries, R. E. (2021). Followers’ HEXACO personality traits and preference for charismatic, relationship-oriented, and task-oriented leadership. </w:t>
-      </w:r>
-      <w:r>
-        <w:rPr>
-          <w:i/>
-          <w:iCs/>
-        </w:rPr>
-        <w:t>Journal of Business and Psychology, 36</w:t>
+        <w:t>, 809–821. https://doi.org/10.1016/j.leaqua.2012.03.002</w:t>
+      </w:r>
+    </w:p>
+    <w:p>
+      <w:pPr>
+        <w:ind w:left="720" w:hanging="720"/>
+      </w:pPr>
+      <w:r>
+        <w:t xml:space="preserve">Einarsen, S., Aasland, M. S., &amp; Skogstad, A. (2007). Destructive leadership behavior: A definition and conceptual model. </w:t>
+      </w:r>
+      <w:r>
+        <w:rPr>
+          <w:i/>
+          <w:iCs/>
+        </w:rPr>
+        <w:t>Leadership Quarterly, 18</w:t>
+      </w:r>
+      <w:r>
+        <w:t xml:space="preserve">, 207-216. </w:t>
+      </w:r>
+      <w:r>
+        <w:t>https://doi.org/</w:t>
+      </w:r>
+      <w:r>
+        <w:t>10.1016/j.leaqua.2007.03.002</w:t>
+      </w:r>
+    </w:p>
+    <w:p>
+      <w:pPr>
+        <w:ind w:left="720" w:hanging="720"/>
+      </w:pPr>
+      <w:r>
+        <w:t>Fehr, B., Samsom, D., &amp; Paulhus, D. L. (1992). The construct of Machiavellianism: Twenty years later. In C. D. Spielberger &amp; J. N. Butcher (Eds.), Advances in personality assessment (Vol. 9, pp. 77–116). Lawrence Erlbaum.</w:t>
+      </w:r>
+    </w:p>
+    <w:p>
+      <w:pPr>
+        <w:ind w:left="720" w:hanging="720"/>
+      </w:pPr>
+      <w:r>
+        <w:t xml:space="preserve">Fukui, Y., Oura, S., Matsuo, K., Inagaki (Fujii), T., &amp; Shima, Y. (2017). Development of the Japanese version of MET-CORE2 for objective measurement of empathy. </w:t>
+      </w:r>
+      <w:r>
+        <w:rPr>
+          <w:i/>
+          <w:iCs/>
+        </w:rPr>
+        <w:t>Japanese Journal of Research on Emotions, 25</w:t>
+      </w:r>
+      <w:r>
+        <w:t>(Supplement)</w:t>
+      </w:r>
+      <w:r>
+        <w:t xml:space="preserve">, ps01. </w:t>
+      </w:r>
+      <w:r>
+        <w:lastRenderedPageBreak/>
+        <w:t>https://doi.org/10.4092/jsre.25.Supplement_ps01</w:t>
+      </w:r>
+      <w:r>
+        <w:rPr>
+          <w:rFonts w:hint="eastAsia"/>
+        </w:rPr>
+        <w:t xml:space="preserve"> (in Japanese</w:t>
+      </w:r>
+      <w:r>
+        <w:rPr>
+          <w:rFonts w:hint="eastAsia"/>
+        </w:rPr>
+        <w:t>.</w:t>
+      </w:r>
+      <w:r>
+        <w:rPr>
+          <w:rFonts w:hint="eastAsia"/>
+        </w:rPr>
+        <w:t>)</w:t>
+      </w:r>
+    </w:p>
+    <w:p>
+      <w:pPr>
+        <w:ind w:left="720" w:hanging="720"/>
+      </w:pPr>
+      <w:r>
+        <w:t xml:space="preserve">Fukui, Y., Matsuo, K., Oura, S., Inagaki, T., &amp; Shima, Y. (2018). Re-examination of the convergent validity of the Japanese version of MET-CORE2 for objective measurement of empathy. </w:t>
+      </w:r>
+      <w:r>
+        <w:rPr>
+          <w:i/>
+          <w:iCs/>
+        </w:rPr>
+        <w:t>Japanese Journal of Research on Emotions, 26</w:t>
+      </w:r>
+      <w:r>
+        <w:t>(Supplement)</w:t>
+      </w:r>
+      <w:r>
+        <w:t>, ps43. https://doi.org/10.4092/jsre.26.Supplement_ps43</w:t>
+      </w:r>
+      <w:r>
+        <w:rPr>
+          <w:rFonts w:hint="eastAsia"/>
+        </w:rPr>
+        <w:t xml:space="preserve"> (in Japanese.)</w:t>
+      </w:r>
+    </w:p>
+    <w:p>
+      <w:pPr>
+        <w:ind w:left="720" w:hanging="720"/>
+      </w:pPr>
+      <w:r>
+        <w:t>Gandolfi, F., Stone, S., &amp; Deno, F. (2017). Servant leadership: An ancient style with 21st century relevance. Review of International Comparative Management, 18(4), 350–361.</w:t>
+      </w:r>
+    </w:p>
+    <w:p>
+      <w:pPr>
+        <w:ind w:left="720" w:hanging="720"/>
+      </w:pPr>
+      <w:r>
+        <w:t xml:space="preserve">Glenn, A. L., Raine, A., &amp; Schug, R. A. (2009). The neural correlates of moral decision-making in psychopathy. </w:t>
+      </w:r>
+      <w:r>
+        <w:rPr>
+          <w:i/>
+          <w:iCs/>
+        </w:rPr>
+        <w:t>Molecular Psychiatry, 14</w:t>
+      </w:r>
+      <w:r>
+        <w:t>(1)</w:t>
+      </w:r>
+      <w:r>
+        <w:t>, 5–6. https://doi.org/10.1038/mp.2008.104</w:t>
+      </w:r>
+    </w:p>
+    <w:p>
+      <w:pPr>
+        <w:ind w:left="720" w:hanging="720"/>
+      </w:pPr>
+      <w:r>
+        <w:t xml:space="preserve">Grijalva, E. and Newman, D.A. (2015), Narcissism–CWB Relationship. </w:t>
+      </w:r>
+      <w:r>
+        <w:rPr>
+          <w:i/>
+          <w:iCs/>
+        </w:rPr>
+        <w:t>Applied Psychology, 64</w:t>
+      </w:r>
+      <w:r>
+        <w:rPr>
+          <w:rFonts w:hint="eastAsia"/>
+          <w:i/>
+          <w:iCs/>
+        </w:rPr>
+        <w:t>,</w:t>
+      </w:r>
+      <w:r>
+        <w:t xml:space="preserve"> 93-126. https://doi.org/10.1111/apps.12025</w:t>
+      </w:r>
+    </w:p>
+    <w:p>
+      <w:pPr>
+        <w:ind w:left="720" w:hanging="720"/>
+      </w:pPr>
+      <w:r>
+        <w:t xml:space="preserve">Hare, R. D. (1982). Psychopathy and the personality dimensions of psychoticism, extraversion and neuroticism. </w:t>
+      </w:r>
+      <w:r>
+        <w:rPr>
+          <w:i/>
+          <w:iCs/>
+        </w:rPr>
+        <w:t>Personality and Individual Differences, 3</w:t>
+      </w:r>
+      <w:r>
+        <w:t>, 35–42. https://doi.org/10.1016/0191-8869(82)90072-1</w:t>
+      </w:r>
+    </w:p>
+    <w:p>
+      <w:pPr>
+        <w:ind w:left="720" w:hanging="720"/>
+      </w:pPr>
+      <w:r>
+        <w:t>Hare, R. D. (2003). Manual for the Hare Psychopathy Checklist–Revised (2nd ed.). Multi-Health Systems.</w:t>
+      </w:r>
+    </w:p>
+    <w:p>
+      <w:pPr>
+        <w:ind w:left="720" w:hanging="720"/>
+      </w:pPr>
+      <w:r>
+        <w:t xml:space="preserve">Hare, R. D., &amp; Neumann, C. S. (2008). Psychopathy as a clinical and empirical construct. </w:t>
+      </w:r>
+      <w:r>
+        <w:rPr>
+          <w:i/>
+          <w:iCs/>
+        </w:rPr>
+        <w:t>Annual Review of Clinical Psychology, 4</w:t>
+      </w:r>
+      <w:r>
+        <w:t xml:space="preserve">, 217-246. </w:t>
+      </w:r>
+      <w:r>
+        <w:t>https://doi.org/</w:t>
+      </w:r>
+      <w:r>
+        <w:t>10.1146/annurev.clinpsy.3.022806.091452</w:t>
+      </w:r>
+    </w:p>
+    <w:p>
+      <w:pPr>
+        <w:ind w:left="720" w:hanging="720"/>
+      </w:pPr>
+      <w:r>
+        <w:t xml:space="preserve">Hemphill, J. F., Hare, R. D., &amp; Wong, S. (1998). Psychopathy and recidivism: A review. </w:t>
+      </w:r>
+      <w:r>
+        <w:rPr>
+          <w:i/>
+          <w:iCs/>
+        </w:rPr>
+        <w:t>Legal and Criminological Psychology, 3</w:t>
+      </w:r>
+      <w:r>
+        <w:t>(Part 1)</w:t>
+      </w:r>
+      <w:r>
+        <w:t>, 139–170. https://doi.org/10.1111/j.2044-8333.1998.tb00355.x</w:t>
+      </w:r>
+    </w:p>
+    <w:p>
+      <w:pPr>
+        <w:ind w:left="720" w:hanging="720"/>
+      </w:pPr>
+      <w:r>
+        <w:lastRenderedPageBreak/>
+        <w:t>Henrich J, Heine SJ, Norenzayan A. The weirdest people in the world? Behav Brain Sci. 2010 Jun;33(2-3):61-83; discussion 83-135. doi: 10.1017/S0140525X0999152X. Epub 2010 Jun 15. PMID: 20550733.</w:t>
+      </w:r>
+    </w:p>
+    <w:p>
+      <w:pPr>
+        <w:ind w:left="720" w:hanging="720"/>
+      </w:pPr>
+      <w:r>
+        <w:t xml:space="preserve">Hoch, J. E., Bommer, W. H., Dulebohn, J. H., &amp; Wu, D. (2018). Do ethical, authentic, and servant leadership explain variance above and beyond transformational leadership? A meta-analysis. </w:t>
+      </w:r>
+      <w:r>
+        <w:rPr>
+          <w:i/>
+          <w:iCs/>
+        </w:rPr>
+        <w:t>Journal of Management, 44</w:t>
       </w:r>
       <w:r>
         <w:t>(2)</w:t>
       </w:r>
       <w:r>
-        <w:t>, 253–265. https://doi.org/10.1007/s10869-019-09671-6</w:t>
-      </w:r>
-    </w:p>
-    <w:p>
-      <w:pPr>
-        <w:ind w:left="720" w:hanging="720"/>
-      </w:pPr>
-      <w:r>
-        <w:t xml:space="preserve">Brunell, A. B., Gentry, W. A., Campbell, W. K., Hoffman, B. J., Kuhnert, K. W., &amp; </w:t>
-      </w:r>
-      <w:proofErr w:type="spellStart"/>
-      <w:r>
-        <w:t>DeMarree</w:t>
-      </w:r>
-      <w:proofErr w:type="spellEnd"/>
-      <w:r>
-        <w:t xml:space="preserve">, K. G. (2008). Leader emergence: The case of the narcissistic leader. </w:t>
-      </w:r>
-      <w:r>
-        <w:rPr>
-          <w:i/>
-          <w:iCs/>
-        </w:rPr>
-        <w:t>Personality and Social Psychology Bulletin, 34</w:t>
+        <w:t>, 501-529. https://doi.org/10.1177/0149206316665461</w:t>
+      </w:r>
+    </w:p>
+    <w:p>
+      <w:pPr>
+        <w:ind w:left="720" w:hanging="720"/>
+      </w:pPr>
+      <w:r>
+        <w:t xml:space="preserve">Howard, M. C., &amp; Van Zandt, E. C. (2020). The discriminant validity of honesty-humility: A meta-analysis of the HEXACO, Big Five, and Dark Triad. </w:t>
+      </w:r>
+      <w:r>
+        <w:rPr>
+          <w:i/>
+          <w:iCs/>
+        </w:rPr>
+        <w:t>Journal of Research in Personality, 87</w:t>
+      </w:r>
+      <w:r>
+        <w:t>, 103982. https://doi.org/10.1016/j.jrp.2020.103982</w:t>
+      </w:r>
+    </w:p>
+    <w:p>
+      <w:pPr>
+        <w:ind w:left="720" w:hanging="720"/>
+      </w:pPr>
+      <w:r>
+        <w:t xml:space="preserve">Inceoglu, I., &amp; Warr, P. (2011). Personality and job engagement. </w:t>
+      </w:r>
+      <w:r>
+        <w:rPr>
+          <w:i/>
+          <w:iCs/>
+        </w:rPr>
+        <w:t>Journal of Personnel Psychology, 10</w:t>
+      </w:r>
+      <w:r>
+        <w:t>(4)</w:t>
+      </w:r>
+      <w:r>
+        <w:t>, 177–181. https://doi.org/10.1027/1866-5888/a000045</w:t>
+      </w:r>
+    </w:p>
+    <w:p>
+      <w:pPr>
+        <w:ind w:left="720" w:hanging="720"/>
+      </w:pPr>
+      <w:r>
+        <w:rPr>
+          <w:rFonts w:hint="eastAsia"/>
+        </w:rPr>
+        <w:t>Jonason, P. K., Li, N. P., Webster, G. D., &amp; Schmitt, D. P. (2009). The Dark Triad: Facilitating a short</w:t>
+      </w:r>
+      <w:r>
+        <w:rPr>
+          <w:rFonts w:hint="eastAsia"/>
+        </w:rPr>
+        <w:t>‐</w:t>
+      </w:r>
+      <w:r>
+        <w:rPr>
+          <w:rFonts w:hint="eastAsia"/>
+        </w:rPr>
+        <w:t xml:space="preserve">term mating strategy in men. </w:t>
+      </w:r>
+      <w:r>
+        <w:rPr>
+          <w:rFonts w:hint="eastAsia"/>
+          <w:i/>
+          <w:iCs/>
+        </w:rPr>
+        <w:t>European Journal of Personality, 23</w:t>
+      </w:r>
+      <w:r>
+        <w:rPr>
+          <w:rFonts w:hint="eastAsia"/>
+        </w:rPr>
+        <w:t>(1)</w:t>
+      </w:r>
+      <w:r>
+        <w:rPr>
+          <w:rFonts w:hint="eastAsia"/>
+        </w:rPr>
+        <w:t>, 5-18. https://doi.org/10.1002/per.698</w:t>
+      </w:r>
+    </w:p>
+    <w:p>
+      <w:pPr>
+        <w:ind w:left="720" w:hanging="720"/>
+      </w:pPr>
+      <w:r>
+        <w:t xml:space="preserve">Jonason, P. K., &amp; Webster, G. D. (2010). The dirty dozen: A concise measure of the dark triad. </w:t>
+      </w:r>
+      <w:r>
+        <w:rPr>
+          <w:i/>
+          <w:iCs/>
+        </w:rPr>
+        <w:t>Psychological Assessment, 22</w:t>
+      </w:r>
+      <w:r>
+        <w:t>(2)</w:t>
+      </w:r>
+      <w:r>
+        <w:t>, 420–432. https://doi.org/10.1037/a0019265</w:t>
+      </w:r>
+    </w:p>
+    <w:p>
+      <w:pPr>
+        <w:ind w:left="720" w:hanging="720"/>
+      </w:pPr>
+      <w:r>
+        <w:t xml:space="preserve">Jonason, P. K., Slomski, S., &amp; Partyka, J. (2012). The Dark Triad at work: How toxic employees get their way. </w:t>
+      </w:r>
+      <w:r>
+        <w:rPr>
+          <w:i/>
+          <w:iCs/>
+        </w:rPr>
+        <w:t>Personality and Individual Differences, 52</w:t>
+      </w:r>
+      <w:r>
+        <w:t>(3)</w:t>
+      </w:r>
+      <w:r>
+        <w:t>, 449-453. https://doi.org/10.1016/j.paid.2011.11.008</w:t>
+      </w:r>
+    </w:p>
+    <w:p>
+      <w:pPr>
+        <w:ind w:left="720" w:hanging="720"/>
+      </w:pPr>
+      <w:r>
+        <w:t>Jones, D. N., &amp; Paulhus, D. L. (2009). Machiavellianism. In M. R. Leary &amp; R. H. Hoyle (Eds.), Handbook of individual differences in social behavior (pp. 93–108). Guilford Press.</w:t>
+      </w:r>
+    </w:p>
+    <w:p>
+      <w:pPr>
+        <w:ind w:left="720" w:hanging="720"/>
+      </w:pPr>
+      <w:r>
+        <w:t xml:space="preserve">Jones, D. N., &amp; Paulhus, D. L. (2010). Different provocations trigger aggression in narcissists and psychopaths. Social Psychological and Personality Science, 1(1), 12–18. </w:t>
+      </w:r>
+      <w:r>
+        <w:lastRenderedPageBreak/>
+        <w:t>https://doi.org/10.1177/1948550609347591</w:t>
+      </w:r>
+    </w:p>
+    <w:p>
+      <w:pPr>
+        <w:ind w:left="720" w:hanging="720"/>
+      </w:pPr>
+      <w:r>
+        <w:t xml:space="preserve">Judge, T. A., &amp; Bono, J. E. (2000). Five-factor model of personality and transformational leadership. </w:t>
+      </w:r>
+      <w:r>
+        <w:rPr>
+          <w:i/>
+          <w:iCs/>
+        </w:rPr>
+        <w:t>Journal of Applied Psychology, 85</w:t>
+      </w:r>
+      <w:r>
+        <w:t>(5)</w:t>
+      </w:r>
+      <w:r>
+        <w:t>, 751–765. https://doi.org/10.1037/0021-9010.85.5.751</w:t>
+      </w:r>
+    </w:p>
+    <w:p>
+      <w:pPr>
+        <w:ind w:left="720" w:hanging="720"/>
+      </w:pPr>
+      <w:r>
+        <w:t xml:space="preserve">Kiire, A. (2016). The relationship between the Dark Triad and the Five-Factor Model of personality. </w:t>
+      </w:r>
+      <w:r>
+        <w:rPr>
+          <w:i/>
+          <w:iCs/>
+        </w:rPr>
+        <w:t>Bulletin of Hosei University Graduate School, 76</w:t>
+      </w:r>
+      <w:r>
+        <w:t>, 49-54. https://doi.org/10.15002/00012803</w:t>
+      </w:r>
+      <w:r>
+        <w:rPr>
+          <w:rFonts w:hint="eastAsia"/>
+        </w:rPr>
+        <w:t xml:space="preserve"> (in Japanese</w:t>
+      </w:r>
+      <w:r>
+        <w:rPr>
+          <w:rFonts w:hint="eastAsia"/>
+        </w:rPr>
+        <w:t>.</w:t>
+      </w:r>
+      <w:r>
+        <w:rPr>
+          <w:rFonts w:hint="eastAsia"/>
+        </w:rPr>
+        <w:t>)</w:t>
+      </w:r>
+    </w:p>
+    <w:p>
+      <w:pPr>
+        <w:ind w:left="720" w:hanging="720"/>
+      </w:pPr>
+      <w:r>
+        <w:t xml:space="preserve">Kiire, A., &amp; Ochi, K. (2017). Short-term mating of the Dark Triad is mediated by mate retention behaviors. </w:t>
+      </w:r>
+      <w:r>
+        <w:rPr>
+          <w:i/>
+          <w:iCs/>
+        </w:rPr>
+        <w:t>Proceedings of the 81st Annual Convention of the Japanese Psychological Association, 81</w:t>
+      </w:r>
+      <w:r>
+        <w:t xml:space="preserve">, </w:t>
+      </w:r>
+      <w:r>
+        <w:rPr>
+          <w:rFonts w:hint="eastAsia"/>
+        </w:rPr>
+        <w:t>2</w:t>
+      </w:r>
+      <w:r>
+        <w:t>. https://doi.org/10.4992/pacjpa.81.0_1A-007</w:t>
+      </w:r>
+      <w:r>
+        <w:rPr>
+          <w:rFonts w:hint="eastAsia"/>
+        </w:rPr>
+        <w:t xml:space="preserve"> (in Japanese</w:t>
+      </w:r>
+      <w:r>
+        <w:rPr>
+          <w:rFonts w:hint="eastAsia"/>
+        </w:rPr>
+        <w:t>.</w:t>
+      </w:r>
+      <w:r>
+        <w:rPr>
+          <w:rFonts w:hint="eastAsia"/>
+        </w:rPr>
+        <w:t>)</w:t>
+      </w:r>
+    </w:p>
+    <w:p>
+      <w:pPr>
+        <w:ind w:left="720" w:hanging="720"/>
+      </w:pPr>
+      <w:r>
+        <w:t xml:space="preserve">Kobayashi, A., &amp; Tanaka, K. (2010). Development of the Gender Harassment Scale. </w:t>
+      </w:r>
+      <w:r>
+        <w:rPr>
+          <w:i/>
+          <w:iCs/>
+        </w:rPr>
+        <w:t>Japanese Journal of Industrial and Organizational Psychology, 24</w:t>
+      </w:r>
+      <w:r>
+        <w:t>(1)</w:t>
+      </w:r>
+      <w:r>
+        <w:t>, 15-27. https://doi.org/10.32222/jaiop.24.1_15</w:t>
+      </w:r>
+      <w:r>
+        <w:rPr>
+          <w:rFonts w:hint="eastAsia"/>
+        </w:rPr>
+        <w:t xml:space="preserve"> (in Japanese</w:t>
+      </w:r>
+      <w:r>
+        <w:rPr>
+          <w:rFonts w:hint="eastAsia"/>
+        </w:rPr>
+        <w:t>.</w:t>
+      </w:r>
+      <w:r>
+        <w:rPr>
+          <w:rFonts w:hint="eastAsia"/>
+        </w:rPr>
+        <w:t>)</w:t>
+      </w:r>
+    </w:p>
+    <w:p>
+      <w:pPr>
+        <w:ind w:left="720" w:hanging="720"/>
+      </w:pPr>
+      <w:r>
+        <w:t xml:space="preserve">Koshinaka, K. (2020). Do the Dark Triad personalities dislike others and avoid being disliked by others? </w:t>
+      </w:r>
+      <w:r>
+        <w:rPr>
+          <w:i/>
+          <w:iCs/>
+        </w:rPr>
+        <w:t>Bulletin of Tokai Gakuen University, 30</w:t>
+      </w:r>
+      <w:r>
+        <w:t>, 57-78. http://repository.tokaigakuen-u.ac.jp/dspace/handle/11334/1903</w:t>
+      </w:r>
+      <w:r>
+        <w:rPr>
+          <w:rFonts w:hint="eastAsia"/>
+        </w:rPr>
+        <w:t xml:space="preserve"> (in Japanese</w:t>
+      </w:r>
+      <w:r>
+        <w:rPr>
+          <w:rFonts w:hint="eastAsia"/>
+        </w:rPr>
+        <w:t>.</w:t>
+      </w:r>
+      <w:r>
+        <w:rPr>
+          <w:rFonts w:hint="eastAsia"/>
+        </w:rPr>
+        <w:t>)</w:t>
+      </w:r>
+    </w:p>
+    <w:p>
+      <w:pPr>
+        <w:ind w:left="720" w:hanging="720"/>
+      </w:pPr>
+      <w:r>
+        <w:t xml:space="preserve">LeBreton, J. M., Shiverdecker, L. K., &amp; Grimaldi, E. M. (2018). The dark triad and workplace behavior. </w:t>
+      </w:r>
+      <w:r>
+        <w:rPr>
+          <w:i/>
+          <w:iCs/>
+        </w:rPr>
+        <w:t>Annual Review of Organizational Psychology and Organizational Behavior, 5</w:t>
+      </w:r>
+      <w:r>
+        <w:t>, 387-414. https://doi.org/10.1146/annurev-orgpsych-032117-104451</w:t>
+      </w:r>
+    </w:p>
+    <w:p>
+      <w:pPr>
+        <w:ind w:left="720" w:hanging="720"/>
+      </w:pPr>
+      <w:r>
+        <w:t xml:space="preserve">Lee, K., &amp; Ashton, M. C. (2004). Psychometric properties of the HEXACO Personality Inventory. </w:t>
+      </w:r>
+      <w:r>
+        <w:rPr>
+          <w:i/>
+          <w:iCs/>
+        </w:rPr>
+        <w:t>Multivariate Behavioral Research, 39</w:t>
+      </w:r>
+      <w:r>
+        <w:t>(2)</w:t>
+      </w:r>
+      <w:r>
+        <w:t>, 329-358. https://doi.org/10.1207/s15327906mbr3902_8</w:t>
+      </w:r>
+    </w:p>
+    <w:p>
+      <w:pPr>
+        <w:ind w:left="720" w:hanging="720"/>
+      </w:pPr>
+      <w:r>
+        <w:t xml:space="preserve">Lee, K., &amp; Ashton, M. C. (2005). Psychopathy, Machiavellianism, and Narcissism in the Five-Factor Model and the HEXACO model of personality structure. </w:t>
+      </w:r>
+      <w:r>
+        <w:rPr>
+          <w:i/>
+          <w:iCs/>
+        </w:rPr>
+        <w:t xml:space="preserve">Personality and </w:t>
+      </w:r>
+      <w:r>
+        <w:rPr>
+          <w:i/>
+          <w:iCs/>
+        </w:rPr>
+        <w:lastRenderedPageBreak/>
+        <w:t>Individual Differences, 38</w:t>
+      </w:r>
+      <w:r>
+        <w:t>(7)</w:t>
+      </w:r>
+      <w:r>
+        <w:t>, 1571–1582. https://doi.org/10.1016/j.paid.2004.09.016</w:t>
+      </w:r>
+    </w:p>
+    <w:p>
+      <w:pPr>
+        <w:ind w:left="720" w:hanging="720"/>
+      </w:pPr>
+      <w:r>
+        <w:t xml:space="preserve">Lee, K., Ashton, M. C., &amp; de Vries, R. E. (2005). Predicting workplace delinquency and integrity with the HEXACO and Five-Factor Models of personality structure. </w:t>
+      </w:r>
+      <w:r>
+        <w:rPr>
+          <w:i/>
+          <w:iCs/>
+        </w:rPr>
+        <w:t>Human Performance, 18</w:t>
+      </w:r>
+      <w:r>
+        <w:t>(2)</w:t>
+      </w:r>
+      <w:r>
+        <w:t>, 179-197. https://doi.org/10.1207/s15327043hup1802_4</w:t>
+      </w:r>
+    </w:p>
+    <w:p>
+      <w:pPr>
+        <w:ind w:left="720" w:hanging="720"/>
+      </w:pPr>
+      <w:r>
+        <w:t xml:space="preserve">Lee, K., Ashton, M. C., Ogunfowora, B., Bourdage, J. S., &amp; Shin, K. H. (2010). The personality bases of socio-political attitudes: The role of honesty-humility and openness to experience. </w:t>
+      </w:r>
+      <w:r>
+        <w:rPr>
+          <w:i/>
+          <w:iCs/>
+        </w:rPr>
+        <w:t>Journal of Research in Personality, 44</w:t>
+      </w:r>
+      <w:r>
+        <w:t>(1)</w:t>
+      </w:r>
+      <w:r>
+        <w:t>, 115-119. https://doi.org/10.1016/j.jrp.2009.08.007</w:t>
+      </w:r>
+    </w:p>
+    <w:p>
+      <w:pPr>
+        <w:ind w:left="720" w:hanging="720"/>
+      </w:pPr>
+      <w:r>
+        <w:t xml:space="preserve">Lee, K., Ashton, M. C., Wiltshire, J., Bourdage, J. S., Visser, B. A., &amp; Gallucci, A. (2013). Sex, power, and money: Prediction from the Dark Triad and honesty-humility. </w:t>
+      </w:r>
+      <w:r>
+        <w:rPr>
+          <w:i/>
+          <w:iCs/>
+        </w:rPr>
+        <w:t>European Journal of Personality, 27</w:t>
+      </w:r>
+      <w:r>
+        <w:t>(2)</w:t>
+      </w:r>
+      <w:r>
+        <w:t>, 169-184. https://doi.org/10.1002/per.1860</w:t>
+      </w:r>
+    </w:p>
+    <w:p>
+      <w:pPr>
+        <w:ind w:left="720" w:hanging="720"/>
+      </w:pPr>
+      <w:r>
+        <w:t xml:space="preserve">Lee, K., Ashton, M. C., Griep, Y., &amp; Edmonds, M. (2018). Personality, religion, and politics: An investigation in 33 countries. </w:t>
+      </w:r>
+      <w:r>
+        <w:rPr>
+          <w:i/>
+          <w:iCs/>
+        </w:rPr>
+        <w:t>European Journal of Personality, 32</w:t>
+      </w:r>
+      <w:r>
+        <w:t>(2)</w:t>
+      </w:r>
+      <w:r>
+        <w:t>, 100-115. https://doi.org/10.1002/per.2142</w:t>
+      </w:r>
+    </w:p>
+    <w:p>
+      <w:pPr>
+        <w:ind w:left="720" w:hanging="720"/>
+      </w:pPr>
+      <w:r>
+        <w:t xml:space="preserve">Lee, Y., Berry, C. M., &amp; Gonzalez-Mule, E. (2019). The importance of being humble: A meta-analysis and incremental validity analysis of the relationship between honesty-humility and job performance. </w:t>
+      </w:r>
+      <w:r>
+        <w:rPr>
+          <w:i/>
+          <w:iCs/>
+        </w:rPr>
+        <w:t>Journal of Applied Psychology, 104</w:t>
       </w:r>
       <w:r>
         <w:t>(12)</w:t>
       </w:r>
       <w:r>
-        <w:t>, 1663–1676. https://doi.org/10.1177/0146167208324101</w:t>
-      </w:r>
-    </w:p>
-    <w:p>
-      <w:pPr>
-        <w:ind w:left="720" w:hanging="720"/>
-      </w:pPr>
-      <w:r>
-        <w:t xml:space="preserve">Bushman, B. J., &amp; Baumeister, R. F. (1998). Threatened egotism, narcissism, self-esteem, and direct and displaced aggression: Does self-love or self-hate lead to violence? </w:t>
-      </w:r>
-      <w:r>
-        <w:rPr>
-          <w:i/>
-          <w:iCs/>
-        </w:rPr>
-        <w:t>Journal of Personality and Social Psychology, 75</w:t>
+        <w:t>, 1535–1546. https://doi.org/10.1037/apl0000421</w:t>
+      </w:r>
+    </w:p>
+    <w:p>
+      <w:pPr>
+        <w:ind w:left="720" w:hanging="720"/>
+      </w:pPr>
+      <w:r>
+        <w:t>Lynam, D. R., &amp; Derefinko, K. J. (2006). Psychopathy and personality. In C. J. Patrick (Ed.), Handbook of psychopathy (pp. 133–155). Guilford Press.</w:t>
+      </w:r>
+    </w:p>
+    <w:p>
+      <w:pPr>
+        <w:ind w:left="720" w:hanging="720"/>
+      </w:pPr>
+      <w:r>
+        <w:t>Machiha, M. M., &amp; Brew, G. (2019). Predictors of Work Engagement Among University Teachers: The Role of Personality and Perceived Organisational Support. (Dissertation). Retrieved from https://urn.kb.se/resolve?urn=urn:nbn:se:lnu:diva-84767</w:t>
+      </w:r>
+    </w:p>
+    <w:p>
+      <w:pPr>
+        <w:ind w:left="720" w:hanging="720"/>
+      </w:pPr>
+      <w:r>
+        <w:lastRenderedPageBreak/>
+        <w:t xml:space="preserve">Maslach, C., &amp; Leiter, M. P. (2016). Understanding the burnout experience: Recent research and its implications for psychiatry. </w:t>
+      </w:r>
+      <w:r>
+        <w:rPr>
+          <w:i/>
+          <w:iCs/>
+        </w:rPr>
+        <w:t>World Psychiatry, 15</w:t>
+      </w:r>
+      <w:r>
+        <w:t>(2)</w:t>
+      </w:r>
+      <w:r>
+        <w:t xml:space="preserve">, 103-111. </w:t>
+      </w:r>
+      <w:r>
+        <w:t>https://doi.org/</w:t>
+      </w:r>
+      <w:r>
+        <w:t>10.1002/wps.20311</w:t>
+      </w:r>
+    </w:p>
+    <w:p>
+      <w:pPr>
+        <w:ind w:left="720" w:hanging="720"/>
+      </w:pPr>
+      <w:r>
+        <w:t xml:space="preserve">Masui, K., &amp; Ura, M. (2018). Adaptive strategies of “dark” individuals. </w:t>
+      </w:r>
+      <w:r>
+        <w:rPr>
+          <w:i/>
+          <w:iCs/>
+        </w:rPr>
+        <w:t>Japanese Psychological Review, 61</w:t>
+      </w:r>
+      <w:r>
+        <w:t>(3)</w:t>
+      </w:r>
+      <w:r>
+        <w:t>, 330-343. https://doi.org/10.24602/sjpr.61.3_330</w:t>
+      </w:r>
+      <w:r>
+        <w:rPr>
+          <w:rFonts w:hint="eastAsia"/>
+        </w:rPr>
+        <w:t xml:space="preserve"> (in Japanese</w:t>
+      </w:r>
+      <w:r>
+        <w:rPr>
+          <w:rFonts w:hint="eastAsia"/>
+        </w:rPr>
+        <w:t>.</w:t>
+      </w:r>
+      <w:r>
+        <w:rPr>
+          <w:rFonts w:hint="eastAsia"/>
+        </w:rPr>
+        <w:t>)</w:t>
+      </w:r>
+    </w:p>
+    <w:p>
+      <w:pPr>
+        <w:ind w:left="720" w:hanging="720"/>
+      </w:pPr>
+      <w:r>
+        <w:t xml:space="preserve">Mathieu, C., Hare, R. D., Jones, D. N., Babiak, P., &amp; Neumann, C. S. (2013). Factor structure of the B-Scan 360: A measure of corporate psychopathy. </w:t>
+      </w:r>
+      <w:r>
+        <w:rPr>
+          <w:i/>
+          <w:iCs/>
+        </w:rPr>
+        <w:t>Psychological Assessment, 25</w:t>
       </w:r>
       <w:r>
         <w:t>(1)</w:t>
       </w:r>
       <w:r>
-        <w:t>, 219–229. https://doi.org/10.1037/0022-3514.75.1.219</w:t>
-      </w:r>
-    </w:p>
-    <w:p>
-      <w:pPr>
-        <w:ind w:left="720" w:hanging="720"/>
-      </w:pPr>
-      <w:r>
-        <w:t xml:space="preserve">Bushman, B. J., Bonacci, A. M., van Dijk, M., &amp; Baumeister, R. F. (2003). Narcissism, sexual refusal, and aggression: Testing a narcissistic reactance model of sexual coercion. </w:t>
-      </w:r>
-      <w:r>
-        <w:rPr>
-          <w:i/>
-          <w:iCs/>
-        </w:rPr>
-        <w:t>Journal of Personality and Social Psychology, 84</w:t>
+        <w:t>, 288–293. https://doi.org/10.1037/a0029262</w:t>
+      </w:r>
+    </w:p>
+    <w:p>
+      <w:pPr>
+        <w:ind w:left="720" w:hanging="720"/>
+      </w:pPr>
+      <w:r>
+        <w:t xml:space="preserve">McDaniel, M. A., Hartman, N. S., Whetzel, D. L., &amp; Grubb, W. L. III. (2007). Situational judgment tests, response instructions, and validity: A meta-analysis. </w:t>
+      </w:r>
+      <w:r>
+        <w:rPr>
+          <w:i/>
+          <w:iCs/>
+        </w:rPr>
+        <w:t>Personnel Psychology, 60</w:t>
+      </w:r>
+      <w:r>
+        <w:t>(1)</w:t>
+      </w:r>
+      <w:r>
+        <w:t>, 63-91. https://doi.org/10.1111/j.1744-6570.2007.00065.x</w:t>
+      </w:r>
+    </w:p>
+    <w:p>
+      <w:pPr>
+        <w:ind w:left="720" w:hanging="720"/>
+      </w:pPr>
+      <w:r>
+        <w:t xml:space="preserve">McHoskey J. (1995). Narcissism and Machiavellianism. </w:t>
+      </w:r>
+      <w:r>
+        <w:rPr>
+          <w:i/>
+          <w:iCs/>
+        </w:rPr>
+        <w:t>Psychological reports, 77</w:t>
+      </w:r>
+      <w:r>
+        <w:t>(3 Pt 1)</w:t>
+      </w:r>
+      <w:r>
+        <w:t>, 755–759. https://doi.org/10.2466/pr0.1995.77.3.755</w:t>
+      </w:r>
+    </w:p>
+    <w:p>
+      <w:pPr>
+        <w:ind w:left="720" w:hanging="720"/>
+      </w:pPr>
+      <w:r>
+        <w:t xml:space="preserve">Miao, C., Wang, G., Shen, H., &amp; Wang, M. (2023). Effects of Big Five, HEXACO, and Dark Triad on counterproductive work behaviors: A meta-analysis. </w:t>
+      </w:r>
+      <w:r>
+        <w:rPr>
+          <w:i/>
+          <w:iCs/>
+        </w:rPr>
+        <w:t>International Journal of Mental Health Promotion, 25</w:t>
+      </w:r>
+      <w:r>
+        <w:t>(3)</w:t>
+      </w:r>
+      <w:r>
+        <w:t>, 357-374. https://doi.org/10.32604/ijmhp.2023.027950</w:t>
+      </w:r>
+    </w:p>
+    <w:p>
+      <w:pPr>
+        <w:ind w:left="720" w:hanging="720"/>
+      </w:pPr>
+      <w:r>
+        <w:t xml:space="preserve">Miller, J. D., &amp; Campbell, W. K. (2008). Comparing clinical and social-personality conceptualizations of narcissism. </w:t>
+      </w:r>
+      <w:r>
+        <w:rPr>
+          <w:i/>
+          <w:iCs/>
+        </w:rPr>
+        <w:t>Journal of personality, 76</w:t>
+      </w:r>
+      <w:r>
+        <w:t>(3)</w:t>
+      </w:r>
+      <w:r>
+        <w:t>, 449–476. https://doi.org/10.1111/j.1467-6494.2008.00492.x</w:t>
+      </w:r>
+    </w:p>
+    <w:p>
+      <w:pPr>
+        <w:ind w:left="720" w:hanging="720"/>
+      </w:pPr>
+      <w:r>
+        <w:t xml:space="preserve">Morales, N. A. (2020). Gender and the HEXACO model of personality: Meta-analysis, measurement equivalence, and specification of agency as a core construct of investment (Master’s thesis). </w:t>
+      </w:r>
+      <w:r>
+        <w:rPr>
+          <w:i/>
+          <w:iCs/>
+        </w:rPr>
+        <w:t>University of Illinois at Urbana-Champaign</w:t>
+      </w:r>
+      <w:r>
+        <w:t>. http://hdl.handle.net/2142/108140</w:t>
+      </w:r>
+    </w:p>
+    <w:p>
+      <w:pPr>
+        <w:ind w:left="720" w:hanging="720"/>
+      </w:pPr>
+      <w:r>
+        <w:lastRenderedPageBreak/>
+        <w:t xml:space="preserve">Morf, C. C., &amp; Rhodewalt, F. (2001). Unraveling the paradoxes of narcissism: A dynamic self-regulatory processing model. </w:t>
+      </w:r>
+      <w:r>
+        <w:rPr>
+          <w:i/>
+          <w:iCs/>
+        </w:rPr>
+        <w:t>Psychological Inquiry, 12</w:t>
+      </w:r>
+      <w:r>
+        <w:t>(4)</w:t>
+      </w:r>
+      <w:r>
+        <w:t>, 177–196. https://doi.org/10.1207/S15327965PLI1204_1</w:t>
+      </w:r>
+    </w:p>
+    <w:p>
+      <w:pPr>
+        <w:ind w:left="720" w:hanging="720"/>
+      </w:pPr>
+      <w:r>
+        <w:t xml:space="preserve">Moshagen, M., Hilbig, B. E., &amp; Zettler, I. (2018). The dark core of personality. </w:t>
+      </w:r>
+      <w:r>
+        <w:rPr>
+          <w:i/>
+          <w:iCs/>
+        </w:rPr>
+        <w:t>Psychological Review, 125</w:t>
       </w:r>
       <w:r>
         <w:t>(5)</w:t>
       </w:r>
       <w:r>
-        <w:t>, 1027–1040. https://doi.org/10.1037/0022-3514.84.5.1027</w:t>
-      </w:r>
-    </w:p>
-    <w:p>
-      <w:pPr>
-        <w:ind w:left="720" w:hanging="720"/>
-      </w:pPr>
-      <w:r>
-        <w:t xml:space="preserve">Byrne, B. M., &amp; Campbell, T. L. (1999). Cross-cultural comparisons and the presumption of equivalent measurement and theoretical structure: A look beneath the surface. </w:t>
-      </w:r>
-      <w:r>
-        <w:rPr>
-          <w:i/>
-          <w:iCs/>
-        </w:rPr>
+        <w:t>, 656–688. https://doi.org/10.1037/rev0000111</w:t>
+      </w:r>
+    </w:p>
+    <w:p>
+      <w:pPr>
+        <w:ind w:left="720" w:hanging="720"/>
+      </w:pPr>
+      <w:r>
+        <w:t xml:space="preserve">Moshagen, Morten &amp; Thielmann, Isabel &amp; Hilbig, Benjamin &amp; Zettler, Ingo. (2019). Meta-Analytic Investigations of the HEXACO Personality Inventory(-Revised). </w:t>
+      </w:r>
+      <w:r>
+        <w:rPr>
+          <w:i/>
+          <w:iCs/>
+        </w:rPr>
+        <w:t>Zeitschrift für Psychologie. 227</w:t>
+      </w:r>
+      <w:r>
+        <w:t xml:space="preserve">. 186-194. </w:t>
+      </w:r>
+      <w:r>
+        <w:t>https://doi.org/</w:t>
+      </w:r>
+      <w:r>
+        <w:t>10.1027/2151-2604/a000377</w:t>
+      </w:r>
+    </w:p>
+    <w:p>
+      <w:pPr>
+        <w:ind w:left="720" w:hanging="720"/>
+      </w:pPr>
+      <w:r>
+        <w:t xml:space="preserve">Muris, P., Merckelbach, H., Otgaar, H., &amp; Meijer, E. (2017). The malevolent side of human nature: A meta-analysis and critical review of the literature on the dark triad (narcissism, Machiavellianism, and psychopathy). </w:t>
+      </w:r>
+      <w:r>
+        <w:rPr>
+          <w:i/>
+          <w:iCs/>
+        </w:rPr>
+        <w:t>Perspectives on Psychological Science, 12</w:t>
+      </w:r>
+      <w:r>
+        <w:t>(2)</w:t>
+      </w:r>
+      <w:r>
+        <w:t>, 183–204. https://doi.org/10.1177/1745691616666070</w:t>
+      </w:r>
+    </w:p>
+    <w:p>
+      <w:pPr>
+        <w:ind w:left="720" w:hanging="720"/>
+      </w:pPr>
+      <w:r>
+        <w:t xml:space="preserve">Neumann, C. S., &amp; Hare, R. D. (2008). Psychopathic traits in a large community sample: Links to violence, alcohol use, and intelligence. </w:t>
+      </w:r>
+      <w:r>
+        <w:rPr>
+          <w:i/>
+          <w:iCs/>
+        </w:rPr>
+        <w:t>Journal of Consulting and Clinical Psychology, 76</w:t>
+      </w:r>
+      <w:r>
+        <w:t>(5)</w:t>
+      </w:r>
+      <w:r>
+        <w:t>, 893–899. https://doi.org/10.1037/0022-006X.76.5.893</w:t>
+      </w:r>
+    </w:p>
+    <w:p>
+      <w:pPr>
+        <w:ind w:left="720" w:hanging="720"/>
+      </w:pPr>
+      <w:r>
+        <w:t xml:space="preserve">O’Boyle, E. H., Forsyth, D. R., Banks, G. C., &amp; McDaniel, M. A. (2012). A meta-analysis of the Dark Triad and work behavior: A social exchange perspective. </w:t>
+      </w:r>
+      <w:r>
+        <w:rPr>
+          <w:i/>
+          <w:iCs/>
+        </w:rPr>
+        <w:t>Journal of Applied Psychology, 97</w:t>
+      </w:r>
+      <w:r>
+        <w:t>(3)</w:t>
+      </w:r>
+      <w:r>
+        <w:t>, 557-579. https://doi.org/10.1037/a0025679</w:t>
+      </w:r>
+    </w:p>
+    <w:p>
+      <w:pPr>
+        <w:ind w:left="720" w:hanging="720"/>
+      </w:pPr>
+      <w:r>
+        <w:t xml:space="preserve">Oda, R., &amp; Matsumoto-Oda, A. (2022). HEXACO, Dark Triad and altruism in daily life. </w:t>
+      </w:r>
+      <w:r>
+        <w:rPr>
+          <w:i/>
+          <w:iCs/>
+        </w:rPr>
+        <w:t>Personality and Individual Differences, 185</w:t>
+      </w:r>
+      <w:r>
+        <w:t>, 111303. https://doi.org/10.1016/j.paid.2021.111303</w:t>
+      </w:r>
+    </w:p>
+    <w:p>
+      <w:pPr>
+        <w:ind w:left="720" w:hanging="720"/>
+      </w:pPr>
+      <w:r>
+        <w:t xml:space="preserve">Oostrom, J. K., de Vries, R. E., &amp; de Wit, M. (2019). Development and validation of a HEXACO situational judgment test. </w:t>
+      </w:r>
+      <w:r>
+        <w:rPr>
+          <w:i/>
+          <w:iCs/>
+        </w:rPr>
+        <w:t>Human Performance, 32</w:t>
+      </w:r>
+      <w:r>
+        <w:t>(1)</w:t>
+      </w:r>
+      <w:r>
+        <w:t>, 1-29. https://doi.org/10.1080/08959285.2018.1539856</w:t>
+      </w:r>
+    </w:p>
+    <w:p>
+      <w:pPr>
+        <w:ind w:left="720" w:hanging="720"/>
+      </w:pPr>
+      <w:r>
+        <w:t xml:space="preserve">Ozer, D. J., &amp; Benet-Martínez, V. (2006). Personality and the prediction of consequential </w:t>
+      </w:r>
+      <w:r>
         <w:lastRenderedPageBreak/>
-        <w:t>Journal of Cross-Cultural Psychology, 30</w:t>
-      </w:r>
-      <w:r>
-        <w:t>(5)</w:t>
-      </w:r>
-      <w:r>
-        <w:t>, 555–574. https://doi.org/10.1177/0022022199030005001</w:t>
-      </w:r>
-    </w:p>
-    <w:p>
-      <w:pPr>
-        <w:ind w:left="720" w:hanging="720"/>
-      </w:pPr>
-      <w:r>
-        <w:t xml:space="preserve">Campbell, W. K., Rudich, E. A., &amp; Sedikides, C. (2002). Narcissism, self-esteem, and the positivity of self-views: Two portraits of self-love. </w:t>
-      </w:r>
-      <w:r>
-        <w:rPr>
-          <w:i/>
-          <w:iCs/>
-        </w:rPr>
-        <w:t>Personality and Social Psychology Bulletin, 28</w:t>
+        <w:t xml:space="preserve">outcomes. </w:t>
+      </w:r>
+      <w:r>
+        <w:rPr>
+          <w:i/>
+          <w:iCs/>
+        </w:rPr>
+        <w:t>Annual review of psychology, 57</w:t>
+      </w:r>
+      <w:r>
+        <w:t>, 401–421. https://doi.org/10.1146/annurev.psych.57.102904.190127</w:t>
+      </w:r>
+    </w:p>
+    <w:p>
+      <w:pPr>
+        <w:ind w:left="720" w:hanging="720"/>
+      </w:pPr>
+      <w:r>
+        <w:t>Paulhus, D. L. (2001). Normal narcissism: Two minimalist accounts. Psychological Inquiry, 12(4), 228–230. https://doi.org/10.1207/S15327965PLI1204_5</w:t>
+      </w:r>
+    </w:p>
+    <w:p>
+      <w:pPr>
+        <w:ind w:left="720" w:hanging="720"/>
+      </w:pPr>
+      <w:r>
+        <w:t xml:space="preserve">Paulhus, D. L., &amp; Williams, K. M. (2002). The Dark Triad of personality: Narcissism, Machiavellianism and psychopathy. </w:t>
+      </w:r>
+      <w:r>
+        <w:rPr>
+          <w:i/>
+          <w:iCs/>
+        </w:rPr>
+        <w:t>Journal of Research in Personality, 36</w:t>
+      </w:r>
+      <w:r>
+        <w:t>(6)</w:t>
+      </w:r>
+      <w:r>
+        <w:t>, 556–563. https://doi.org/10.1016/S0092-6566(02)00505-6</w:t>
+      </w:r>
+    </w:p>
+    <w:p>
+      <w:pPr>
+        <w:ind w:left="720" w:hanging="720"/>
+      </w:pPr>
+      <w:r>
+        <w:t xml:space="preserve">Pletzer, J. L., Bentvelzen, M., Oostrom, J. K., &amp; de Vries, R. E. (2019a). Comparing domain- and facet-level relations of the HEXACO personality model with workplace deviance: A meta-analysis. </w:t>
+      </w:r>
+      <w:r>
+        <w:rPr>
+          <w:i/>
+          <w:iCs/>
+        </w:rPr>
+        <w:t>Personality and Individual Differences, 152</w:t>
       </w:r>
       <w:r>
         <w:t>(3)</w:t>
       </w:r>
       <w:r>
-        <w:t>, 358–368. https://doi.org/10.1177/0146167202286007</w:t>
-      </w:r>
-    </w:p>
-    <w:p>
-      <w:pPr>
-        <w:ind w:left="720" w:hanging="720"/>
-      </w:pPr>
-      <w:r>
-        <w:t xml:space="preserve">Chatterjee, A., &amp; Hambrick, D. C. (2007). It’s all about me: Narcissistic chief executive officers and their effects on company strategy and performance. </w:t>
-      </w:r>
-      <w:r>
-        <w:rPr>
-          <w:i/>
-          <w:iCs/>
-        </w:rPr>
-        <w:t>Administrative Science Quarterly, 52</w:t>
-      </w:r>
-      <w:r>
-        <w:t>(3)</w:t>
-      </w:r>
-      <w:r>
-        <w:t>, 351-386. https://doi.org/10.2189/asqu.52.3.351</w:t>
-      </w:r>
-    </w:p>
-    <w:p>
-      <w:pPr>
-        <w:ind w:left="720" w:hanging="720"/>
-      </w:pPr>
-      <w:r>
-        <w:t xml:space="preserve">Cherniss, C., &amp; Goleman, D. (Eds.). (2001). The emotionally intelligent workplace: How to select for, measure, and improve emotional intelligence in individuals, groups, and organizations. Jossey-Bass.</w:t>
-      </w:r>
-    </w:p>
-    <w:p>
-      <w:pPr>
-        <w:ind w:left="720" w:hanging="720"/>
-      </w:pPr>
-      <w:r>
-        <w:rPr>
-          <w:rFonts w:hint="eastAsia"/>
-        </w:rPr>
-        <w:t>Christian, M. S., Edwards, B. D., &amp; Bradley, J. C. (2010). Situational judgment tests: Constructs assessed and a meta</w:t>
-      </w:r>
-      <w:r>
-        <w:rPr>
-          <w:rFonts w:hint="eastAsia"/>
-        </w:rPr>
-        <w:t>‐</w:t>
-      </w:r>
-      <w:r>
-        <w:rPr>
-          <w:rFonts w:hint="eastAsia"/>
-        </w:rPr>
-        <w:t>analysis of their criterion</w:t>
-      </w:r>
-      <w:r>
-        <w:rPr>
-          <w:rFonts w:hint="eastAsia"/>
-        </w:rPr>
-        <w:t>‐</w:t>
-      </w:r>
-      <w:r>
-        <w:rPr>
-          <w:rFonts w:hint="eastAsia"/>
-        </w:rPr>
-        <w:t xml:space="preserve">related validities. </w:t>
-      </w:r>
-      <w:r>
-        <w:rPr>
-          <w:rFonts w:hint="eastAsia"/>
-          <w:i/>
-          <w:iCs/>
-        </w:rPr>
-        <w:t>Personnel Psychology, 63</w:t>
-      </w:r>
-      <w:r>
-        <w:rPr>
-          <w:rFonts w:hint="eastAsia"/>
-        </w:rPr>
-        <w:t>(1)</w:t>
-      </w:r>
-      <w:r>
-        <w:rPr>
-          <w:rFonts w:hint="eastAsia"/>
-        </w:rPr>
-        <w:t>, 83-117. https://doi.org/10.1111/j.1744-6570.2009.01163.x</w:t>
-      </w:r>
-    </w:p>
-    <w:p>
-      <w:pPr>
-        <w:ind w:left="720" w:hanging="720"/>
-      </w:pPr>
-      <w:r>
-        <w:t xml:space="preserve">Christie, R., &amp; Geis, F. L. (1970). Studies in Machiavellianism. Academic Press.</w:t>
-      </w:r>
-    </w:p>
-    <w:p>
-      <w:pPr>
-        <w:ind w:left="720" w:hanging="720"/>
-      </w:pPr>
-      <w:r>
-        <w:t xml:space="preserve">Cleckley, H. (1941). The mask of sanity: An attempt to clarify some issues about the so-called psychopathic personality. C. V. Mosby.</w:t>
-      </w:r>
-    </w:p>
-    <w:p>
-      <w:pPr>
-        <w:ind w:left="720" w:hanging="720"/>
-      </w:pPr>
-      <w:r>
-        <w:t xml:space="preserve">Cohen, J. (1988). </w:t>
-      </w:r>
-      <w:r>
-        <w:rPr>
-          <w:i/>
-          <w:iCs/>
-        </w:rPr>
-        <w:t>Statistical Power Analysis for the Behavioral Sciences</w:t>
-      </w:r>
-      <w:r>
-        <w:t xml:space="preserve"> (2nd ed.). Routledge. https://doi.org/10.4324/9780203771587</w:t>
-      </w:r>
-    </w:p>
-    <w:p>
-      <w:pPr>
-        <w:ind w:left="720" w:hanging="720"/>
-      </w:pPr>
-      <w:r>
-        <w:t xml:space="preserve">Conger, J. A. (1999). Charismatic and transformational leadership in organizations: An insider's perspective on these developing streams of research. </w:t>
-      </w:r>
-      <w:r>
-        <w:rPr>
-          <w:i/>
-          <w:iCs/>
-        </w:rPr>
-        <w:t>Leadership Quarterly, 10</w:t>
+        <w:t>, 109539. https://doi.org/10.1016/j.paid.2019.109539</w:t>
+      </w:r>
+    </w:p>
+    <w:p>
+      <w:pPr>
+        <w:ind w:left="720" w:hanging="720"/>
+      </w:pPr>
+      <w:r>
+        <w:t xml:space="preserve">Pletzer, J. L., Bentvelzen, M., Oostrom, J. K., &amp; de Vries, R. E. (2019b). A meta-analysis of the relations between personality and workplace deviance: Big Five versus HEXACO. </w:t>
+      </w:r>
+      <w:r>
+        <w:rPr>
+          <w:i/>
+          <w:iCs/>
+        </w:rPr>
+        <w:t>Journal of Vocational Behavior, 112</w:t>
+      </w:r>
+      <w:r>
+        <w:t>, 369–383. https://doi.org/10.1016/j.jvb.2019.04.004</w:t>
+      </w:r>
+    </w:p>
+    <w:p>
+      <w:pPr>
+        <w:ind w:left="720" w:hanging="720"/>
+      </w:pPr>
+      <w:r>
+        <w:t xml:space="preserve">Pletzer, J. L., Oostrom, J. K., &amp; de Vries, R. E. (2021). HEXACO personality and organizational citizenship behavior: A domain- and facet-level meta-analysis. </w:t>
+      </w:r>
+      <w:r>
+        <w:rPr>
+          <w:i/>
+          <w:iCs/>
+        </w:rPr>
+        <w:t>Human Performance, 34</w:t>
       </w:r>
       <w:r>
         <w:t>(2)</w:t>
       </w:r>
       <w:r>
-        <w:t>, 145–179. https://doi.org/10.1016/S1048-9843(99)00012-0</w:t>
-      </w:r>
-    </w:p>
-    <w:p>
-      <w:pPr>
-        <w:ind w:left="720" w:hanging="720"/>
-      </w:pPr>
-      <w:r>
-        <w:t xml:space="preserve">Costa, P. T., Jr., Terracciano, A., &amp; McCrae, R. R. (2001). Gender differences in personality traits across cultures: Robust and surprising findings. </w:t>
-      </w:r>
-      <w:r>
-        <w:rPr>
-          <w:i/>
-          <w:iCs/>
-        </w:rPr>
-        <w:t>Journal of Personality and Social Psychology, 81</w:t>
-      </w:r>
-      <w:r>
-        <w:t>(2)</w:t>
-      </w:r>
-      <w:r>
-        <w:t>, 322–331. https://doi.org/10.1037/0022-3514.81.2.322</w:t>
-      </w:r>
-    </w:p>
-    <w:p>
-      <w:pPr>
-        <w:ind w:left="720" w:hanging="720"/>
-      </w:pPr>
-      <w:proofErr w:type="spellStart"/>
-      <w:r>
-        <w:t>Dåderman</w:t>
-      </w:r>
-      <w:proofErr w:type="spellEnd"/>
-      <w:r>
-        <w:t xml:space="preserve">, A. M., &amp; </w:t>
-      </w:r>
-      <w:proofErr w:type="spellStart"/>
-      <w:r>
-        <w:t>Ragnestål</w:t>
-      </w:r>
-      <w:proofErr w:type="spellEnd"/>
-      <w:r>
-        <w:t xml:space="preserve">-Impola, C. (2019). Workplace bullies, not their victims, score high on the Dark Triad and Extraversion, and low on Agreeableness and Honesty-Humility. </w:t>
-      </w:r>
-      <w:proofErr w:type="spellStart"/>
-      <w:r>
-        <w:rPr>
-          <w:i/>
-          <w:iCs/>
-        </w:rPr>
-        <w:t>Heliyon</w:t>
-      </w:r>
-      <w:proofErr w:type="spellEnd"/>
-      <w:r>
-        <w:rPr>
-          <w:i/>
-          <w:iCs/>
-        </w:rPr>
-        <w:t>, 5</w:t>
-      </w:r>
-      <w:r>
-        <w:t>(10)</w:t>
-      </w:r>
-      <w:r>
-        <w:t>, e02609. https://doi.org/10.1016/j.heliyon.2019.e02609</w:t>
-      </w:r>
-    </w:p>
-    <w:p>
-      <w:pPr>
-        <w:ind w:left="720" w:hanging="720"/>
-      </w:pPr>
-      <w:r>
-        <w:t xml:space="preserve">De Hoogh, A. H. B., &amp; Den Hartog, D. N. (2008). Ethical and despotic leadership, relationships with leader's social responsibility, top management team effectiveness </w:t>
-      </w:r>
-      <w:r>
-        <w:lastRenderedPageBreak/>
-        <w:t xml:space="preserve">and subordinates' optimism: A multi-method study. </w:t>
-      </w:r>
-      <w:r>
-        <w:rPr>
-          <w:i/>
-          <w:iCs/>
-        </w:rPr>
-        <w:t>Leadership Quarterly, 19</w:t>
-      </w:r>
-      <w:r>
-        <w:t>(3)</w:t>
-      </w:r>
-      <w:r>
-        <w:t>, 297–311. https://doi.org/10.1016/j.leaqua.2008.03.002</w:t>
-      </w:r>
-    </w:p>
-    <w:p>
-      <w:pPr>
-        <w:ind w:left="720" w:hanging="720"/>
-      </w:pPr>
-      <w:r>
-        <w:t xml:space="preserve">de Vries, R. E. (2012). Personality predictors of leadership styles and the self–other agreement problem. </w:t>
-      </w:r>
-      <w:r>
-        <w:rPr>
-          <w:i/>
-          <w:iCs/>
-        </w:rPr>
-        <w:t>Leadership Quarterly, 23</w:t>
-      </w:r>
-      <w:r>
-        <w:t>(5)</w:t>
-      </w:r>
-      <w:r>
-        <w:t>, 809–821. https://doi.org/10.1016/j.leaqua.2012.03.002</w:t>
-      </w:r>
-    </w:p>
-    <w:p>
-      <w:pPr>
-        <w:ind w:left="720" w:hanging="720"/>
-      </w:pPr>
-      <w:r>
-        <w:t xml:space="preserve">Einarsen, S., Aasland, M. S., &amp; Skogstad, A. (2007). Destructive leadership behavior: A definition and conceptual model. </w:t>
-      </w:r>
-      <w:r>
-        <w:rPr>
-          <w:i/>
-          <w:iCs/>
-        </w:rPr>
-        <w:t>Leadership Quarterly, 18</w:t>
-      </w:r>
-      <w:r>
-        <w:t xml:space="preserve">, 207-216. </w:t>
-      </w:r>
-      <w:r>
-        <w:t>https://doi.org/</w:t>
-      </w:r>
-      <w:r>
-        <w:t>10.1016/j.leaqua.2007.03.002</w:t>
-      </w:r>
-    </w:p>
-    <w:p>
-      <w:pPr>
-        <w:ind w:left="720" w:hanging="720"/>
-      </w:pPr>
-      <w:r>
-        <w:t xml:space="preserve">Fehr, B., Samsom, D., &amp; Paulhus, D. L. (1992). The construct of Machiavellianism: Twenty years later. In C. D. Spielberger &amp; J. N. Butcher (Eds.), Advances in personality assessment (Vol. 9, pp. 77–116). Lawrence Erlbaum.</w:t>
-      </w:r>
-    </w:p>
-    <w:p>
-      <w:pPr>
-        <w:ind w:left="720" w:hanging="720"/>
-      </w:pPr>
-      <w:r>
-        <w:t xml:space="preserve">Fukui, Y., Oura, S., Matsuo, K., Inagaki (Fujii), T., &amp; Shima, Y. (2017). Development of the Japanese version of MET-CORE2 for objective measurement of empathy. </w:t>
-      </w:r>
-      <w:r>
-        <w:rPr>
-          <w:i/>
-          <w:iCs/>
-        </w:rPr>
-        <w:t>Japanese Journal of Research on Emotions, 25</w:t>
-      </w:r>
-      <w:r>
-        <w:t>(Supplement)</w:t>
-      </w:r>
-      <w:r>
-        <w:t>, ps01. https://doi.org/10.4092/jsre.25.Supplement_ps01</w:t>
-      </w:r>
-      <w:r>
-        <w:rPr>
-          <w:rFonts w:hint="eastAsia"/>
-        </w:rPr>
-        <w:t xml:space="preserve"> (in Japanese</w:t>
-      </w:r>
-      <w:r>
-        <w:rPr>
-          <w:rFonts w:hint="eastAsia"/>
-        </w:rPr>
-        <w:t>.</w:t>
-      </w:r>
-      <w:r>
-        <w:rPr>
-          <w:rFonts w:hint="eastAsia"/>
-        </w:rPr>
-        <w:t>)</w:t>
-      </w:r>
-    </w:p>
-    <w:p>
-      <w:pPr>
-        <w:ind w:left="720" w:hanging="720"/>
-      </w:pPr>
-      <w:r>
-        <w:t xml:space="preserve">Fukui, Y., Matsuo, K., Oura, S., Inagaki, T., &amp; Shima, Y. (2018). Re-examination of the convergent validity of the Japanese version of MET-CORE2 for objective measurement of empathy. </w:t>
-      </w:r>
-      <w:r>
-        <w:rPr>
-          <w:i/>
-          <w:iCs/>
-        </w:rPr>
-        <w:t>Japanese Journal of Research on Emotions, 26</w:t>
-      </w:r>
-      <w:r>
-        <w:t>(Supplement)</w:t>
-      </w:r>
-      <w:r>
-        <w:t>, ps43. https://doi.org/10.4092/jsre.26.Supplement_ps43</w:t>
-      </w:r>
-      <w:r>
-        <w:rPr>
-          <w:rFonts w:hint="eastAsia"/>
-        </w:rPr>
-        <w:t xml:space="preserve"> (in Japanese.)</w:t>
-      </w:r>
-    </w:p>
-    <w:p>
-      <w:pPr>
-        <w:ind w:left="720" w:hanging="720"/>
-      </w:pPr>
-      <w:r>
-        <w:t xml:space="preserve">Gandolfi, F., Stone, S., &amp; Deno, F. (2017). Servant leadership: An ancient style with 21st century relevance. Review of International Comparative Management, 18(4), 350–361.</w:t>
-      </w:r>
-    </w:p>
-    <w:p>
-      <w:pPr>
-        <w:ind w:left="720" w:hanging="720"/>
-      </w:pPr>
-      <w:r>
-        <w:t xml:space="preserve">Glenn, A. L., Raine, A., &amp; Schug, R. A. (2009). The neural correlates of moral decision-making in psychopathy. </w:t>
-      </w:r>
-      <w:r>
-        <w:rPr>
-          <w:i/>
-          <w:iCs/>
-        </w:rPr>
-        <w:t>Molecular Psychiatry, 14</w:t>
-      </w:r>
-      <w:r>
-        <w:t>(1)</w:t>
-      </w:r>
-      <w:r>
-        <w:t>, 5–6. https://doi.org/10.1038/mp.2008.104</w:t>
-      </w:r>
-    </w:p>
-    <w:p>
-      <w:pPr>
-        <w:ind w:left="720" w:hanging="720"/>
-      </w:pPr>
-      <w:r>
-        <w:t xml:space="preserve">Grijalva, E. and Newman, D.A. (2015), Narcissism–CWB Relationship. </w:t>
-      </w:r>
-      <w:r>
-        <w:rPr>
-          <w:i/>
-          <w:iCs/>
-        </w:rPr>
-        <w:t>Applied Psychology, 64</w:t>
-      </w:r>
-      <w:r>
-        <w:rPr>
-          <w:rFonts w:hint="eastAsia"/>
-          <w:i/>
-          <w:iCs/>
-        </w:rPr>
-        <w:t>,</w:t>
-      </w:r>
-      <w:r>
-        <w:t xml:space="preserve"> 93-126. https://doi.org/10.1111/apps.12025</w:t>
-      </w:r>
-    </w:p>
-    <w:p>
-      <w:pPr>
-        <w:ind w:left="720" w:hanging="720"/>
-      </w:pPr>
-      <w:r>
-        <w:t xml:space="preserve">Hare, R. D. (1982). Psychopathy and the personality dimensions of psychoticism, extraversion and neuroticism. </w:t>
-      </w:r>
-      <w:r>
-        <w:rPr>
-          <w:i/>
-          <w:iCs/>
-        </w:rPr>
-        <w:t>Personality and Individual Differences, 3</w:t>
-      </w:r>
-      <w:r>
-        <w:t>, 35–42. https://doi.org/10.1016/0191-8869(82)90072-1</w:t>
-      </w:r>
-    </w:p>
-    <w:p>
-      <w:pPr>
-        <w:ind w:left="720" w:hanging="720"/>
-      </w:pPr>
-      <w:r>
-        <w:t xml:space="preserve">Hare, R. D. (2003). Manual for the Hare Psychopathy Checklist–Revised (2nd ed.). Multi-Health Systems.</w:t>
-      </w:r>
-    </w:p>
-    <w:p>
-      <w:pPr>
-        <w:ind w:left="720" w:hanging="720"/>
-      </w:pPr>
-      <w:r>
-        <w:lastRenderedPageBreak/>
-        <w:t xml:space="preserve">Hare, R. D., &amp; Neumann, C. S. (2008). Psychopathy as a clinical and empirical construct. </w:t>
-      </w:r>
-      <w:r>
-        <w:rPr>
-          <w:i/>
-          <w:iCs/>
-        </w:rPr>
-        <w:t>Annual Review of Clinical Psychology, 4</w:t>
-      </w:r>
-      <w:r>
-        <w:t xml:space="preserve">, 217-246. </w:t>
-      </w:r>
-      <w:r>
-        <w:t>https://doi.org/</w:t>
-      </w:r>
-      <w:r>
-        <w:t>10.1146/annurev.clinpsy.3.022806.091452</w:t>
-      </w:r>
-    </w:p>
-    <w:p>
-      <w:pPr>
-        <w:ind w:left="720" w:hanging="720"/>
-      </w:pPr>
-      <w:r>
-        <w:t xml:space="preserve">Hemphill, J. F., Hare, R. D., &amp; Wong, S. (1998). Psychopathy and recidivism: A review. </w:t>
-      </w:r>
-      <w:r>
-        <w:rPr>
-          <w:i/>
-          <w:iCs/>
-        </w:rPr>
-        <w:t>Legal and Criminological Psychology, 3</w:t>
-      </w:r>
-      <w:r>
-        <w:t>(Part 1)</w:t>
-      </w:r>
-      <w:r>
-        <w:t>, 139–170. https://doi.org/10.1111/j.2044-8333.1998.tb00355.x</w:t>
-      </w:r>
-    </w:p>
-    <w:p>
-      <w:pPr>
-        <w:ind w:left="720" w:hanging="720"/>
-      </w:pPr>
-      <w:r>
-        <w:t xml:space="preserve">Henrich J, Heine SJ, </w:t>
-      </w:r>
-      <w:proofErr w:type="spellStart"/>
-      <w:r>
-        <w:t>Norenzayan</w:t>
-      </w:r>
-      <w:proofErr w:type="spellEnd"/>
-      <w:r>
-        <w:t xml:space="preserve"> A. The weirdest people in the world? </w:t>
-      </w:r>
-      <w:proofErr w:type="spellStart"/>
-      <w:r>
-        <w:t>Behav</w:t>
-      </w:r>
-      <w:proofErr w:type="spellEnd"/>
-      <w:r>
-        <w:t xml:space="preserve"> Brain Sci. 2010 Jun;33(2-3):61-83; discussion 83-135. </w:t>
-      </w:r>
-      <w:proofErr w:type="spellStart"/>
-      <w:r>
-        <w:t>doi</w:t>
-      </w:r>
-      <w:proofErr w:type="spellEnd"/>
-      <w:r>
-        <w:t xml:space="preserve">: 10.1017/S0140525X0999152X. </w:t>
-      </w:r>
-      <w:proofErr w:type="spellStart"/>
-      <w:r>
-        <w:t>Epub</w:t>
-      </w:r>
-      <w:proofErr w:type="spellEnd"/>
-      <w:r>
-        <w:t xml:space="preserve"> 2010 Jun 15. PMID: 20550733.</w:t>
-      </w:r>
-    </w:p>
-    <w:p>
-      <w:pPr>
-        <w:ind w:left="720" w:hanging="720"/>
-      </w:pPr>
-      <w:r>
-        <w:t xml:space="preserve">Hoch, J. E., Bommer, W. H., Dulebohn, J. H., &amp; Wu, D. (2018). Do ethical, authentic, and servant leadership explain variance above and beyond transformational leadership? A meta-analysis. </w:t>
-      </w:r>
-      <w:r>
-        <w:rPr>
-          <w:i/>
-          <w:iCs/>
-        </w:rPr>
-        <w:t>Journal of Management, 44</w:t>
-      </w:r>
-      <w:r>
-        <w:t>(2)</w:t>
-      </w:r>
-      <w:r>
-        <w:t>, 501-529. https://doi.org/10.1177/0149206316665461</w:t>
-      </w:r>
-    </w:p>
-    <w:p>
-      <w:pPr>
-        <w:ind w:left="720" w:hanging="720"/>
-      </w:pPr>
-      <w:r>
-        <w:t xml:space="preserve">Howard, M. C., &amp; Van Zandt, E. C. (2020). The discriminant validity of honesty-humility: A meta-analysis of the HEXACO, Big Five, and Dark Triad. </w:t>
-      </w:r>
-      <w:r>
-        <w:rPr>
-          <w:i/>
-          <w:iCs/>
-        </w:rPr>
-        <w:t>Journal of Research in Personality, 87</w:t>
-      </w:r>
-      <w:r>
-        <w:t>, 103982. https://doi.org/10.1016/j.jrp.2020.103982</w:t>
-      </w:r>
-    </w:p>
-    <w:p>
-      <w:pPr>
-        <w:ind w:left="720" w:hanging="720"/>
-      </w:pPr>
-      <w:proofErr w:type="spellStart"/>
-      <w:r>
-        <w:t>Inceoglu</w:t>
-      </w:r>
-      <w:proofErr w:type="spellEnd"/>
-      <w:r>
-        <w:t xml:space="preserve">, I., &amp; Warr, P. (2011). Personality and job engagement. </w:t>
-      </w:r>
-      <w:r>
-        <w:rPr>
-          <w:i/>
-          <w:iCs/>
-        </w:rPr>
-        <w:t>Journal of Personnel Psychology, 10</w:t>
-      </w:r>
-      <w:r>
-        <w:t>(4)</w:t>
-      </w:r>
-      <w:r>
-        <w:t>, 177–181. https://doi.org/10.1027/1866-5888/a000045</w:t>
-      </w:r>
-    </w:p>
-    <w:p>
-      <w:pPr>
-        <w:ind w:left="720" w:hanging="720"/>
-      </w:pPr>
-      <w:r>
-        <w:rPr>
-          <w:rFonts w:hint="eastAsia"/>
-        </w:rPr>
-        <w:t>Jonason, P. K., Li, N. P., Webster, G. D., &amp; Schmitt, D. P. (2009). The Dark Triad: Facilitating a short</w:t>
-      </w:r>
-      <w:r>
-        <w:rPr>
-          <w:rFonts w:hint="eastAsia"/>
-        </w:rPr>
-        <w:t>‐</w:t>
-      </w:r>
-      <w:r>
-        <w:rPr>
-          <w:rFonts w:hint="eastAsia"/>
-        </w:rPr>
-        <w:t xml:space="preserve">term mating strategy in men. </w:t>
-      </w:r>
-      <w:r>
-        <w:rPr>
-          <w:rFonts w:hint="eastAsia"/>
-          <w:i/>
-          <w:iCs/>
-        </w:rPr>
-        <w:t>European Journal of Personality, 23</w:t>
-      </w:r>
-      <w:r>
-        <w:rPr>
-          <w:rFonts w:hint="eastAsia"/>
-        </w:rPr>
-        <w:t>(1)</w:t>
-      </w:r>
-      <w:r>
-        <w:rPr>
-          <w:rFonts w:hint="eastAsia"/>
-        </w:rPr>
-        <w:t>, 5-18. https://doi.org/10.1002/per.698</w:t>
-      </w:r>
-    </w:p>
-    <w:p>
-      <w:pPr>
-        <w:ind w:left="720" w:hanging="720"/>
-      </w:pPr>
-      <w:r>
-        <w:t xml:space="preserve">Jonason, P. K., &amp; Webster, G. D. (2010). The dirty dozen: A concise measure of the dark triad. </w:t>
-      </w:r>
-      <w:r>
-        <w:rPr>
-          <w:i/>
-          <w:iCs/>
-        </w:rPr>
-        <w:t>Psychological Assessment, 22</w:t>
-      </w:r>
-      <w:r>
-        <w:t>(2)</w:t>
-      </w:r>
-      <w:r>
-        <w:t>, 420–432. https://doi.org/10.1037/a0019265</w:t>
-      </w:r>
-    </w:p>
-    <w:p>
-      <w:pPr>
-        <w:ind w:left="720" w:hanging="720"/>
-      </w:pPr>
-      <w:r>
-        <w:t xml:space="preserve">Jonason, P. K., Slomski, S., &amp; Partyka, J. (2012). The Dark Triad at work: How toxic employees get their way. </w:t>
-      </w:r>
-      <w:r>
-        <w:rPr>
-          <w:i/>
-          <w:iCs/>
-        </w:rPr>
-        <w:t>Personality and Individual Differences, 52</w:t>
-      </w:r>
-      <w:r>
-        <w:t>(3)</w:t>
-      </w:r>
-      <w:r>
-        <w:t xml:space="preserve">, 449-453. </w:t>
-      </w:r>
-      <w:r>
-        <w:lastRenderedPageBreak/>
-        <w:t>https://doi.org/10.1016/j.paid.2011.11.008</w:t>
-      </w:r>
-    </w:p>
-    <w:p>
-      <w:pPr>
-        <w:ind w:left="720" w:hanging="720"/>
-      </w:pPr>
-      <w:r>
-        <w:t xml:space="preserve">Jones, D. N., &amp; Paulhus, D. L. (2009). Machiavellianism. In M. R. Leary &amp; R. H. Hoyle (Eds.), Handbook of individual differences in social behavior (pp. 93–108). Guilford Press.</w:t>
-      </w:r>
-    </w:p>
-    <w:p>
-      <w:pPr>
-        <w:ind w:left="720" w:hanging="720"/>
-      </w:pPr>
-      <w:r>
-        <w:t xml:space="preserve">Jones, D. N., &amp; Paulhus, D. L. (2010). Different provocations trigger aggression in narcissists and psychopaths. Social Psychological and Personality Science, 1(1), 12–18. https://doi.org/10.1177/1948550609347591</w:t>
-      </w:r>
-    </w:p>
-    <w:p>
-      <w:pPr>
-        <w:ind w:left="720" w:hanging="720"/>
-      </w:pPr>
-      <w:r>
-        <w:t xml:space="preserve">Judge, T. A., &amp; Bono, J. E. (2000). Five-factor model of personality and transformational leadership. </w:t>
-      </w:r>
-      <w:r>
-        <w:rPr>
-          <w:i/>
-          <w:iCs/>
-        </w:rPr>
-        <w:t>Journal of Applied Psychology, 85</w:t>
-      </w:r>
-      <w:r>
-        <w:t>(5)</w:t>
-      </w:r>
-      <w:r>
-        <w:t>, 751–765. https://doi.org/10.1037/0021-9010.85.5.751</w:t>
-      </w:r>
-    </w:p>
-    <w:p>
-      <w:pPr>
-        <w:ind w:left="720" w:hanging="720"/>
-      </w:pPr>
-      <w:r>
-        <w:t xml:space="preserve">Kiire, A. (2016). The relationship between the Dark Triad and the Five-Factor Model of personality. </w:t>
-      </w:r>
-      <w:r>
-        <w:rPr>
-          <w:i/>
-          <w:iCs/>
-        </w:rPr>
-        <w:t>Bulletin of Hosei University Graduate School, 76</w:t>
-      </w:r>
-      <w:r>
-        <w:t>, 49-54. https://doi.org/10.15002/00012803</w:t>
-      </w:r>
-      <w:r>
-        <w:rPr>
-          <w:rFonts w:hint="eastAsia"/>
-        </w:rPr>
-        <w:t xml:space="preserve"> (in Japanese</w:t>
-      </w:r>
-      <w:r>
-        <w:rPr>
-          <w:rFonts w:hint="eastAsia"/>
-        </w:rPr>
-        <w:t>.</w:t>
-      </w:r>
-      <w:r>
-        <w:rPr>
-          <w:rFonts w:hint="eastAsia"/>
-        </w:rPr>
-        <w:t>)</w:t>
-      </w:r>
-    </w:p>
-    <w:p>
-      <w:pPr>
-        <w:ind w:left="720" w:hanging="720"/>
-      </w:pPr>
-      <w:r>
-        <w:t xml:space="preserve">Kiire, A., &amp; Ochi, K. (2017). Short-term mating of the Dark Triad is mediated by mate retention behaviors. </w:t>
-      </w:r>
-      <w:r>
-        <w:rPr>
-          <w:i/>
-          <w:iCs/>
-        </w:rPr>
-        <w:t>Proceedings of the 81st Annual Convention of the Japanese Psychological Association, 81</w:t>
-      </w:r>
-      <w:r>
-        <w:t xml:space="preserve">, </w:t>
-      </w:r>
-      <w:r>
-        <w:rPr>
-          <w:rFonts w:hint="eastAsia"/>
-        </w:rPr>
-        <w:t>2</w:t>
-      </w:r>
-      <w:r>
-        <w:t>. https://doi.org/10.4992/pacjpa.81.0_1A-007</w:t>
-      </w:r>
-      <w:r>
-        <w:rPr>
-          <w:rFonts w:hint="eastAsia"/>
-        </w:rPr>
-        <w:t xml:space="preserve"> (in Japanese</w:t>
-      </w:r>
-      <w:r>
-        <w:rPr>
-          <w:rFonts w:hint="eastAsia"/>
-        </w:rPr>
-        <w:t>.</w:t>
-      </w:r>
-      <w:r>
-        <w:rPr>
-          <w:rFonts w:hint="eastAsia"/>
-        </w:rPr>
-        <w:t>)</w:t>
-      </w:r>
-    </w:p>
-    <w:p>
-      <w:pPr>
-        <w:ind w:left="720" w:hanging="720"/>
-      </w:pPr>
-      <w:r>
-        <w:t xml:space="preserve">Kobayashi, A., &amp; Tanaka, K. (2010). Development of the Gender Harassment Scale. </w:t>
-      </w:r>
-      <w:r>
-        <w:rPr>
-          <w:i/>
-          <w:iCs/>
-        </w:rPr>
-        <w:t>Japanese Journal of Industrial and Organizational Psychology, 24</w:t>
-      </w:r>
-      <w:r>
-        <w:t>(1)</w:t>
-      </w:r>
-      <w:r>
-        <w:t>, 15-27. https://doi.org/10.32222/jaiop.24.1_15</w:t>
-      </w:r>
-      <w:r>
-        <w:rPr>
-          <w:rFonts w:hint="eastAsia"/>
-        </w:rPr>
-        <w:t xml:space="preserve"> (in Japanese</w:t>
-      </w:r>
-      <w:r>
-        <w:rPr>
-          <w:rFonts w:hint="eastAsia"/>
-        </w:rPr>
-        <w:t>.</w:t>
-      </w:r>
-      <w:r>
-        <w:rPr>
-          <w:rFonts w:hint="eastAsia"/>
-        </w:rPr>
-        <w:t>)</w:t>
-      </w:r>
-    </w:p>
-    <w:p>
-      <w:pPr>
-        <w:ind w:left="720" w:hanging="720"/>
-      </w:pPr>
-      <w:proofErr w:type="spellStart"/>
-      <w:r>
-        <w:t>Koshinaka</w:t>
-      </w:r>
-      <w:proofErr w:type="spellEnd"/>
-      <w:r>
-        <w:t xml:space="preserve">, K. (2020). Do the Dark Triad personalities dislike others and avoid being disliked by others? </w:t>
-      </w:r>
-      <w:r>
-        <w:rPr>
-          <w:i/>
-          <w:iCs/>
-        </w:rPr>
-        <w:t xml:space="preserve">Bulletin of Tokai </w:t>
-      </w:r>
-      <w:proofErr w:type="spellStart"/>
-      <w:r>
-        <w:rPr>
-          <w:i/>
-          <w:iCs/>
-        </w:rPr>
-        <w:t>Gakuen</w:t>
-      </w:r>
-      <w:proofErr w:type="spellEnd"/>
-      <w:r>
-        <w:rPr>
-          <w:i/>
-          <w:iCs/>
-        </w:rPr>
-        <w:t xml:space="preserve"> University, 30</w:t>
-      </w:r>
-      <w:r>
-        <w:t>, 57-78. http://repository.tokaigakuen-u.ac.jp/dspace/handle/11334/1903</w:t>
-      </w:r>
-      <w:r>
-        <w:rPr>
-          <w:rFonts w:hint="eastAsia"/>
-        </w:rPr>
-        <w:t xml:space="preserve"> (in Japanese</w:t>
-      </w:r>
-      <w:r>
-        <w:rPr>
-          <w:rFonts w:hint="eastAsia"/>
-        </w:rPr>
-        <w:t>.</w:t>
-      </w:r>
-      <w:r>
-        <w:rPr>
-          <w:rFonts w:hint="eastAsia"/>
-        </w:rPr>
-        <w:t>)</w:t>
-      </w:r>
-    </w:p>
-    <w:p>
-      <w:pPr>
-        <w:ind w:left="720" w:hanging="720"/>
-      </w:pPr>
-      <w:r>
-        <w:t xml:space="preserve">LeBreton, J. M., Shiverdecker, L. K., &amp; Grimaldi, E. M. (2018). The dark triad and workplace behavior. </w:t>
-      </w:r>
-      <w:r>
-        <w:rPr>
-          <w:i/>
-          <w:iCs/>
-        </w:rPr>
-        <w:t>Annual Review of Organizational Psychology and Organizational Behavior, 5</w:t>
-      </w:r>
-      <w:r>
-        <w:t>, 387-414. https://doi.org/10.1146/annurev-orgpsych-032117-104451</w:t>
-      </w:r>
-    </w:p>
-    <w:p>
-      <w:pPr>
-        <w:ind w:left="720" w:hanging="720"/>
-      </w:pPr>
-      <w:r>
-        <w:t xml:space="preserve">Lee, K., &amp; Ashton, M. C. (2004). Psychometric properties of the HEXACO Personality </w:t>
-      </w:r>
-      <w:r>
-        <w:lastRenderedPageBreak/>
-        <w:t xml:space="preserve">Inventory. </w:t>
-      </w:r>
-      <w:r>
-        <w:rPr>
-          <w:i/>
-          <w:iCs/>
-        </w:rPr>
-        <w:t>Multivariate Behavioral Research, 39</w:t>
-      </w:r>
-      <w:r>
-        <w:t>(2)</w:t>
-      </w:r>
-      <w:r>
-        <w:t>, 329-358. https://doi.org/10.1207/s15327906mbr3902_8</w:t>
-      </w:r>
-    </w:p>
-    <w:p>
-      <w:pPr>
-        <w:ind w:left="720" w:hanging="720"/>
-      </w:pPr>
-      <w:r>
-        <w:t xml:space="preserve">Lee, K., &amp; Ashton, M. C. (2005). Psychopathy, Machiavellianism, and Narcissism in the Five-Factor Model and the HEXACO model of personality structure. </w:t>
-      </w:r>
-      <w:r>
-        <w:rPr>
-          <w:i/>
-          <w:iCs/>
-        </w:rPr>
-        <w:t>Personality and Individual Differences, 38</w:t>
-      </w:r>
-      <w:r>
-        <w:t>(7)</w:t>
-      </w:r>
-      <w:r>
-        <w:t>, 1571–1582. https://doi.org/10.1016/j.paid.2004.09.016</w:t>
-      </w:r>
-    </w:p>
-    <w:p>
-      <w:pPr>
-        <w:ind w:left="720" w:hanging="720"/>
-      </w:pPr>
-      <w:r>
-        <w:t xml:space="preserve">Lee, K., Ashton, M. C., &amp; de Vries, R. E. (2005). Predicting workplace delinquency and integrity with the HEXACO and Five-Factor Models of personality structure. </w:t>
-      </w:r>
-      <w:r>
-        <w:rPr>
-          <w:i/>
-          <w:iCs/>
-        </w:rPr>
-        <w:t>Human Performance, 18</w:t>
-      </w:r>
-      <w:r>
-        <w:t>(2)</w:t>
-      </w:r>
-      <w:r>
-        <w:t>, 179-197. https://doi.org/10.1207/s15327043hup1802_4</w:t>
-      </w:r>
-    </w:p>
-    <w:p>
-      <w:pPr>
-        <w:ind w:left="720" w:hanging="720"/>
-      </w:pPr>
-      <w:r>
-        <w:t xml:space="preserve">Lee, K., Ashton, M. C., </w:t>
-      </w:r>
-      <w:proofErr w:type="spellStart"/>
-      <w:r>
-        <w:t>Ogunfowora</w:t>
-      </w:r>
-      <w:proofErr w:type="spellEnd"/>
-      <w:r>
-        <w:t xml:space="preserve">, B., Bourdage, J. S., &amp; Shin, K. H. (2010). The personality bases of socio-political attitudes: The role of honesty-humility and openness to experience. </w:t>
-      </w:r>
-      <w:r>
-        <w:rPr>
-          <w:i/>
-          <w:iCs/>
-        </w:rPr>
-        <w:t>Journal of Research in Personality, 44</w:t>
-      </w:r>
-      <w:r>
-        <w:t>(1)</w:t>
-      </w:r>
-      <w:r>
-        <w:t>, 115-119. https://doi.org/10.1016/j.jrp.2009.08.007</w:t>
-      </w:r>
-    </w:p>
-    <w:p>
-      <w:pPr>
-        <w:ind w:left="720" w:hanging="720"/>
-      </w:pPr>
-      <w:r>
-        <w:t xml:space="preserve">Lee, K., Ashton, M. C., Wiltshire, J., Bourdage, J. S., Visser, B. A., &amp; Gallucci, A. (2013). Sex, power, and money: Prediction from the Dark Triad and honesty-humility. </w:t>
-      </w:r>
-      <w:r>
-        <w:rPr>
-          <w:i/>
-          <w:iCs/>
-        </w:rPr>
-        <w:t>European Journal of Personality, 27</w:t>
-      </w:r>
-      <w:r>
-        <w:t>(2)</w:t>
-      </w:r>
-      <w:r>
-        <w:t>, 169-184. https://doi.org/10.1002/per.1860</w:t>
-      </w:r>
-    </w:p>
-    <w:p>
-      <w:pPr>
-        <w:ind w:left="720" w:hanging="720"/>
-      </w:pPr>
-      <w:r>
-        <w:t xml:space="preserve">Lee, K., Ashton, M. C., Griep, Y., &amp; Edmonds, M. (2018). Personality, religion, and politics: An investigation in 33 countries. </w:t>
-      </w:r>
-      <w:r>
-        <w:rPr>
-          <w:i/>
-          <w:iCs/>
-        </w:rPr>
-        <w:t>European Journal of Personality, 32</w:t>
-      </w:r>
-      <w:r>
-        <w:t>(2)</w:t>
-      </w:r>
-      <w:r>
-        <w:t>, 100-115. https://doi.org/10.1002/per.2142</w:t>
-      </w:r>
-    </w:p>
-    <w:p>
-      <w:pPr>
-        <w:ind w:left="720" w:hanging="720"/>
-      </w:pPr>
-      <w:r>
-        <w:t xml:space="preserve">Lee, Y., Berry, C. M., &amp; Gonzalez-Mule, E. (2019). The importance of being humble: A meta-analysis and incremental validity analysis of the relationship between honesty-humility and job performance. </w:t>
-      </w:r>
-      <w:r>
-        <w:rPr>
-          <w:i/>
-          <w:iCs/>
-        </w:rPr>
-        <w:t>Journal of Applied Psychology, 104</w:t>
-      </w:r>
-      <w:r>
-        <w:t>(12)</w:t>
-      </w:r>
-      <w:r>
-        <w:t>, 1535–1546. https://doi.org/10.1037/apl0000421</w:t>
-      </w:r>
-    </w:p>
-    <w:p>
-      <w:pPr>
-        <w:ind w:left="720" w:hanging="720"/>
-      </w:pPr>
-      <w:r>
-        <w:t xml:space="preserve">Lynam, D. R., &amp; Derefinko, K. J. (2006). Psychopathy and personality. In C. J. Patrick (Ed.), Handbook of psychopathy (pp. 133–155). Guilford Press.</w:t>
-      </w:r>
-    </w:p>
-    <w:p>
-      <w:pPr>
-        <w:ind w:left="720" w:hanging="720"/>
-      </w:pPr>
-      <w:r>
-        <w:t xml:space="preserve">Machiha, M. M., &amp; Brew, G. (2019). Predictors of Work Engagement Among University Teachers: The Role of Personality and Perceived </w:t>
-      </w:r>
-      <w:proofErr w:type="spellStart"/>
-      <w:r>
-        <w:t>Organisational</w:t>
-      </w:r>
-      <w:proofErr w:type="spellEnd"/>
-      <w:r>
-        <w:t xml:space="preserve"> Support. </w:t>
-      </w:r>
-      <w:r>
-        <w:lastRenderedPageBreak/>
-        <w:t>(Dissertation). Retrieved from https://urn.kb.se/resolve?urn=urn:nbn:se:lnu:diva-84767</w:t>
-      </w:r>
-    </w:p>
-    <w:p>
-      <w:pPr>
-        <w:ind w:left="720" w:hanging="720"/>
-      </w:pPr>
-      <w:r>
-        <w:t xml:space="preserve">Maslach, C., &amp; Leiter, M. P. (2016). Understanding the burnout experience: Recent research and its implications for psychiatry. </w:t>
-      </w:r>
-      <w:r>
-        <w:rPr>
-          <w:i/>
-          <w:iCs/>
-        </w:rPr>
-        <w:t>World Psychiatry, 15</w:t>
-      </w:r>
-      <w:r>
-        <w:t>(2)</w:t>
-      </w:r>
-      <w:r>
-        <w:t xml:space="preserve">, 103-111. </w:t>
-      </w:r>
-      <w:r>
-        <w:t>https://doi.org/</w:t>
-      </w:r>
-      <w:r>
-        <w:t>10.1002/wps.20311</w:t>
-      </w:r>
-    </w:p>
-    <w:p>
-      <w:pPr>
-        <w:ind w:left="720" w:hanging="720"/>
-      </w:pPr>
-      <w:r>
-        <w:t xml:space="preserve">Masui, K., &amp; Ura, M. (2018). Adaptive strategies of “dark” individuals. </w:t>
-      </w:r>
-      <w:r>
-        <w:rPr>
-          <w:i/>
-          <w:iCs/>
-        </w:rPr>
-        <w:t>Japanese Psychological Review, 61</w:t>
-      </w:r>
-      <w:r>
-        <w:t>(3)</w:t>
-      </w:r>
-      <w:r>
-        <w:t>, 330-343. https://doi.org/10.24602/sjpr.61.3_330</w:t>
-      </w:r>
-      <w:r>
-        <w:rPr>
-          <w:rFonts w:hint="eastAsia"/>
-        </w:rPr>
-        <w:t xml:space="preserve"> (in Japanese</w:t>
-      </w:r>
-      <w:r>
-        <w:rPr>
-          <w:rFonts w:hint="eastAsia"/>
-        </w:rPr>
-        <w:t>.</w:t>
-      </w:r>
-      <w:r>
-        <w:rPr>
-          <w:rFonts w:hint="eastAsia"/>
-        </w:rPr>
-        <w:t>)</w:t>
-      </w:r>
-    </w:p>
-    <w:p>
-      <w:pPr>
-        <w:ind w:left="720" w:hanging="720"/>
-      </w:pPr>
-      <w:r>
-        <w:t xml:space="preserve">Mathieu, C., Hare, R. D., Jones, D. N., Babiak, P., &amp; Neumann, C. S. (2013). Factor structure of the B-Scan 360: A measure of corporate psychopathy. </w:t>
-      </w:r>
-      <w:r>
-        <w:rPr>
-          <w:i/>
-          <w:iCs/>
-        </w:rPr>
-        <w:t>Psychological Assessment, 25</w:t>
-      </w:r>
-      <w:r>
-        <w:t>(1)</w:t>
-      </w:r>
-      <w:r>
-        <w:t>, 288–293. https://doi.org/10.1037/a0029262</w:t>
-      </w:r>
-    </w:p>
-    <w:p>
-      <w:pPr>
-        <w:ind w:left="720" w:hanging="720"/>
-      </w:pPr>
-      <w:r>
-        <w:t xml:space="preserve">McDaniel, M. A., Hartman, N. S., Whetzel, D. L., &amp; Grubb, W. L. III. (2007). Situational judgment tests, response instructions, and validity: A meta-analysis. </w:t>
-      </w:r>
-      <w:r>
-        <w:rPr>
-          <w:i/>
-          <w:iCs/>
-        </w:rPr>
-        <w:t>Personnel Psychology, 60</w:t>
-      </w:r>
-      <w:r>
-        <w:t>(1)</w:t>
-      </w:r>
-      <w:r>
-        <w:t>, 63-91. https://doi.org/10.1111/j.1744-6570.2007.00065.x</w:t>
-      </w:r>
-    </w:p>
-    <w:p>
-      <w:pPr>
-        <w:ind w:left="720" w:hanging="720"/>
-      </w:pPr>
-      <w:proofErr w:type="spellStart"/>
-      <w:r>
-        <w:t>McHoskey</w:t>
-      </w:r>
-      <w:proofErr w:type="spellEnd"/>
-      <w:r>
-        <w:t xml:space="preserve"> J. (1995). Narcissism and Machiavellianism. </w:t>
-      </w:r>
-      <w:r>
-        <w:rPr>
-          <w:i/>
-          <w:iCs/>
-        </w:rPr>
-        <w:t>Psychological reports, 77</w:t>
-      </w:r>
-      <w:r>
-        <w:t>(3 Pt 1)</w:t>
-      </w:r>
-      <w:r>
-        <w:t>, 755–759. https://doi.org/10.2466/pr0.1995.77.3.755</w:t>
-      </w:r>
-    </w:p>
-    <w:p>
-      <w:pPr>
-        <w:ind w:left="720" w:hanging="720"/>
-      </w:pPr>
-      <w:r>
-        <w:t xml:space="preserve">Miao, C., Wang, G., Shen, H., &amp; Wang, M. (2023). Effects of Big Five, HEXACO, and Dark Triad on counterproductive work behaviors: A meta-analysis. </w:t>
-      </w:r>
-      <w:r>
-        <w:rPr>
-          <w:i/>
-          <w:iCs/>
-        </w:rPr>
-        <w:t>International Journal of Mental Health Promotion, 25</w:t>
-      </w:r>
-      <w:r>
-        <w:t>(3)</w:t>
-      </w:r>
-      <w:r>
-        <w:t>, 357-374. https://doi.org/10.32604/ijmhp.2023.027950</w:t>
-      </w:r>
-    </w:p>
-    <w:p>
-      <w:pPr>
-        <w:ind w:left="720" w:hanging="720"/>
-      </w:pPr>
-      <w:r>
-        <w:t xml:space="preserve">Miller, J. D., &amp; Campbell, W. K. (2008). Comparing clinical and social-personality conceptualizations of narcissism. </w:t>
-      </w:r>
-      <w:r>
-        <w:rPr>
-          <w:i/>
-          <w:iCs/>
-        </w:rPr>
-        <w:t>Journal of personality, 76</w:t>
-      </w:r>
-      <w:r>
-        <w:t>(3)</w:t>
-      </w:r>
-      <w:r>
-        <w:t>, 449–476. https://doi.org/10.1111/j.1467-6494.2008.00492.x</w:t>
-      </w:r>
-    </w:p>
-    <w:p>
-      <w:pPr>
-        <w:ind w:left="720" w:hanging="720"/>
-      </w:pPr>
-      <w:r>
-        <w:t xml:space="preserve">Morales, N. A. (2020). Gender and the HEXACO model of personality: Meta-analysis, measurement equivalence, and specification of agency as a core construct of </w:t>
-      </w:r>
-      <w:r>
-        <w:lastRenderedPageBreak/>
-        <w:t xml:space="preserve">investment (Master’s thesis). </w:t>
-      </w:r>
-      <w:r>
-        <w:rPr>
-          <w:i/>
-          <w:iCs/>
-        </w:rPr>
-        <w:t>University of Illinois at Urbana-Champaign</w:t>
-      </w:r>
-      <w:r>
-        <w:t>. http://hdl.handle.net/2142/108140</w:t>
-      </w:r>
-    </w:p>
-    <w:p>
-      <w:pPr>
-        <w:ind w:left="720" w:hanging="720"/>
-      </w:pPr>
-      <w:r>
-        <w:t xml:space="preserve">Morf, C. C., &amp; </w:t>
-      </w:r>
-      <w:proofErr w:type="spellStart"/>
-      <w:r>
-        <w:t>Rhodewalt</w:t>
-      </w:r>
-      <w:proofErr w:type="spellEnd"/>
-      <w:r>
-        <w:t xml:space="preserve">, F. (2001). Unraveling the paradoxes of narcissism: A dynamic self-regulatory processing model. </w:t>
-      </w:r>
-      <w:r>
-        <w:rPr>
-          <w:i/>
-          <w:iCs/>
-        </w:rPr>
-        <w:t>Psychological Inquiry, 12</w:t>
-      </w:r>
-      <w:r>
-        <w:t>(4)</w:t>
-      </w:r>
-      <w:r>
-        <w:t>, 177–196. https://doi.org/10.1207/S15327965PLI1204_1</w:t>
-      </w:r>
-    </w:p>
-    <w:p>
-      <w:pPr>
-        <w:ind w:left="720" w:hanging="720"/>
-      </w:pPr>
-      <w:proofErr w:type="spellStart"/>
-      <w:r>
-        <w:t>Moshagen</w:t>
-      </w:r>
-      <w:proofErr w:type="spellEnd"/>
-      <w:r>
-        <w:t xml:space="preserve">, M., Hilbig, B. E., &amp; Zettler, I. (2018). The dark core of personality. </w:t>
-      </w:r>
-      <w:r>
-        <w:rPr>
-          <w:i/>
-          <w:iCs/>
-        </w:rPr>
-        <w:t>Psychological Review, 125</w:t>
-      </w:r>
-      <w:r>
-        <w:t>(5)</w:t>
-      </w:r>
-      <w:r>
-        <w:t>, 656–688. https://doi.org/10.1037/rev0000111</w:t>
-      </w:r>
-    </w:p>
-    <w:p>
-      <w:pPr>
-        <w:ind w:left="720" w:hanging="720"/>
-      </w:pPr>
-      <w:proofErr w:type="spellStart"/>
-      <w:r>
-        <w:t>Moshagen</w:t>
-      </w:r>
-      <w:proofErr w:type="spellEnd"/>
-      <w:r>
-        <w:t xml:space="preserve">, Morten &amp; Thielmann, Isabel &amp; Hilbig, Benjamin &amp; Zettler, Ingo. (2019). Meta-Analytic Investigations of the HEXACO Personality Inventory(-Revised). </w:t>
-      </w:r>
-      <w:proofErr w:type="spellStart"/>
-      <w:r>
-        <w:rPr>
-          <w:i/>
-          <w:iCs/>
-        </w:rPr>
-        <w:t>Zeitschrift</w:t>
-      </w:r>
-      <w:proofErr w:type="spellEnd"/>
-      <w:r>
-        <w:rPr>
-          <w:i/>
-          <w:iCs/>
-        </w:rPr>
-        <w:t xml:space="preserve"> für </w:t>
-      </w:r>
-      <w:proofErr w:type="spellStart"/>
-      <w:r>
-        <w:rPr>
-          <w:i/>
-          <w:iCs/>
-        </w:rPr>
-        <w:t>Psychologie</w:t>
-      </w:r>
-      <w:proofErr w:type="spellEnd"/>
-      <w:r>
-        <w:rPr>
-          <w:i/>
-          <w:iCs/>
-        </w:rPr>
-        <w:t>. 227</w:t>
-      </w:r>
-      <w:r>
-        <w:t xml:space="preserve">. 186-194. </w:t>
-      </w:r>
-      <w:r>
-        <w:t>https://doi.org/</w:t>
-      </w:r>
-      <w:r>
-        <w:t>10.1027/2151-2604/a000377</w:t>
-      </w:r>
-    </w:p>
-    <w:p>
-      <w:pPr>
-        <w:ind w:left="720" w:hanging="720"/>
-      </w:pPr>
-      <w:r>
-        <w:t xml:space="preserve">Muris, P., </w:t>
-      </w:r>
-      <w:proofErr w:type="spellStart"/>
-      <w:r>
-        <w:t>Merckelbach</w:t>
-      </w:r>
-      <w:proofErr w:type="spellEnd"/>
-      <w:r>
-        <w:t xml:space="preserve">, H., </w:t>
-      </w:r>
-      <w:proofErr w:type="spellStart"/>
-      <w:r>
-        <w:t>Otgaar</w:t>
-      </w:r>
-      <w:proofErr w:type="spellEnd"/>
-      <w:r>
-        <w:t xml:space="preserve">, H., &amp; Meijer, E. (2017). The malevolent side of human nature: A meta-analysis and critical review of the literature on the dark triad (narcissism, Machiavellianism, and psychopathy). </w:t>
-      </w:r>
-      <w:r>
-        <w:rPr>
-          <w:i/>
-          <w:iCs/>
-        </w:rPr>
-        <w:t>Perspectives on Psychological Science, 12</w:t>
-      </w:r>
-      <w:r>
-        <w:t>(2)</w:t>
-      </w:r>
-      <w:r>
-        <w:t>, 183–204. https://doi.org/10.1177/1745691616666070</w:t>
-      </w:r>
-    </w:p>
-    <w:p>
-      <w:pPr>
-        <w:ind w:left="720" w:hanging="720"/>
-      </w:pPr>
-      <w:r>
-        <w:t xml:space="preserve">Neumann, C. S., &amp; Hare, R. D. (2008). Psychopathic traits in a large community sample: Links to violence, alcohol use, and intelligence. </w:t>
-      </w:r>
-      <w:r>
-        <w:rPr>
-          <w:i/>
-          <w:iCs/>
-        </w:rPr>
-        <w:t>Journal of Consulting and Clinical Psychology, 76</w:t>
-      </w:r>
-      <w:r>
-        <w:t>(5)</w:t>
-      </w:r>
-      <w:r>
-        <w:t>, 893–899. https://doi.org/10.1037/0022-006X.76.5.893</w:t>
-      </w:r>
-    </w:p>
-    <w:p>
-      <w:pPr>
-        <w:ind w:left="720" w:hanging="720"/>
-      </w:pPr>
-      <w:r>
-        <w:t xml:space="preserve">O’Boyle, E. H., Forsyth, D. R., Banks, G. C., &amp; McDaniel, M. A. (2012). A meta-analysis of the Dark Triad and work behavior: A social exchange perspective. </w:t>
-      </w:r>
-      <w:r>
-        <w:rPr>
-          <w:i/>
-          <w:iCs/>
-        </w:rPr>
-        <w:t>Journal of Applied Psychology, 97</w:t>
-      </w:r>
-      <w:r>
-        <w:t>(3)</w:t>
-      </w:r>
-      <w:r>
-        <w:t>, 557-579. https://doi.org/10.1037/a0025679</w:t>
-      </w:r>
-    </w:p>
-    <w:p>
-      <w:pPr>
-        <w:ind w:left="720" w:hanging="720"/>
-      </w:pPr>
-      <w:r>
-        <w:t xml:space="preserve">Oda, R., &amp; Matsumoto-Oda, A. (2022). HEXACO, Dark Triad and altruism in daily life. </w:t>
-      </w:r>
-      <w:r>
-        <w:rPr>
-          <w:i/>
-          <w:iCs/>
-        </w:rPr>
-        <w:t>Personality and Individual Differences, 185</w:t>
-      </w:r>
-      <w:r>
-        <w:t>, 111303. https://doi.org/10.1016/j.paid.2021.111303</w:t>
-      </w:r>
-    </w:p>
-    <w:p>
-      <w:pPr>
-        <w:ind w:left="720" w:hanging="720"/>
-      </w:pPr>
-      <w:proofErr w:type="spellStart"/>
-      <w:r>
-        <w:t>Oostrom</w:t>
-      </w:r>
-      <w:proofErr w:type="spellEnd"/>
-      <w:r>
-        <w:t xml:space="preserve">, J. K., de Vries, R. E., &amp; de Wit, M. (2019). Development and validation of a HEXACO situational judgment test. </w:t>
-      </w:r>
-      <w:r>
-        <w:rPr>
-          <w:i/>
-          <w:iCs/>
-        </w:rPr>
-        <w:t>Human Performance, 32</w:t>
-      </w:r>
-      <w:r>
-        <w:t>(1)</w:t>
-      </w:r>
-      <w:r>
-        <w:t xml:space="preserve">, 1-29. </w:t>
-      </w:r>
-      <w:r>
-        <w:lastRenderedPageBreak/>
-        <w:t>https://doi.org/10.1080/08959285.2018.1539856</w:t>
-      </w:r>
-    </w:p>
-    <w:p>
-      <w:pPr>
-        <w:ind w:left="720" w:hanging="720"/>
-      </w:pPr>
-      <w:r>
-        <w:t xml:space="preserve">Ozer, D. J., &amp; Benet-Martínez, V. (2006). Personality and the prediction of consequential outcomes. </w:t>
-      </w:r>
-      <w:r>
-        <w:rPr>
-          <w:i/>
-          <w:iCs/>
-        </w:rPr>
-        <w:t>Annual review of psychology, 57</w:t>
-      </w:r>
-      <w:r>
-        <w:t>, 401–421. https://doi.org/10.1146/annurev.psych.57.102904.190127</w:t>
-      </w:r>
-    </w:p>
-    <w:p>
-      <w:pPr>
-        <w:ind w:left="720" w:hanging="720"/>
-      </w:pPr>
-      <w:r>
-        <w:t xml:space="preserve">Paulhus, D. L. (2001). Normal narcissism: Two minimalist accounts. Psychological Inquiry, 12(4), 228–230. https://doi.org/10.1207/S15327965PLI1204_5</w:t>
-      </w:r>
-    </w:p>
-    <w:p>
-      <w:pPr>
-        <w:ind w:left="720" w:hanging="720"/>
-      </w:pPr>
-      <w:r>
-        <w:t xml:space="preserve">Paulhus, D. L., &amp; Williams, K. M. (2002). The Dark Triad of personality: Narcissism, Machiavellianism and psychopathy. </w:t>
-      </w:r>
-      <w:r>
-        <w:rPr>
-          <w:i/>
-          <w:iCs/>
-        </w:rPr>
-        <w:t>Journal of Research in Personality, 36</w:t>
-      </w:r>
-      <w:r>
-        <w:t>(6)</w:t>
-      </w:r>
-      <w:r>
-        <w:t>, 556–563. https://doi.org/10.1016/S0092-6566(02)00505-6</w:t>
-      </w:r>
-    </w:p>
-    <w:p>
-      <w:pPr>
-        <w:ind w:left="720" w:hanging="720"/>
-      </w:pPr>
-      <w:r>
-        <w:t xml:space="preserve">Pletzer, J. L., </w:t>
-      </w:r>
-      <w:proofErr w:type="spellStart"/>
-      <w:r>
-        <w:t>Bentvelzen</w:t>
-      </w:r>
-      <w:proofErr w:type="spellEnd"/>
-      <w:r>
-        <w:t xml:space="preserve">, M., </w:t>
-      </w:r>
-      <w:proofErr w:type="spellStart"/>
-      <w:r>
-        <w:t>Oostrom</w:t>
-      </w:r>
-      <w:proofErr w:type="spellEnd"/>
-      <w:r>
-        <w:t xml:space="preserve">, J. K., &amp; de Vries, R. E. (2019a). Comparing domain- and facet-level relations of the HEXACO personality model with workplace deviance: A meta-analysis. </w:t>
-      </w:r>
-      <w:r>
-        <w:rPr>
-          <w:i/>
-          <w:iCs/>
-        </w:rPr>
-        <w:t>Personality and Individual Differences, 152</w:t>
-      </w:r>
-      <w:r>
-        <w:t>(3)</w:t>
-      </w:r>
-      <w:r>
-        <w:t>, 109539. https://doi.org/10.1016/j.paid.2019.109539</w:t>
-      </w:r>
-    </w:p>
-    <w:p>
-      <w:pPr>
-        <w:ind w:left="720" w:hanging="720"/>
-      </w:pPr>
-      <w:r>
-        <w:t xml:space="preserve">Pletzer, J. L., </w:t>
-      </w:r>
-      <w:proofErr w:type="spellStart"/>
-      <w:r>
-        <w:t>Bentvelzen</w:t>
-      </w:r>
-      <w:proofErr w:type="spellEnd"/>
-      <w:r>
-        <w:t xml:space="preserve">, M., </w:t>
-      </w:r>
-      <w:proofErr w:type="spellStart"/>
-      <w:r>
-        <w:t>Oostrom</w:t>
-      </w:r>
-      <w:proofErr w:type="spellEnd"/>
-      <w:r>
-        <w:t xml:space="preserve">, J. K., &amp; de Vries, R. E. (2019b). A meta-analysis of the relations between personality and workplace deviance: Big Five versus HEXACO. </w:t>
-      </w:r>
-      <w:r>
-        <w:rPr>
-          <w:i/>
-          <w:iCs/>
-        </w:rPr>
-        <w:t>Journal of Vocational Behavior, 112</w:t>
-      </w:r>
-      <w:r>
-        <w:t>, 369–383. https://doi.org/10.1016/j.jvb.2019.04.004</w:t>
-      </w:r>
-    </w:p>
-    <w:p>
-      <w:pPr>
-        <w:ind w:left="720" w:hanging="720"/>
-      </w:pPr>
-      <w:r>
-        <w:t xml:space="preserve">Pletzer, J. L., </w:t>
-      </w:r>
-      <w:proofErr w:type="spellStart"/>
-      <w:r>
-        <w:t>Oostrom</w:t>
-      </w:r>
-      <w:proofErr w:type="spellEnd"/>
-      <w:r>
-        <w:t xml:space="preserve">, J. K., &amp; de Vries, R. E. (2021). HEXACO personality and organizational citizenship behavior: A domain- and facet-level meta-analysis. </w:t>
-      </w:r>
-      <w:r>
-        <w:rPr>
-          <w:i/>
-          <w:iCs/>
-        </w:rPr>
-        <w:t>Human Performance, 34</w:t>
-      </w:r>
-      <w:r>
-        <w:t>(2)</w:t>
-      </w:r>
-      <w:r>
         <w:t>, 126-147. https://doi.org/10.1080/08959285.2021.1891072</w:t>
       </w:r>
     </w:p>
@@ -6682,15 +5886,7 @@
         <w:ind w:left="720" w:hanging="720"/>
       </w:pPr>
       <w:r>
-        <w:t xml:space="preserve">Răducu, C.-M., &amp; </w:t>
-      </w:r>
-      <w:proofErr w:type="spellStart"/>
-      <w:r>
-        <w:t>Stănculescu</w:t>
-      </w:r>
-      <w:proofErr w:type="spellEnd"/>
-      <w:r>
-        <w:t xml:space="preserve">, E. (2022). Personality and socio-demographic variables in teacher burnout during the COVID-19 pandemic: A latent profile analysis. </w:t>
+        <w:t xml:space="preserve">Răducu, C.-M., &amp; Stănculescu, E. (2022). Personality and socio-demographic variables in teacher burnout during the COVID-19 pandemic: A latent profile analysis. </w:t>
       </w:r>
       <w:r>
         <w:rPr>
@@ -6825,13 +6021,8 @@
       <w:pPr>
         <w:ind w:left="720" w:hanging="720"/>
       </w:pPr>
-      <w:proofErr w:type="spellStart"/>
-      <w:r>
-        <w:t>Saltukoğlu</w:t>
-      </w:r>
-      <w:proofErr w:type="spellEnd"/>
-      <w:r>
-        <w:t>, G., Tatar, A., &amp; Özdemir, H. (2019). The HEXACO personality measure as a predictor of job performance and job satisfaction</w:t>
+      <w:r>
+        <w:t>Saltukoğlu, G., Tatar, A., &amp; Özdemir, H. (2019). The HEXACO personality measure as a predictor of job performance and job satisfaction</w:t>
       </w:r>
       <w:r>
         <w:rPr>
@@ -6864,23 +6055,7 @@
         <w:ind w:left="720" w:hanging="720"/>
       </w:pPr>
       <w:r>
-        <w:t xml:space="preserve">Schaufeli, W. B., </w:t>
-      </w:r>
-      <w:proofErr w:type="spellStart"/>
-      <w:r>
-        <w:t>Salanova</w:t>
-      </w:r>
-      <w:proofErr w:type="spellEnd"/>
-      <w:r>
-        <w:t>, M., González-</w:t>
-      </w:r>
-      <w:proofErr w:type="spellStart"/>
-      <w:r>
-        <w:t>Romá</w:t>
-      </w:r>
-      <w:proofErr w:type="spellEnd"/>
-      <w:r>
-        <w:t xml:space="preserve">, V., &amp; Bakker, A. B. (2002). The measurement of engagement and burnout: A two sample confirmatory factor analytic approach. </w:t>
+        <w:t xml:space="preserve">Schaufeli, W. B., Salanova, M., González-Romá, V., &amp; Bakker, A. B. (2002). The measurement of engagement and burnout: A two sample confirmatory factor analytic approach. </w:t>
       </w:r>
       <w:r>
         <w:rPr>
@@ -6980,13 +6155,8 @@
       <w:pPr>
         <w:ind w:left="720" w:hanging="720"/>
       </w:pPr>
-      <w:proofErr w:type="spellStart"/>
-      <w:r>
-        <w:t>Sellbom</w:t>
-      </w:r>
-      <w:proofErr w:type="spellEnd"/>
-      <w:r>
-        <w:t xml:space="preserve">, M., &amp; Verona, E. (2007). Neuropsychological correlates of psychopathic traits in a non-incarcerated sample. </w:t>
+      <w:r>
+        <w:t xml:space="preserve">Sellbom, M., &amp; Verona, E. (2007). Neuropsychological correlates of psychopathic traits in a non-incarcerated sample. </w:t>
       </w:r>
       <w:r>
         <w:rPr>
@@ -7027,13 +6197,8 @@
       <w:pPr>
         <w:ind w:left="720" w:hanging="720"/>
       </w:pPr>
-      <w:proofErr w:type="spellStart"/>
-      <w:r>
-        <w:t>Shimotsukasa</w:t>
-      </w:r>
-      <w:proofErr w:type="spellEnd"/>
-      <w:r>
-        <w:t xml:space="preserve">, T., &amp; Oshio, A. (2019). The relationship between the Dark Triad and interpersonal manipulation strategies. </w:t>
+      <w:r>
+        <w:t xml:space="preserve">Shimotsukasa, T., &amp; Oshio, A. (2019). The relationship between the Dark Triad and interpersonal manipulation strategies. </w:t>
       </w:r>
       <w:r>
         <w:rPr>
@@ -7068,13 +6233,8 @@
       <w:pPr>
         <w:ind w:left="720" w:hanging="720"/>
       </w:pPr>
-      <w:proofErr w:type="spellStart"/>
-      <w:r>
-        <w:t>Shimotsukasa</w:t>
-      </w:r>
-      <w:proofErr w:type="spellEnd"/>
-      <w:r>
-        <w:t xml:space="preserve">, T., &amp; Oshio, A. (2017). Development and validation of the Japanese version of the Short Dark Triad (SD3-J). </w:t>
+      <w:r>
+        <w:t xml:space="preserve">Shimotsukasa, T., &amp; Oshio, A. (2017). Development and validation of the Japanese version of the Short Dark Triad (SD3-J). </w:t>
       </w:r>
       <w:r>
         <w:rPr>
@@ -7273,15 +6433,7 @@
         <w:ind w:left="720" w:hanging="720"/>
       </w:pPr>
       <w:r>
-        <w:t xml:space="preserve">Thielmann, I., </w:t>
-      </w:r>
-      <w:proofErr w:type="spellStart"/>
-      <w:r>
-        <w:t>Moshagen</w:t>
-      </w:r>
-      <w:proofErr w:type="spellEnd"/>
-      <w:r>
-        <w:t>, M., Hilbig, B. E., &amp; Zettler, I. (2021). On the comparability of basic personality models: Meta-analytic investigations of the HEXACO and five-factor model</w:t>
+        <w:t>Thielmann, I., Moshagen, M., Hilbig, B. E., &amp; Zettler, I. (2021). On the comparability of basic personality models: Meta-analytic investigations of the HEXACO and five-factor model</w:t>
       </w:r>
       <w:r>
         <w:rPr>
@@ -7349,13 +6501,8 @@
       <w:pPr>
         <w:ind w:left="720" w:hanging="720"/>
       </w:pPr>
-      <w:proofErr w:type="spellStart"/>
-      <w:r>
-        <w:t>Thomaes</w:t>
-      </w:r>
-      <w:proofErr w:type="spellEnd"/>
-      <w:r>
-        <w:t xml:space="preserve">, S., Bushman, B. J., Orobio de Castro, B., Cohen, G. L., &amp; Denissen, J. J. (2009). Reducing narcissistic aggression by buttressing self-esteem: an experimental field study. </w:t>
+      <w:r>
+        <w:t xml:space="preserve">Thomaes, S., Bushman, B. J., Orobio de Castro, B., Cohen, G. L., &amp; Denissen, J. J. (2009). Reducing narcissistic aggression by buttressing self-esteem: an experimental field study. </w:t>
       </w:r>
       <w:r>
         <w:rPr>
@@ -7415,15 +6562,7 @@
         <w:ind w:left="720" w:hanging="720"/>
       </w:pPr>
       <w:r>
-        <w:t xml:space="preserve">Tou, K., Tsuda, A., Nii, M., </w:t>
-      </w:r>
-      <w:proofErr w:type="spellStart"/>
-      <w:r>
-        <w:t>Yamahiro</w:t>
-      </w:r>
-      <w:proofErr w:type="spellEnd"/>
-      <w:r>
-        <w:t xml:space="preserve">, T., &amp; Irie, M. (2017). Development of new power harassment questionnaire in workplace. </w:t>
+        <w:t xml:space="preserve">Tou, K., Tsuda, A., Nii, M., Yamahiro, T., &amp; Irie, M. (2017). Development of new power harassment questionnaire in workplace. </w:t>
       </w:r>
       <w:r>
         <w:rPr>
@@ -7464,29 +6603,15 @@
       <w:pPr>
         <w:ind w:left="720" w:hanging="720"/>
       </w:pPr>
-      <w:proofErr w:type="spellStart"/>
-      <w:r>
-        <w:t>Tsuno</w:t>
-      </w:r>
-      <w:proofErr w:type="spellEnd"/>
-      <w:r>
-        <w:t xml:space="preserve">, K., Kawakami, N., &amp; Tsutsumi, A., et al. (2015). Socioeconomic determinants of bullying in the workplace: A national representative sample in Japan. </w:t>
-      </w:r>
-      <w:proofErr w:type="spellStart"/>
-      <w:r>
-        <w:rPr>
-          <w:i/>
-          <w:iCs/>
-        </w:rPr>
-        <w:t>PLoS</w:t>
-      </w:r>
-      <w:proofErr w:type="spellEnd"/>
-      <w:r>
-        <w:rPr>
-          <w:i/>
-          <w:iCs/>
-        </w:rPr>
-        <w:t xml:space="preserve"> One, 10</w:t>
+      <w:r>
+        <w:t xml:space="preserve">Tsuno, K., Kawakami, N., &amp; Tsutsumi, A., et al. (2015). Socioeconomic determinants of bullying in the workplace: A national representative sample in Japan. </w:t>
+      </w:r>
+      <w:r>
+        <w:rPr>
+          <w:i/>
+          <w:iCs/>
+        </w:rPr>
+        <w:t>PLoS One, 10</w:t>
       </w:r>
       <w:r>
         <w:t>, e0119435. https://doi.org/10.1371/journal.pone.0119435</w:t>
@@ -7525,23 +6650,7 @@
         <w:ind w:left="720" w:hanging="720"/>
       </w:pPr>
       <w:r>
-        <w:t xml:space="preserve">Van Veen, M. M., </w:t>
-      </w:r>
-      <w:proofErr w:type="spellStart"/>
-      <w:r>
-        <w:t>Lancel</w:t>
-      </w:r>
-      <w:proofErr w:type="spellEnd"/>
-      <w:r>
-        <w:t xml:space="preserve">, M., Şener, O., </w:t>
-      </w:r>
-      <w:proofErr w:type="spellStart"/>
-      <w:r>
-        <w:t>Verkes</w:t>
-      </w:r>
-      <w:proofErr w:type="spellEnd"/>
-      <w:r>
-        <w:t xml:space="preserve">, R. J., Bouman, E. J., &amp; Rutters, F. (2022). Observational and experimental studies on sleep duration and aggression: A systematic review and meta-analysis. </w:t>
+        <w:t xml:space="preserve">Van Veen, M. M., Lancel, M., Şener, O., Verkes, R. J., Bouman, E. J., &amp; Rutters, F. (2022). Observational and experimental studies on sleep duration and aggression: A systematic review and meta-analysis. </w:t>
       </w:r>
       <w:r>
         <w:rPr>
@@ -7674,15 +6783,7 @@
         <w:ind w:left="720" w:hanging="720"/>
       </w:pPr>
       <w:r>
-        <w:t xml:space="preserve">Wright, T. A., &amp; </w:t>
-      </w:r>
-      <w:proofErr w:type="spellStart"/>
-      <w:r>
-        <w:t>Cropanzano</w:t>
-      </w:r>
-      <w:proofErr w:type="spellEnd"/>
-      <w:r>
-        <w:t xml:space="preserve">, R. (2000). Psychological well-being and job satisfaction as predictors of job performance. </w:t>
+        <w:t xml:space="preserve">Wright, T. A., &amp; Cropanzano, R. (2000). Psychological well-being and job satisfaction as predictors of job performance. </w:t>
       </w:r>
       <w:r>
         <w:rPr>
@@ -7743,15 +6844,7 @@
         <w:ind w:left="720" w:hanging="720"/>
       </w:pPr>
       <w:r>
-        <w:t xml:space="preserve">Zettler, I., Thielmann, I., Hilbig, B. E., &amp; </w:t>
-      </w:r>
-      <w:proofErr w:type="spellStart"/>
-      <w:r>
-        <w:t>Moshagen</w:t>
-      </w:r>
-      <w:proofErr w:type="spellEnd"/>
-      <w:r>
-        <w:t xml:space="preserve">, M. (2020). The nomological net of the HEXACO model of personality: A large-scale meta-analytic investigation. </w:t>
+        <w:t xml:space="preserve">Zettler, I., Thielmann, I., Hilbig, B. E., &amp; Moshagen, M. (2020). The nomological net of the HEXACO model of personality: A large-scale meta-analytic investigation. </w:t>
       </w:r>
       <w:r>
         <w:rPr>
@@ -7770,6 +6863,9 @@
     <w:p>
       <w:pPr>
         <w:ind w:left="720" w:hanging="720"/>
+        <w:rPr>
+          <w:rFonts w:hint="eastAsia"/>
+        </w:rPr>
       </w:pPr>
       <w:r>
         <w:t xml:space="preserve">Zimmerman, R. D. (2008). Understanding the impact of personality traits on individuals’ turnover decisions: A meta-analytic path model. </w:t>
@@ -7790,23 +6886,10 @@
     </w:p>
     <w:p>
       <w:pPr>
-        <w:widowControl/>
-        <w:spacing w:line="276" w:lineRule="auto"/>
-        <w:jc w:val="left"/>
-        <w:rPr>
-          <w:rFonts w:asciiTheme="majorBidi" w:eastAsiaTheme="minorEastAsia" w:hAnsiTheme="majorBidi" w:cstheme="majorBidi"/>
-          <w:b/>
-          <w:bCs/>
-          <w:lang w:val="en-US"/>
-        </w:rPr>
-      </w:pPr>
-    </w:p>
-    <w:p>
-      <w:pPr>
-        <w:ind w:left="720" w:hanging="720"/>
-      </w:pPr>
-      <w:r>
-        <w:t xml:space="preserve">Zuckerman, M. (1994). Behavioral expressions and biosocial bases of sensation seeking. Cambridge University Press.</w:t>
+        <w:ind w:left="720" w:hanging="720"/>
+      </w:pPr>
+      <w:r>
+        <w:t>Zuckerman, M. (1994). Behavioral expressions and biosocial bases of sensation seeking. Cambridge University Press.</w:t>
       </w:r>
     </w:p>
     <w:sectPr>

</xml_diff>